<commit_message>
docx-pipeline 切换 Calibri/Carlito 字体链路
</commit_message>
<xml_diff>
--- a/research/yjs-manual-opt/swiss/tools/docx-pipeline/master_template.docx
+++ b/research/yjs-manual-opt/swiss/tools/docx-pipeline/master_template.docx
@@ -8,7 +8,7 @@
       </w:pPr>
       <w:r>
         <w:rPr>
-          <w:rFonts w:ascii="Arial Black" w:hAnsi="Arial Black" w:cs="Arial Black" w:eastAsia="Microsoft YaHei"/>
+          <w:rFonts w:ascii="Calibri" w:hAnsi="Calibri" w:cs="Calibri" w:eastAsia="Microsoft YaHei"/>
           <w:b/>
           <w:sz w:val="15"/>
           <w:color w:val="E63846"/>
@@ -18,7 +18,7 @@
       </w:r>
       <w:r>
         <w:rPr>
-          <w:rFonts w:ascii="Arial Black" w:hAnsi="Arial Black" w:cs="Arial Black" w:eastAsia="Microsoft YaHei"/>
+          <w:rFonts w:ascii="Calibri" w:hAnsi="Calibri" w:cs="Calibri" w:eastAsia="Microsoft YaHei"/>
           <w:b/>
           <w:sz w:val="15"/>
           <w:color w:val="000000"/>
@@ -87,7 +87,7 @@
       </w:pPr>
       <w:r>
         <w:rPr>
-          <w:rFonts w:ascii="Arial Black" w:hAnsi="Arial Black" w:cs="Arial Black" w:eastAsia="Microsoft YaHei"/>
+          <w:rFonts w:ascii="Calibri" w:hAnsi="Calibri" w:cs="Calibri" w:eastAsia="Microsoft YaHei"/>
           <w:b/>
           <w:sz w:val="36"/>
           <w:color w:val="1A1A1A"/>
@@ -102,7 +102,7 @@
       </w:pPr>
       <w:r>
         <w:rPr>
-          <w:rFonts w:ascii="Arial" w:hAnsi="Arial" w:cs="Arial" w:eastAsia="Microsoft YaHei"/>
+          <w:rFonts w:ascii="Calibri" w:hAnsi="Calibri" w:cs="Calibri" w:eastAsia="Microsoft YaHei"/>
           <w:b w:val="0"/>
           <w:sz w:val="15"/>
           <w:color w:val="F5F5F5"/>
@@ -117,7 +117,7 @@
       </w:pPr>
       <w:r>
         <w:rPr>
-          <w:rFonts w:ascii="Arial Black" w:hAnsi="Arial Black" w:cs="Arial Black" w:eastAsia="Microsoft YaHei"/>
+          <w:rFonts w:ascii="Calibri" w:hAnsi="Calibri" w:cs="Calibri" w:eastAsia="Microsoft YaHei"/>
           <w:b/>
           <w:sz w:val="14"/>
           <w:color w:val="E63846"/>
@@ -140,7 +140,7 @@
       </w:pPr>
       <w:r>
         <w:rPr>
-          <w:rFonts w:ascii="Arial" w:hAnsi="Arial" w:cs="Arial" w:eastAsia="Microsoft YaHei"/>
+          <w:rFonts w:ascii="Calibri" w:hAnsi="Calibri" w:cs="Calibri" w:eastAsia="Microsoft YaHei"/>
           <w:b w:val="0"/>
           <w:sz w:val="10"/>
           <w:color w:val="F5F5F5"/>
@@ -155,7 +155,7 @@
       </w:pPr>
       <w:r>
         <w:rPr>
-          <w:rFonts w:ascii="Arial" w:hAnsi="Arial" w:cs="Arial" w:eastAsia="Microsoft YaHei"/>
+          <w:rFonts w:ascii="Calibri" w:hAnsi="Calibri" w:cs="Calibri" w:eastAsia="Microsoft YaHei"/>
           <w:b w:val="0"/>
           <w:sz w:val="10"/>
           <w:color w:val="F5F5F5"/>
@@ -187,7 +187,7 @@
       </w:pPr>
       <w:r>
         <w:rPr>
-          <w:rFonts w:ascii="Arial Black" w:hAnsi="Arial Black" w:cs="Arial Black" w:eastAsia="Microsoft YaHei"/>
+          <w:rFonts w:ascii="Calibri" w:hAnsi="Calibri" w:cs="Calibri" w:eastAsia="Microsoft YaHei"/>
           <w:b/>
           <w:sz w:val="13"/>
           <w:color w:val="000000"/>
@@ -213,7 +213,7 @@
       </w:pPr>
       <w:r>
         <w:rPr>
-          <w:rFonts w:ascii="Arial Black" w:hAnsi="Arial Black" w:cs="Arial Black" w:eastAsia="Microsoft YaHei"/>
+          <w:rFonts w:ascii="Calibri" w:hAnsi="Calibri" w:cs="Calibri" w:eastAsia="Microsoft YaHei"/>
           <w:b/>
           <w:sz w:val="30"/>
           <w:color w:val="000000"/>
@@ -240,7 +240,7 @@
       </w:r>
       <w:r>
         <w:rPr>
-          <w:rFonts w:ascii="Arial Black" w:hAnsi="Arial Black" w:cs="Arial Black" w:eastAsia="Microsoft YaHei"/>
+          <w:rFonts w:ascii="Calibri" w:hAnsi="Calibri" w:cs="Calibri" w:eastAsia="Microsoft YaHei"/>
           <w:b/>
           <w:sz w:val="15"/>
           <w:color w:val="000000"/>
@@ -277,7 +277,7 @@
       </w:r>
       <w:r>
         <w:rPr>
-          <w:rFonts w:ascii="Arial Black" w:hAnsi="Arial Black" w:cs="Arial Black" w:eastAsia="Microsoft YaHei"/>
+          <w:rFonts w:ascii="Calibri" w:hAnsi="Calibri" w:cs="Calibri" w:eastAsia="Microsoft YaHei"/>
           <w:b/>
           <w:sz w:val="15"/>
           <w:color w:val="000000"/>
@@ -314,7 +314,7 @@
       </w:r>
       <w:r>
         <w:rPr>
-          <w:rFonts w:ascii="Arial Black" w:hAnsi="Arial Black" w:cs="Arial Black" w:eastAsia="Microsoft YaHei"/>
+          <w:rFonts w:ascii="Calibri" w:hAnsi="Calibri" w:cs="Calibri" w:eastAsia="Microsoft YaHei"/>
           <w:b/>
           <w:sz w:val="15"/>
           <w:color w:val="000000"/>
@@ -351,7 +351,7 @@
       </w:r>
       <w:r>
         <w:rPr>
-          <w:rFonts w:ascii="Arial Black" w:hAnsi="Arial Black" w:cs="Arial Black" w:eastAsia="Microsoft YaHei"/>
+          <w:rFonts w:ascii="Calibri" w:hAnsi="Calibri" w:cs="Calibri" w:eastAsia="Microsoft YaHei"/>
           <w:b/>
           <w:sz w:val="15"/>
           <w:color w:val="000000"/>
@@ -388,7 +388,7 @@
       </w:r>
       <w:r>
         <w:rPr>
-          <w:rFonts w:ascii="Arial Black" w:hAnsi="Arial Black" w:cs="Arial Black" w:eastAsia="Microsoft YaHei"/>
+          <w:rFonts w:ascii="Calibri" w:hAnsi="Calibri" w:cs="Calibri" w:eastAsia="Microsoft YaHei"/>
           <w:b/>
           <w:sz w:val="15"/>
           <w:color w:val="000000"/>
@@ -425,7 +425,7 @@
       </w:r>
       <w:r>
         <w:rPr>
-          <w:rFonts w:ascii="Arial Black" w:hAnsi="Arial Black" w:cs="Arial Black" w:eastAsia="Microsoft YaHei"/>
+          <w:rFonts w:ascii="Calibri" w:hAnsi="Calibri" w:cs="Calibri" w:eastAsia="Microsoft YaHei"/>
           <w:b/>
           <w:sz w:val="15"/>
           <w:color w:val="000000"/>
@@ -462,7 +462,7 @@
       </w:r>
       <w:r>
         <w:rPr>
-          <w:rFonts w:ascii="Arial Black" w:hAnsi="Arial Black" w:cs="Arial Black" w:eastAsia="Microsoft YaHei"/>
+          <w:rFonts w:ascii="Calibri" w:hAnsi="Calibri" w:cs="Calibri" w:eastAsia="Microsoft YaHei"/>
           <w:b/>
           <w:sz w:val="15"/>
           <w:color w:val="000000"/>
@@ -499,7 +499,7 @@
       </w:r>
       <w:r>
         <w:rPr>
-          <w:rFonts w:ascii="Arial Black" w:hAnsi="Arial Black" w:cs="Arial Black" w:eastAsia="Microsoft YaHei"/>
+          <w:rFonts w:ascii="Calibri" w:hAnsi="Calibri" w:cs="Calibri" w:eastAsia="Microsoft YaHei"/>
           <w:b/>
           <w:sz w:val="15"/>
           <w:color w:val="000000"/>
@@ -536,7 +536,7 @@
       </w:r>
       <w:r>
         <w:rPr>
-          <w:rFonts w:ascii="Arial Black" w:hAnsi="Arial Black" w:cs="Arial Black" w:eastAsia="Microsoft YaHei"/>
+          <w:rFonts w:ascii="Calibri" w:hAnsi="Calibri" w:cs="Calibri" w:eastAsia="Microsoft YaHei"/>
           <w:b/>
           <w:sz w:val="15"/>
           <w:color w:val="000000"/>
@@ -573,7 +573,7 @@
       </w:r>
       <w:r>
         <w:rPr>
-          <w:rFonts w:ascii="Arial Black" w:hAnsi="Arial Black" w:cs="Arial Black" w:eastAsia="Microsoft YaHei"/>
+          <w:rFonts w:ascii="Calibri" w:hAnsi="Calibri" w:cs="Calibri" w:eastAsia="Microsoft YaHei"/>
           <w:b/>
           <w:sz w:val="15"/>
           <w:color w:val="000000"/>
@@ -615,7 +615,7 @@
       </w:pPr>
       <w:r>
         <w:rPr>
-          <w:rFonts w:ascii="Arial Black" w:hAnsi="Arial Black" w:cs="Arial Black" w:eastAsia="Microsoft YaHei"/>
+          <w:rFonts w:ascii="Calibri" w:hAnsi="Calibri" w:cs="Calibri" w:eastAsia="Microsoft YaHei"/>
           <w:b/>
           <w:sz w:val="13"/>
           <w:color w:val="000000"/>
@@ -644,7 +644,7 @@
       </w:pPr>
       <w:r>
         <w:rPr>
-          <w:rFonts w:ascii="Arial Black" w:hAnsi="Arial Black" w:cs="Arial Black" w:eastAsia="Microsoft YaHei"/>
+          <w:rFonts w:ascii="Calibri" w:hAnsi="Calibri" w:cs="Calibri" w:eastAsia="Microsoft YaHei"/>
           <w:b/>
           <w:sz w:val="27"/>
           <w:color w:val="E63846"/>
@@ -654,7 +654,7 @@
       </w:r>
       <w:r>
         <w:rPr>
-          <w:rFonts w:ascii="Arial Black" w:hAnsi="Arial Black" w:cs="Arial Black" w:eastAsia="Microsoft YaHei"/>
+          <w:rFonts w:ascii="Calibri" w:hAnsi="Calibri" w:cs="Calibri" w:eastAsia="Microsoft YaHei"/>
           <w:b/>
           <w:sz w:val="22"/>
           <w:color w:val="000000"/>
@@ -669,7 +669,7 @@
       </w:pPr>
       <w:r>
         <w:rPr>
-          <w:rFonts w:ascii="Arial" w:hAnsi="Arial" w:cs="Arial" w:eastAsia="Microsoft YaHei"/>
+          <w:rFonts w:ascii="Calibri" w:hAnsi="Calibri" w:cs="Calibri" w:eastAsia="Microsoft YaHei"/>
           <w:b w:val="0"/>
           <w:sz w:val="14"/>
           <w:color w:val="1A1A1A"/>
@@ -720,7 +720,7 @@
             </w:pPr>
             <w:r>
               <w:rPr>
-                <w:rFonts w:ascii="Arial Black" w:hAnsi="Arial Black" w:cs="Arial Black" w:eastAsia="Microsoft YaHei"/>
+                <w:rFonts w:ascii="Calibri" w:hAnsi="Calibri" w:cs="Calibri" w:eastAsia="Microsoft YaHei"/>
                 <w:b/>
                 <w:sz w:val="12"/>
                 <w:color w:val="E63846"/>
@@ -774,11 +774,11 @@
           <w:p>
             <w:pPr>
               <w:spacing w:before="0" w:after="27" w:line="228" w:lineRule="auto"/>
-              <w:ind w:left="266" w:hanging="266"/>
+              <w:ind w:left="360" w:hanging="360"/>
             </w:pPr>
             <w:r>
               <w:rPr>
-                <w:rFonts w:ascii="Arial Black" w:hAnsi="Arial Black" w:cs="Arial Black" w:eastAsia="Microsoft YaHei"/>
+                <w:rFonts w:ascii="Calibri" w:hAnsi="Calibri" w:cs="Calibri" w:eastAsia="Microsoft YaHei"/>
                 <w:b/>
                 <w:sz w:val="10"/>
                 <w:color w:val="E63846"/>
@@ -788,7 +788,7 @@
             </w:r>
             <w:r>
               <w:rPr>
-                <w:rFonts w:ascii="Arial" w:hAnsi="Arial" w:cs="Arial" w:eastAsia="Microsoft YaHei"/>
+                <w:rFonts w:ascii="Calibri" w:hAnsi="Calibri" w:cs="Calibri" w:eastAsia="Microsoft YaHei"/>
                 <w:b w:val="0"/>
                 <w:sz w:val="13"/>
                 <w:color w:val="000000"/>
@@ -800,11 +800,11 @@
           <w:p>
             <w:pPr>
               <w:spacing w:before="0" w:after="27" w:line="228" w:lineRule="auto"/>
-              <w:ind w:left="266" w:hanging="266"/>
+              <w:ind w:left="360" w:hanging="360"/>
             </w:pPr>
             <w:r>
               <w:rPr>
-                <w:rFonts w:ascii="Arial Black" w:hAnsi="Arial Black" w:cs="Arial Black" w:eastAsia="Microsoft YaHei"/>
+                <w:rFonts w:ascii="Calibri" w:hAnsi="Calibri" w:cs="Calibri" w:eastAsia="Microsoft YaHei"/>
                 <w:b/>
                 <w:sz w:val="10"/>
                 <w:color w:val="E63846"/>
@@ -814,7 +814,7 @@
             </w:r>
             <w:r>
               <w:rPr>
-                <w:rFonts w:ascii="Arial" w:hAnsi="Arial" w:cs="Arial" w:eastAsia="Microsoft YaHei"/>
+                <w:rFonts w:ascii="Calibri" w:hAnsi="Calibri" w:cs="Calibri" w:eastAsia="Microsoft YaHei"/>
                 <w:b w:val="0"/>
                 <w:sz w:val="13"/>
                 <w:color w:val="000000"/>
@@ -826,11 +826,11 @@
           <w:p>
             <w:pPr>
               <w:spacing w:before="0" w:after="27" w:line="228" w:lineRule="auto"/>
-              <w:ind w:left="266" w:hanging="266"/>
+              <w:ind w:left="360" w:hanging="360"/>
             </w:pPr>
             <w:r>
               <w:rPr>
-                <w:rFonts w:ascii="Arial Black" w:hAnsi="Arial Black" w:cs="Arial Black" w:eastAsia="Microsoft YaHei"/>
+                <w:rFonts w:ascii="Calibri" w:hAnsi="Calibri" w:cs="Calibri" w:eastAsia="Microsoft YaHei"/>
                 <w:b/>
                 <w:sz w:val="10"/>
                 <w:color w:val="E63846"/>
@@ -840,7 +840,7 @@
             </w:r>
             <w:r>
               <w:rPr>
-                <w:rFonts w:ascii="Arial" w:hAnsi="Arial" w:cs="Arial" w:eastAsia="Microsoft YaHei"/>
+                <w:rFonts w:ascii="Calibri" w:hAnsi="Calibri" w:cs="Calibri" w:eastAsia="Microsoft YaHei"/>
                 <w:b w:val="0"/>
                 <w:sz w:val="13"/>
                 <w:color w:val="000000"/>
@@ -852,11 +852,11 @@
           <w:p>
             <w:pPr>
               <w:spacing w:before="0" w:after="27" w:line="228" w:lineRule="auto"/>
-              <w:ind w:left="266" w:hanging="266"/>
+              <w:ind w:left="360" w:hanging="360"/>
             </w:pPr>
             <w:r>
               <w:rPr>
-                <w:rFonts w:ascii="Arial Black" w:hAnsi="Arial Black" w:cs="Arial Black" w:eastAsia="Microsoft YaHei"/>
+                <w:rFonts w:ascii="Calibri" w:hAnsi="Calibri" w:cs="Calibri" w:eastAsia="Microsoft YaHei"/>
                 <w:b/>
                 <w:sz w:val="10"/>
                 <w:color w:val="E63846"/>
@@ -866,7 +866,7 @@
             </w:r>
             <w:r>
               <w:rPr>
-                <w:rFonts w:ascii="Arial" w:hAnsi="Arial" w:cs="Arial" w:eastAsia="Microsoft YaHei"/>
+                <w:rFonts w:ascii="Calibri" w:hAnsi="Calibri" w:cs="Calibri" w:eastAsia="Microsoft YaHei"/>
                 <w:b w:val="0"/>
                 <w:sz w:val="13"/>
                 <w:color w:val="000000"/>
@@ -878,11 +878,11 @@
           <w:p>
             <w:pPr>
               <w:spacing w:before="0" w:after="27" w:line="228" w:lineRule="auto"/>
-              <w:ind w:left="266" w:hanging="266"/>
+              <w:ind w:left="360" w:hanging="360"/>
             </w:pPr>
             <w:r>
               <w:rPr>
-                <w:rFonts w:ascii="Arial Black" w:hAnsi="Arial Black" w:cs="Arial Black" w:eastAsia="Microsoft YaHei"/>
+                <w:rFonts w:ascii="Calibri" w:hAnsi="Calibri" w:cs="Calibri" w:eastAsia="Microsoft YaHei"/>
                 <w:b/>
                 <w:sz w:val="10"/>
                 <w:color w:val="E63846"/>
@@ -892,7 +892,7 @@
             </w:r>
             <w:r>
               <w:rPr>
-                <w:rFonts w:ascii="Arial" w:hAnsi="Arial" w:cs="Arial" w:eastAsia="Microsoft YaHei"/>
+                <w:rFonts w:ascii="Calibri" w:hAnsi="Calibri" w:cs="Calibri" w:eastAsia="Microsoft YaHei"/>
                 <w:b w:val="0"/>
                 <w:sz w:val="13"/>
                 <w:color w:val="000000"/>
@@ -904,11 +904,11 @@
           <w:p>
             <w:pPr>
               <w:spacing w:before="0" w:after="27" w:line="228" w:lineRule="auto"/>
-              <w:ind w:left="266" w:hanging="266"/>
+              <w:ind w:left="360" w:hanging="360"/>
             </w:pPr>
             <w:r>
               <w:rPr>
-                <w:rFonts w:ascii="Arial Black" w:hAnsi="Arial Black" w:cs="Arial Black" w:eastAsia="Microsoft YaHei"/>
+                <w:rFonts w:ascii="Calibri" w:hAnsi="Calibri" w:cs="Calibri" w:eastAsia="Microsoft YaHei"/>
                 <w:b/>
                 <w:sz w:val="10"/>
                 <w:color w:val="E63846"/>
@@ -918,7 +918,7 @@
             </w:r>
             <w:r>
               <w:rPr>
-                <w:rFonts w:ascii="Arial" w:hAnsi="Arial" w:cs="Arial" w:eastAsia="Microsoft YaHei"/>
+                <w:rFonts w:ascii="Calibri" w:hAnsi="Calibri" w:cs="Calibri" w:eastAsia="Microsoft YaHei"/>
                 <w:b w:val="0"/>
                 <w:sz w:val="13"/>
                 <w:color w:val="000000"/>
@@ -930,11 +930,11 @@
           <w:p>
             <w:pPr>
               <w:spacing w:before="0" w:after="27" w:line="228" w:lineRule="auto"/>
-              <w:ind w:left="266" w:hanging="266"/>
+              <w:ind w:left="360" w:hanging="360"/>
             </w:pPr>
             <w:r>
               <w:rPr>
-                <w:rFonts w:ascii="Arial Black" w:hAnsi="Arial Black" w:cs="Arial Black" w:eastAsia="Microsoft YaHei"/>
+                <w:rFonts w:ascii="Calibri" w:hAnsi="Calibri" w:cs="Calibri" w:eastAsia="Microsoft YaHei"/>
                 <w:b/>
                 <w:sz w:val="10"/>
                 <w:color w:val="E63846"/>
@@ -944,7 +944,7 @@
             </w:r>
             <w:r>
               <w:rPr>
-                <w:rFonts w:ascii="Arial" w:hAnsi="Arial" w:cs="Arial" w:eastAsia="Microsoft YaHei"/>
+                <w:rFonts w:ascii="Calibri" w:hAnsi="Calibri" w:cs="Calibri" w:eastAsia="Microsoft YaHei"/>
                 <w:b w:val="0"/>
                 <w:sz w:val="13"/>
                 <w:color w:val="000000"/>
@@ -956,11 +956,11 @@
           <w:p>
             <w:pPr>
               <w:spacing w:before="0" w:after="27" w:line="228" w:lineRule="auto"/>
-              <w:ind w:left="266" w:hanging="266"/>
+              <w:ind w:left="360" w:hanging="360"/>
             </w:pPr>
             <w:r>
               <w:rPr>
-                <w:rFonts w:ascii="Arial Black" w:hAnsi="Arial Black" w:cs="Arial Black" w:eastAsia="Microsoft YaHei"/>
+                <w:rFonts w:ascii="Calibri" w:hAnsi="Calibri" w:cs="Calibri" w:eastAsia="Microsoft YaHei"/>
                 <w:b/>
                 <w:sz w:val="10"/>
                 <w:color w:val="E63846"/>
@@ -970,7 +970,7 @@
             </w:r>
             <w:r>
               <w:rPr>
-                <w:rFonts w:ascii="Arial" w:hAnsi="Arial" w:cs="Arial" w:eastAsia="Microsoft YaHei"/>
+                <w:rFonts w:ascii="Calibri" w:hAnsi="Calibri" w:cs="Calibri" w:eastAsia="Microsoft YaHei"/>
                 <w:b w:val="0"/>
                 <w:sz w:val="13"/>
                 <w:color w:val="000000"/>
@@ -982,11 +982,11 @@
           <w:p>
             <w:pPr>
               <w:spacing w:before="0" w:after="27" w:line="228" w:lineRule="auto"/>
-              <w:ind w:left="266" w:hanging="266"/>
+              <w:ind w:left="360" w:hanging="360"/>
             </w:pPr>
             <w:r>
               <w:rPr>
-                <w:rFonts w:ascii="Arial Black" w:hAnsi="Arial Black" w:cs="Arial Black" w:eastAsia="Microsoft YaHei"/>
+                <w:rFonts w:ascii="Calibri" w:hAnsi="Calibri" w:cs="Calibri" w:eastAsia="Microsoft YaHei"/>
                 <w:b/>
                 <w:sz w:val="10"/>
                 <w:color w:val="E63846"/>
@@ -996,7 +996,7 @@
             </w:r>
             <w:r>
               <w:rPr>
-                <w:rFonts w:ascii="Arial" w:hAnsi="Arial" w:cs="Arial" w:eastAsia="Microsoft YaHei"/>
+                <w:rFonts w:ascii="Calibri" w:hAnsi="Calibri" w:cs="Calibri" w:eastAsia="Microsoft YaHei"/>
                 <w:b w:val="0"/>
                 <w:sz w:val="13"/>
                 <w:color w:val="000000"/>
@@ -1008,11 +1008,11 @@
           <w:p>
             <w:pPr>
               <w:spacing w:before="0" w:after="27" w:line="228" w:lineRule="auto"/>
-              <w:ind w:left="266" w:hanging="266"/>
+              <w:ind w:left="360" w:hanging="360"/>
             </w:pPr>
             <w:r>
               <w:rPr>
-                <w:rFonts w:ascii="Arial Black" w:hAnsi="Arial Black" w:cs="Arial Black" w:eastAsia="Microsoft YaHei"/>
+                <w:rFonts w:ascii="Calibri" w:hAnsi="Calibri" w:cs="Calibri" w:eastAsia="Microsoft YaHei"/>
                 <w:b/>
                 <w:sz w:val="10"/>
                 <w:color w:val="E63846"/>
@@ -1022,7 +1022,7 @@
             </w:r>
             <w:r>
               <w:rPr>
-                <w:rFonts w:ascii="Arial" w:hAnsi="Arial" w:cs="Arial" w:eastAsia="Microsoft YaHei"/>
+                <w:rFonts w:ascii="Calibri" w:hAnsi="Calibri" w:cs="Calibri" w:eastAsia="Microsoft YaHei"/>
                 <w:b w:val="0"/>
                 <w:sz w:val="13"/>
                 <w:color w:val="000000"/>
@@ -1034,11 +1034,11 @@
           <w:p>
             <w:pPr>
               <w:spacing w:before="0" w:after="27" w:line="228" w:lineRule="auto"/>
-              <w:ind w:left="266" w:hanging="266"/>
+              <w:ind w:left="360" w:hanging="360"/>
             </w:pPr>
             <w:r>
               <w:rPr>
-                <w:rFonts w:ascii="Arial Black" w:hAnsi="Arial Black" w:cs="Arial Black" w:eastAsia="Microsoft YaHei"/>
+                <w:rFonts w:ascii="Calibri" w:hAnsi="Calibri" w:cs="Calibri" w:eastAsia="Microsoft YaHei"/>
                 <w:b/>
                 <w:sz w:val="10"/>
                 <w:color w:val="E63846"/>
@@ -1048,7 +1048,7 @@
             </w:r>
             <w:r>
               <w:rPr>
-                <w:rFonts w:ascii="Arial" w:hAnsi="Arial" w:cs="Arial" w:eastAsia="Microsoft YaHei"/>
+                <w:rFonts w:ascii="Calibri" w:hAnsi="Calibri" w:cs="Calibri" w:eastAsia="Microsoft YaHei"/>
                 <w:b w:val="0"/>
                 <w:sz w:val="13"/>
                 <w:color w:val="000000"/>
@@ -1060,11 +1060,11 @@
           <w:p>
             <w:pPr>
               <w:spacing w:before="0" w:after="27" w:line="228" w:lineRule="auto"/>
-              <w:ind w:left="266" w:hanging="266"/>
+              <w:ind w:left="360" w:hanging="360"/>
             </w:pPr>
             <w:r>
               <w:rPr>
-                <w:rFonts w:ascii="Arial Black" w:hAnsi="Arial Black" w:cs="Arial Black" w:eastAsia="Microsoft YaHei"/>
+                <w:rFonts w:ascii="Calibri" w:hAnsi="Calibri" w:cs="Calibri" w:eastAsia="Microsoft YaHei"/>
                 <w:b/>
                 <w:sz w:val="10"/>
                 <w:color w:val="E63846"/>
@@ -1074,7 +1074,7 @@
             </w:r>
             <w:r>
               <w:rPr>
-                <w:rFonts w:ascii="Arial" w:hAnsi="Arial" w:cs="Arial" w:eastAsia="Microsoft YaHei"/>
+                <w:rFonts w:ascii="Calibri" w:hAnsi="Calibri" w:cs="Calibri" w:eastAsia="Microsoft YaHei"/>
                 <w:b w:val="0"/>
                 <w:sz w:val="13"/>
                 <w:color w:val="000000"/>
@@ -1086,11 +1086,11 @@
           <w:p>
             <w:pPr>
               <w:spacing w:before="0" w:after="27" w:line="228" w:lineRule="auto"/>
-              <w:ind w:left="266" w:hanging="266"/>
+              <w:ind w:left="360" w:hanging="360"/>
             </w:pPr>
             <w:r>
               <w:rPr>
-                <w:rFonts w:ascii="Arial Black" w:hAnsi="Arial Black" w:cs="Arial Black" w:eastAsia="Microsoft YaHei"/>
+                <w:rFonts w:ascii="Calibri" w:hAnsi="Calibri" w:cs="Calibri" w:eastAsia="Microsoft YaHei"/>
                 <w:b/>
                 <w:sz w:val="10"/>
                 <w:color w:val="E63846"/>
@@ -1100,7 +1100,7 @@
             </w:r>
             <w:r>
               <w:rPr>
-                <w:rFonts w:ascii="Arial" w:hAnsi="Arial" w:cs="Arial" w:eastAsia="Microsoft YaHei"/>
+                <w:rFonts w:ascii="Calibri" w:hAnsi="Calibri" w:cs="Calibri" w:eastAsia="Microsoft YaHei"/>
                 <w:b w:val="0"/>
                 <w:sz w:val="13"/>
                 <w:color w:val="000000"/>
@@ -1112,11 +1112,11 @@
           <w:p>
             <w:pPr>
               <w:spacing w:before="0" w:after="27" w:line="228" w:lineRule="auto"/>
-              <w:ind w:left="266" w:hanging="266"/>
+              <w:ind w:left="360" w:hanging="360"/>
             </w:pPr>
             <w:r>
               <w:rPr>
-                <w:rFonts w:ascii="Arial Black" w:hAnsi="Arial Black" w:cs="Arial Black" w:eastAsia="Microsoft YaHei"/>
+                <w:rFonts w:ascii="Calibri" w:hAnsi="Calibri" w:cs="Calibri" w:eastAsia="Microsoft YaHei"/>
                 <w:b/>
                 <w:sz w:val="10"/>
                 <w:color w:val="E63846"/>
@@ -1126,7 +1126,7 @@
             </w:r>
             <w:r>
               <w:rPr>
-                <w:rFonts w:ascii="Arial" w:hAnsi="Arial" w:cs="Arial" w:eastAsia="Microsoft YaHei"/>
+                <w:rFonts w:ascii="Calibri" w:hAnsi="Calibri" w:cs="Calibri" w:eastAsia="Microsoft YaHei"/>
                 <w:b w:val="0"/>
                 <w:sz w:val="13"/>
                 <w:color w:val="000000"/>
@@ -1138,11 +1138,11 @@
           <w:p>
             <w:pPr>
               <w:spacing w:before="0" w:after="27" w:line="228" w:lineRule="auto"/>
-              <w:ind w:left="266" w:hanging="266"/>
+              <w:ind w:left="360" w:hanging="360"/>
             </w:pPr>
             <w:r>
               <w:rPr>
-                <w:rFonts w:ascii="Arial Black" w:hAnsi="Arial Black" w:cs="Arial Black" w:eastAsia="Microsoft YaHei"/>
+                <w:rFonts w:ascii="Calibri" w:hAnsi="Calibri" w:cs="Calibri" w:eastAsia="Microsoft YaHei"/>
                 <w:b/>
                 <w:sz w:val="10"/>
                 <w:color w:val="E63846"/>
@@ -1152,7 +1152,7 @@
             </w:r>
             <w:r>
               <w:rPr>
-                <w:rFonts w:ascii="Arial" w:hAnsi="Arial" w:cs="Arial" w:eastAsia="Microsoft YaHei"/>
+                <w:rFonts w:ascii="Calibri" w:hAnsi="Calibri" w:cs="Calibri" w:eastAsia="Microsoft YaHei"/>
                 <w:b w:val="0"/>
                 <w:sz w:val="13"/>
                 <w:color w:val="000000"/>
@@ -1164,11 +1164,11 @@
           <w:p>
             <w:pPr>
               <w:spacing w:before="0" w:after="27" w:line="228" w:lineRule="auto"/>
-              <w:ind w:left="266" w:hanging="266"/>
+              <w:ind w:left="360" w:hanging="360"/>
             </w:pPr>
             <w:r>
               <w:rPr>
-                <w:rFonts w:ascii="Arial Black" w:hAnsi="Arial Black" w:cs="Arial Black" w:eastAsia="Microsoft YaHei"/>
+                <w:rFonts w:ascii="Calibri" w:hAnsi="Calibri" w:cs="Calibri" w:eastAsia="Microsoft YaHei"/>
                 <w:b/>
                 <w:sz w:val="10"/>
                 <w:color w:val="E63846"/>
@@ -1178,7 +1178,7 @@
             </w:r>
             <w:r>
               <w:rPr>
-                <w:rFonts w:ascii="Arial" w:hAnsi="Arial" w:cs="Arial" w:eastAsia="Microsoft YaHei"/>
+                <w:rFonts w:ascii="Calibri" w:hAnsi="Calibri" w:cs="Calibri" w:eastAsia="Microsoft YaHei"/>
                 <w:b w:val="0"/>
                 <w:sz w:val="13"/>
                 <w:color w:val="000000"/>
@@ -1190,11 +1190,11 @@
           <w:p>
             <w:pPr>
               <w:spacing w:before="0" w:after="27" w:line="228" w:lineRule="auto"/>
-              <w:ind w:left="266" w:hanging="266"/>
+              <w:ind w:left="360" w:hanging="360"/>
             </w:pPr>
             <w:r>
               <w:rPr>
-                <w:rFonts w:ascii="Arial Black" w:hAnsi="Arial Black" w:cs="Arial Black" w:eastAsia="Microsoft YaHei"/>
+                <w:rFonts w:ascii="Calibri" w:hAnsi="Calibri" w:cs="Calibri" w:eastAsia="Microsoft YaHei"/>
                 <w:b/>
                 <w:sz w:val="10"/>
                 <w:color w:val="E63846"/>
@@ -1204,7 +1204,7 @@
             </w:r>
             <w:r>
               <w:rPr>
-                <w:rFonts w:ascii="Arial" w:hAnsi="Arial" w:cs="Arial" w:eastAsia="Microsoft YaHei"/>
+                <w:rFonts w:ascii="Calibri" w:hAnsi="Calibri" w:cs="Calibri" w:eastAsia="Microsoft YaHei"/>
                 <w:b w:val="0"/>
                 <w:sz w:val="13"/>
                 <w:color w:val="000000"/>
@@ -1216,11 +1216,11 @@
           <w:p>
             <w:pPr>
               <w:spacing w:before="0" w:after="27" w:line="228" w:lineRule="auto"/>
-              <w:ind w:left="266" w:hanging="266"/>
+              <w:ind w:left="360" w:hanging="360"/>
             </w:pPr>
             <w:r>
               <w:rPr>
-                <w:rFonts w:ascii="Arial Black" w:hAnsi="Arial Black" w:cs="Arial Black" w:eastAsia="Microsoft YaHei"/>
+                <w:rFonts w:ascii="Calibri" w:hAnsi="Calibri" w:cs="Calibri" w:eastAsia="Microsoft YaHei"/>
                 <w:b/>
                 <w:sz w:val="10"/>
                 <w:color w:val="E63846"/>
@@ -1230,7 +1230,7 @@
             </w:r>
             <w:r>
               <w:rPr>
-                <w:rFonts w:ascii="Arial" w:hAnsi="Arial" w:cs="Arial" w:eastAsia="Microsoft YaHei"/>
+                <w:rFonts w:ascii="Calibri" w:hAnsi="Calibri" w:cs="Calibri" w:eastAsia="Microsoft YaHei"/>
                 <w:b w:val="0"/>
                 <w:sz w:val="13"/>
                 <w:color w:val="000000"/>
@@ -1242,11 +1242,11 @@
           <w:p>
             <w:pPr>
               <w:spacing w:before="0" w:after="27" w:line="228" w:lineRule="auto"/>
-              <w:ind w:left="266" w:hanging="266"/>
+              <w:ind w:left="360" w:hanging="360"/>
             </w:pPr>
             <w:r>
               <w:rPr>
-                <w:rFonts w:ascii="Arial Black" w:hAnsi="Arial Black" w:cs="Arial Black" w:eastAsia="Microsoft YaHei"/>
+                <w:rFonts w:ascii="Calibri" w:hAnsi="Calibri" w:cs="Calibri" w:eastAsia="Microsoft YaHei"/>
                 <w:b/>
                 <w:sz w:val="10"/>
                 <w:color w:val="E63846"/>
@@ -1256,7 +1256,7 @@
             </w:r>
             <w:r>
               <w:rPr>
-                <w:rFonts w:ascii="Arial" w:hAnsi="Arial" w:cs="Arial" w:eastAsia="Microsoft YaHei"/>
+                <w:rFonts w:ascii="Calibri" w:hAnsi="Calibri" w:cs="Calibri" w:eastAsia="Microsoft YaHei"/>
                 <w:b w:val="0"/>
                 <w:sz w:val="13"/>
                 <w:color w:val="000000"/>
@@ -1268,11 +1268,11 @@
           <w:p>
             <w:pPr>
               <w:spacing w:before="0" w:after="27" w:line="228" w:lineRule="auto"/>
-              <w:ind w:left="266" w:hanging="266"/>
+              <w:ind w:left="360" w:hanging="360"/>
             </w:pPr>
             <w:r>
               <w:rPr>
-                <w:rFonts w:ascii="Arial Black" w:hAnsi="Arial Black" w:cs="Arial Black" w:eastAsia="Microsoft YaHei"/>
+                <w:rFonts w:ascii="Calibri" w:hAnsi="Calibri" w:cs="Calibri" w:eastAsia="Microsoft YaHei"/>
                 <w:b/>
                 <w:sz w:val="10"/>
                 <w:color w:val="E63846"/>
@@ -1282,7 +1282,7 @@
             </w:r>
             <w:r>
               <w:rPr>
-                <w:rFonts w:ascii="Arial" w:hAnsi="Arial" w:cs="Arial" w:eastAsia="Microsoft YaHei"/>
+                <w:rFonts w:ascii="Calibri" w:hAnsi="Calibri" w:cs="Calibri" w:eastAsia="Microsoft YaHei"/>
                 <w:b w:val="0"/>
                 <w:sz w:val="13"/>
                 <w:color w:val="000000"/>
@@ -1294,11 +1294,11 @@
           <w:p>
             <w:pPr>
               <w:spacing w:before="0" w:after="27" w:line="228" w:lineRule="auto"/>
-              <w:ind w:left="266" w:hanging="266"/>
+              <w:ind w:left="360" w:hanging="360"/>
             </w:pPr>
             <w:r>
               <w:rPr>
-                <w:rFonts w:ascii="Arial Black" w:hAnsi="Arial Black" w:cs="Arial Black" w:eastAsia="Microsoft YaHei"/>
+                <w:rFonts w:ascii="Calibri" w:hAnsi="Calibri" w:cs="Calibri" w:eastAsia="Microsoft YaHei"/>
                 <w:b/>
                 <w:sz w:val="10"/>
                 <w:color w:val="E63846"/>
@@ -1308,7 +1308,7 @@
             </w:r>
             <w:r>
               <w:rPr>
-                <w:rFonts w:ascii="Arial" w:hAnsi="Arial" w:cs="Arial" w:eastAsia="Microsoft YaHei"/>
+                <w:rFonts w:ascii="Calibri" w:hAnsi="Calibri" w:cs="Calibri" w:eastAsia="Microsoft YaHei"/>
                 <w:b w:val="0"/>
                 <w:sz w:val="13"/>
                 <w:color w:val="000000"/>
@@ -1320,11 +1320,11 @@
           <w:p>
             <w:pPr>
               <w:spacing w:before="0" w:after="27" w:line="228" w:lineRule="auto"/>
-              <w:ind w:left="266" w:hanging="266"/>
+              <w:ind w:left="360" w:hanging="360"/>
             </w:pPr>
             <w:r>
               <w:rPr>
-                <w:rFonts w:ascii="Arial Black" w:hAnsi="Arial Black" w:cs="Arial Black" w:eastAsia="Microsoft YaHei"/>
+                <w:rFonts w:ascii="Calibri" w:hAnsi="Calibri" w:cs="Calibri" w:eastAsia="Microsoft YaHei"/>
                 <w:b/>
                 <w:sz w:val="10"/>
                 <w:color w:val="E63846"/>
@@ -1334,7 +1334,7 @@
             </w:r>
             <w:r>
               <w:rPr>
-                <w:rFonts w:ascii="Arial" w:hAnsi="Arial" w:cs="Arial" w:eastAsia="Microsoft YaHei"/>
+                <w:rFonts w:ascii="Calibri" w:hAnsi="Calibri" w:cs="Calibri" w:eastAsia="Microsoft YaHei"/>
                 <w:b w:val="0"/>
                 <w:sz w:val="13"/>
                 <w:color w:val="000000"/>
@@ -1346,11 +1346,11 @@
           <w:p>
             <w:pPr>
               <w:spacing w:before="0" w:after="27" w:line="228" w:lineRule="auto"/>
-              <w:ind w:left="266" w:hanging="266"/>
+              <w:ind w:left="360" w:hanging="360"/>
             </w:pPr>
             <w:r>
               <w:rPr>
-                <w:rFonts w:ascii="Arial Black" w:hAnsi="Arial Black" w:cs="Arial Black" w:eastAsia="Microsoft YaHei"/>
+                <w:rFonts w:ascii="Calibri" w:hAnsi="Calibri" w:cs="Calibri" w:eastAsia="Microsoft YaHei"/>
                 <w:b/>
                 <w:sz w:val="10"/>
                 <w:color w:val="E63846"/>
@@ -1360,7 +1360,7 @@
             </w:r>
             <w:r>
               <w:rPr>
-                <w:rFonts w:ascii="Arial" w:hAnsi="Arial" w:cs="Arial" w:eastAsia="Microsoft YaHei"/>
+                <w:rFonts w:ascii="Calibri" w:hAnsi="Calibri" w:cs="Calibri" w:eastAsia="Microsoft YaHei"/>
                 <w:b w:val="0"/>
                 <w:sz w:val="13"/>
                 <w:color w:val="000000"/>
@@ -1372,11 +1372,11 @@
           <w:p>
             <w:pPr>
               <w:spacing w:before="0" w:after="27" w:line="228" w:lineRule="auto"/>
-              <w:ind w:left="266" w:hanging="266"/>
+              <w:ind w:left="360" w:hanging="360"/>
             </w:pPr>
             <w:r>
               <w:rPr>
-                <w:rFonts w:ascii="Arial Black" w:hAnsi="Arial Black" w:cs="Arial Black" w:eastAsia="Microsoft YaHei"/>
+                <w:rFonts w:ascii="Calibri" w:hAnsi="Calibri" w:cs="Calibri" w:eastAsia="Microsoft YaHei"/>
                 <w:b/>
                 <w:sz w:val="10"/>
                 <w:color w:val="E63846"/>
@@ -1386,7 +1386,7 @@
             </w:r>
             <w:r>
               <w:rPr>
-                <w:rFonts w:ascii="Arial" w:hAnsi="Arial" w:cs="Arial" w:eastAsia="Microsoft YaHei"/>
+                <w:rFonts w:ascii="Calibri" w:hAnsi="Calibri" w:cs="Calibri" w:eastAsia="Microsoft YaHei"/>
                 <w:b w:val="0"/>
                 <w:sz w:val="13"/>
                 <w:color w:val="000000"/>
@@ -1426,7 +1426,7 @@
       </w:pPr>
       <w:r>
         <w:rPr>
-          <w:rFonts w:ascii="Arial Black" w:hAnsi="Arial Black" w:cs="Arial Black" w:eastAsia="Microsoft YaHei"/>
+          <w:rFonts w:ascii="Calibri" w:hAnsi="Calibri" w:cs="Calibri" w:eastAsia="Microsoft YaHei"/>
           <w:b/>
           <w:sz w:val="13"/>
           <w:color w:val="000000"/>
@@ -1455,7 +1455,7 @@
       </w:pPr>
       <w:r>
         <w:rPr>
-          <w:rFonts w:ascii="Arial Black" w:hAnsi="Arial Black" w:cs="Arial Black" w:eastAsia="Microsoft YaHei"/>
+          <w:rFonts w:ascii="Calibri" w:hAnsi="Calibri" w:cs="Calibri" w:eastAsia="Microsoft YaHei"/>
           <w:b/>
           <w:sz w:val="27"/>
           <w:color w:val="E63846"/>
@@ -1465,7 +1465,7 @@
       </w:r>
       <w:r>
         <w:rPr>
-          <w:rFonts w:ascii="Arial Black" w:hAnsi="Arial Black" w:cs="Arial Black" w:eastAsia="Microsoft YaHei"/>
+          <w:rFonts w:ascii="Calibri" w:hAnsi="Calibri" w:cs="Calibri" w:eastAsia="Microsoft YaHei"/>
           <w:b/>
           <w:sz w:val="22"/>
           <w:color w:val="000000"/>
@@ -1516,7 +1516,7 @@
             </w:pPr>
             <w:r>
               <w:rPr>
-                <w:rFonts w:ascii="Arial Black" w:hAnsi="Arial Black" w:cs="Arial Black" w:eastAsia="Microsoft YaHei"/>
+                <w:rFonts w:ascii="Calibri" w:hAnsi="Calibri" w:cs="Calibri" w:eastAsia="Microsoft YaHei"/>
                 <w:b/>
                 <w:sz w:val="12"/>
                 <w:color w:val="000000"/>
@@ -1529,11 +1529,11 @@
           <w:p>
             <w:pPr>
               <w:spacing w:before="0" w:after="27" w:line="228" w:lineRule="auto"/>
-              <w:ind w:left="266" w:hanging="266"/>
+              <w:ind w:left="360" w:hanging="360"/>
             </w:pPr>
             <w:r>
               <w:rPr>
-                <w:rFonts w:ascii="Arial Black" w:hAnsi="Arial Black" w:cs="Arial Black" w:eastAsia="Microsoft YaHei"/>
+                <w:rFonts w:ascii="Calibri" w:hAnsi="Calibri" w:cs="Calibri" w:eastAsia="Microsoft YaHei"/>
                 <w:b/>
                 <w:sz w:val="10"/>
                 <w:color w:val="E63846"/>
@@ -1543,7 +1543,7 @@
             </w:r>
             <w:r>
               <w:rPr>
-                <w:rFonts w:ascii="Arial" w:hAnsi="Arial" w:cs="Arial" w:eastAsia="Microsoft YaHei"/>
+                <w:rFonts w:ascii="Calibri" w:hAnsi="Calibri" w:cs="Calibri" w:eastAsia="Microsoft YaHei"/>
                 <w:b w:val="0"/>
                 <w:sz w:val="13"/>
                 <w:color w:val="000000"/>
@@ -1555,11 +1555,11 @@
           <w:p>
             <w:pPr>
               <w:spacing w:before="0" w:after="27" w:line="228" w:lineRule="auto"/>
-              <w:ind w:left="266" w:hanging="266"/>
+              <w:ind w:left="360" w:hanging="360"/>
             </w:pPr>
             <w:r>
               <w:rPr>
-                <w:rFonts w:ascii="Arial Black" w:hAnsi="Arial Black" w:cs="Arial Black" w:eastAsia="Microsoft YaHei"/>
+                <w:rFonts w:ascii="Calibri" w:hAnsi="Calibri" w:cs="Calibri" w:eastAsia="Microsoft YaHei"/>
                 <w:b/>
                 <w:sz w:val="10"/>
                 <w:color w:val="E63846"/>
@@ -1569,7 +1569,7 @@
             </w:r>
             <w:r>
               <w:rPr>
-                <w:rFonts w:ascii="Arial" w:hAnsi="Arial" w:cs="Arial" w:eastAsia="Microsoft YaHei"/>
+                <w:rFonts w:ascii="Calibri" w:hAnsi="Calibri" w:cs="Calibri" w:eastAsia="Microsoft YaHei"/>
                 <w:b w:val="0"/>
                 <w:sz w:val="13"/>
                 <w:color w:val="000000"/>
@@ -1583,11 +1583,11 @@
           <w:p>
             <w:pPr>
               <w:spacing w:before="0" w:after="27" w:line="228" w:lineRule="auto"/>
-              <w:ind w:left="266" w:hanging="266"/>
+              <w:ind w:left="360" w:hanging="360"/>
             </w:pPr>
             <w:r>
               <w:rPr>
-                <w:rFonts w:ascii="Arial Black" w:hAnsi="Arial Black" w:cs="Arial Black" w:eastAsia="Microsoft YaHei"/>
+                <w:rFonts w:ascii="Calibri" w:hAnsi="Calibri" w:cs="Calibri" w:eastAsia="Microsoft YaHei"/>
                 <w:b/>
                 <w:sz w:val="10"/>
                 <w:color w:val="E63846"/>
@@ -1597,7 +1597,7 @@
             </w:r>
             <w:r>
               <w:rPr>
-                <w:rFonts w:ascii="Arial" w:hAnsi="Arial" w:cs="Arial" w:eastAsia="Microsoft YaHei"/>
+                <w:rFonts w:ascii="Calibri" w:hAnsi="Calibri" w:cs="Calibri" w:eastAsia="Microsoft YaHei"/>
                 <w:b w:val="0"/>
                 <w:sz w:val="13"/>
                 <w:color w:val="000000"/>
@@ -1609,11 +1609,11 @@
           <w:p>
             <w:pPr>
               <w:spacing w:before="0" w:after="27" w:line="228" w:lineRule="auto"/>
-              <w:ind w:left="266" w:hanging="266"/>
+              <w:ind w:left="360" w:hanging="360"/>
             </w:pPr>
             <w:r>
               <w:rPr>
-                <w:rFonts w:ascii="Arial Black" w:hAnsi="Arial Black" w:cs="Arial Black" w:eastAsia="Microsoft YaHei"/>
+                <w:rFonts w:ascii="Calibri" w:hAnsi="Calibri" w:cs="Calibri" w:eastAsia="Microsoft YaHei"/>
                 <w:b/>
                 <w:sz w:val="10"/>
                 <w:color w:val="E63846"/>
@@ -1623,7 +1623,7 @@
             </w:r>
             <w:r>
               <w:rPr>
-                <w:rFonts w:ascii="Arial" w:hAnsi="Arial" w:cs="Arial" w:eastAsia="Microsoft YaHei"/>
+                <w:rFonts w:ascii="Calibri" w:hAnsi="Calibri" w:cs="Calibri" w:eastAsia="Microsoft YaHei"/>
                 <w:b w:val="0"/>
                 <w:sz w:val="13"/>
                 <w:color w:val="000000"/>
@@ -1635,11 +1635,11 @@
           <w:p>
             <w:pPr>
               <w:spacing w:before="0" w:after="27" w:line="228" w:lineRule="auto"/>
-              <w:ind w:left="266" w:hanging="266"/>
+              <w:ind w:left="360" w:hanging="360"/>
             </w:pPr>
             <w:r>
               <w:rPr>
-                <w:rFonts w:ascii="Arial Black" w:hAnsi="Arial Black" w:cs="Arial Black" w:eastAsia="Microsoft YaHei"/>
+                <w:rFonts w:ascii="Calibri" w:hAnsi="Calibri" w:cs="Calibri" w:eastAsia="Microsoft YaHei"/>
                 <w:b/>
                 <w:sz w:val="10"/>
                 <w:color w:val="E63846"/>
@@ -1649,7 +1649,7 @@
             </w:r>
             <w:r>
               <w:rPr>
-                <w:rFonts w:ascii="Arial" w:hAnsi="Arial" w:cs="Arial" w:eastAsia="Microsoft YaHei"/>
+                <w:rFonts w:ascii="Calibri" w:hAnsi="Calibri" w:cs="Calibri" w:eastAsia="Microsoft YaHei"/>
                 <w:b w:val="0"/>
                 <w:sz w:val="13"/>
                 <w:color w:val="000000"/>
@@ -1661,11 +1661,11 @@
           <w:p>
             <w:pPr>
               <w:spacing w:before="0" w:after="27" w:line="228" w:lineRule="auto"/>
-              <w:ind w:left="266" w:hanging="266"/>
+              <w:ind w:left="360" w:hanging="360"/>
             </w:pPr>
             <w:r>
               <w:rPr>
-                <w:rFonts w:ascii="Arial Black" w:hAnsi="Arial Black" w:cs="Arial Black" w:eastAsia="Microsoft YaHei"/>
+                <w:rFonts w:ascii="Calibri" w:hAnsi="Calibri" w:cs="Calibri" w:eastAsia="Microsoft YaHei"/>
                 <w:b/>
                 <w:sz w:val="10"/>
                 <w:color w:val="E63846"/>
@@ -1675,7 +1675,7 @@
             </w:r>
             <w:r>
               <w:rPr>
-                <w:rFonts w:ascii="Arial" w:hAnsi="Arial" w:cs="Arial" w:eastAsia="Microsoft YaHei"/>
+                <w:rFonts w:ascii="Calibri" w:hAnsi="Calibri" w:cs="Calibri" w:eastAsia="Microsoft YaHei"/>
                 <w:b w:val="0"/>
                 <w:sz w:val="13"/>
                 <w:color w:val="000000"/>
@@ -1687,11 +1687,11 @@
           <w:p>
             <w:pPr>
               <w:spacing w:before="0" w:after="27" w:line="228" w:lineRule="auto"/>
-              <w:ind w:left="266" w:hanging="266"/>
+              <w:ind w:left="360" w:hanging="360"/>
             </w:pPr>
             <w:r>
               <w:rPr>
-                <w:rFonts w:ascii="Arial Black" w:hAnsi="Arial Black" w:cs="Arial Black" w:eastAsia="Microsoft YaHei"/>
+                <w:rFonts w:ascii="Calibri" w:hAnsi="Calibri" w:cs="Calibri" w:eastAsia="Microsoft YaHei"/>
                 <w:b/>
                 <w:sz w:val="10"/>
                 <w:color w:val="E63846"/>
@@ -1701,7 +1701,7 @@
             </w:r>
             <w:r>
               <w:rPr>
-                <w:rFonts w:ascii="Arial" w:hAnsi="Arial" w:cs="Arial" w:eastAsia="Microsoft YaHei"/>
+                <w:rFonts w:ascii="Calibri" w:hAnsi="Calibri" w:cs="Calibri" w:eastAsia="Microsoft YaHei"/>
                 <w:b w:val="0"/>
                 <w:sz w:val="13"/>
                 <w:color w:val="000000"/>
@@ -1755,7 +1755,7 @@
             </w:pPr>
             <w:r>
               <w:rPr>
-                <w:rFonts w:ascii="Arial Black" w:hAnsi="Arial Black" w:cs="Arial Black" w:eastAsia="Microsoft YaHei"/>
+                <w:rFonts w:ascii="Calibri" w:hAnsi="Calibri" w:cs="Calibri" w:eastAsia="Microsoft YaHei"/>
                 <w:b/>
                 <w:sz w:val="12"/>
                 <w:color w:val="000000"/>
@@ -1768,11 +1768,11 @@
           <w:p>
             <w:pPr>
               <w:spacing w:before="0" w:after="27" w:line="228" w:lineRule="auto"/>
-              <w:ind w:left="266" w:hanging="266"/>
+              <w:ind w:left="360" w:hanging="360"/>
             </w:pPr>
             <w:r>
               <w:rPr>
-                <w:rFonts w:ascii="Arial Black" w:hAnsi="Arial Black" w:cs="Arial Black" w:eastAsia="Microsoft YaHei"/>
+                <w:rFonts w:ascii="Calibri" w:hAnsi="Calibri" w:cs="Calibri" w:eastAsia="Microsoft YaHei"/>
                 <w:b/>
                 <w:sz w:val="10"/>
                 <w:color w:val="E63846"/>
@@ -1782,7 +1782,7 @@
             </w:r>
             <w:r>
               <w:rPr>
-                <w:rFonts w:ascii="Arial" w:hAnsi="Arial" w:cs="Arial" w:eastAsia="Microsoft YaHei"/>
+                <w:rFonts w:ascii="Calibri" w:hAnsi="Calibri" w:cs="Calibri" w:eastAsia="Microsoft YaHei"/>
                 <w:b w:val="0"/>
                 <w:sz w:val="13"/>
                 <w:color w:val="000000"/>
@@ -1796,11 +1796,11 @@
           <w:p>
             <w:pPr>
               <w:spacing w:before="0" w:after="27" w:line="228" w:lineRule="auto"/>
-              <w:ind w:left="266" w:hanging="266"/>
+              <w:ind w:left="360" w:hanging="360"/>
             </w:pPr>
             <w:r>
               <w:rPr>
-                <w:rFonts w:ascii="Arial Black" w:hAnsi="Arial Black" w:cs="Arial Black" w:eastAsia="Microsoft YaHei"/>
+                <w:rFonts w:ascii="Calibri" w:hAnsi="Calibri" w:cs="Calibri" w:eastAsia="Microsoft YaHei"/>
                 <w:b/>
                 <w:sz w:val="10"/>
                 <w:color w:val="E63846"/>
@@ -1810,7 +1810,7 @@
             </w:r>
             <w:r>
               <w:rPr>
-                <w:rFonts w:ascii="Arial" w:hAnsi="Arial" w:cs="Arial" w:eastAsia="Microsoft YaHei"/>
+                <w:rFonts w:ascii="Calibri" w:hAnsi="Calibri" w:cs="Calibri" w:eastAsia="Microsoft YaHei"/>
                 <w:b w:val="0"/>
                 <w:sz w:val="13"/>
                 <w:color w:val="000000"/>
@@ -1854,7 +1854,7 @@
       </w:pPr>
       <w:r>
         <w:rPr>
-          <w:rFonts w:ascii="Arial Black" w:hAnsi="Arial Black" w:cs="Arial Black" w:eastAsia="Microsoft YaHei"/>
+          <w:rFonts w:ascii="Calibri" w:hAnsi="Calibri" w:cs="Calibri" w:eastAsia="Microsoft YaHei"/>
           <w:b/>
           <w:sz w:val="13"/>
           <w:color w:val="000000"/>
@@ -1883,7 +1883,7 @@
       </w:pPr>
       <w:r>
         <w:rPr>
-          <w:rFonts w:ascii="Arial Black" w:hAnsi="Arial Black" w:cs="Arial Black" w:eastAsia="Microsoft YaHei"/>
+          <w:rFonts w:ascii="Calibri" w:hAnsi="Calibri" w:cs="Calibri" w:eastAsia="Microsoft YaHei"/>
           <w:b/>
           <w:sz w:val="27"/>
           <w:color w:val="E63846"/>
@@ -1893,7 +1893,7 @@
       </w:r>
       <w:r>
         <w:rPr>
-          <w:rFonts w:ascii="Arial Black" w:hAnsi="Arial Black" w:cs="Arial Black" w:eastAsia="Microsoft YaHei"/>
+          <w:rFonts w:ascii="Calibri" w:hAnsi="Calibri" w:cs="Calibri" w:eastAsia="Microsoft YaHei"/>
           <w:b/>
           <w:sz w:val="22"/>
           <w:color w:val="000000"/>
@@ -1911,7 +1911,7 @@
       </w:pPr>
       <w:r>
         <w:rPr>
-          <w:rFonts w:ascii="Arial Black" w:hAnsi="Arial Black" w:cs="Arial Black" w:eastAsia="Microsoft YaHei"/>
+          <w:rFonts w:ascii="Calibri" w:hAnsi="Calibri" w:cs="Calibri" w:eastAsia="Microsoft YaHei"/>
           <w:b/>
           <w:sz w:val="15"/>
           <w:color w:val="000000"/>
@@ -1923,11 +1923,11 @@
     <w:p>
       <w:pPr>
         <w:spacing w:before="0" w:after="32" w:line="273" w:lineRule="auto"/>
-        <w:ind w:left="181" w:hanging="181"/>
+        <w:ind w:left="240" w:hanging="240"/>
       </w:pPr>
       <w:r>
         <w:rPr>
-          <w:rFonts w:ascii="Arial Black" w:hAnsi="Arial Black" w:cs="Arial Black" w:eastAsia="Microsoft YaHei"/>
+          <w:rFonts w:ascii="Calibri" w:hAnsi="Calibri" w:cs="Calibri" w:eastAsia="Microsoft YaHei"/>
           <w:b/>
           <w:sz w:val="11"/>
           <w:color w:val="E63846"/>
@@ -1937,7 +1937,7 @@
       </w:r>
       <w:r>
         <w:rPr>
-          <w:rFonts w:ascii="Arial" w:hAnsi="Arial" w:cs="Arial" w:eastAsia="Microsoft YaHei"/>
+          <w:rFonts w:ascii="Calibri" w:hAnsi="Calibri" w:cs="Calibri" w:eastAsia="Microsoft YaHei"/>
           <w:b w:val="0"/>
           <w:sz w:val="14"/>
           <w:color w:val="000000"/>
@@ -1949,11 +1949,11 @@
     <w:p>
       <w:pPr>
         <w:spacing w:before="0" w:after="32" w:line="273" w:lineRule="auto"/>
-        <w:ind w:left="181" w:hanging="181"/>
+        <w:ind w:left="240" w:hanging="240"/>
       </w:pPr>
       <w:r>
         <w:rPr>
-          <w:rFonts w:ascii="Arial Black" w:hAnsi="Arial Black" w:cs="Arial Black" w:eastAsia="Microsoft YaHei"/>
+          <w:rFonts w:ascii="Calibri" w:hAnsi="Calibri" w:cs="Calibri" w:eastAsia="Microsoft YaHei"/>
           <w:b/>
           <w:sz w:val="11"/>
           <w:color w:val="E63846"/>
@@ -1963,7 +1963,7 @@
       </w:r>
       <w:r>
         <w:rPr>
-          <w:rFonts w:ascii="Arial" w:hAnsi="Arial" w:cs="Arial" w:eastAsia="Microsoft YaHei"/>
+          <w:rFonts w:ascii="Calibri" w:hAnsi="Calibri" w:cs="Calibri" w:eastAsia="Microsoft YaHei"/>
           <w:b w:val="0"/>
           <w:sz w:val="14"/>
           <w:color w:val="000000"/>
@@ -1979,11 +1979,11 @@
     <w:p>
       <w:pPr>
         <w:spacing w:before="0" w:after="32" w:line="273" w:lineRule="auto"/>
-        <w:ind w:left="181" w:hanging="181"/>
+        <w:ind w:left="240" w:hanging="240"/>
       </w:pPr>
       <w:r>
         <w:rPr>
-          <w:rFonts w:ascii="Arial Black" w:hAnsi="Arial Black" w:cs="Arial Black" w:eastAsia="Microsoft YaHei"/>
+          <w:rFonts w:ascii="Calibri" w:hAnsi="Calibri" w:cs="Calibri" w:eastAsia="Microsoft YaHei"/>
           <w:b/>
           <w:sz w:val="11"/>
           <w:color w:val="E63846"/>
@@ -1993,7 +1993,7 @@
       </w:r>
       <w:r>
         <w:rPr>
-          <w:rFonts w:ascii="Arial" w:hAnsi="Arial" w:cs="Arial" w:eastAsia="Microsoft YaHei"/>
+          <w:rFonts w:ascii="Calibri" w:hAnsi="Calibri" w:cs="Calibri" w:eastAsia="Microsoft YaHei"/>
           <w:b w:val="0"/>
           <w:sz w:val="14"/>
           <w:color w:val="000000"/>
@@ -2005,11 +2005,11 @@
     <w:p>
       <w:pPr>
         <w:spacing w:before="0" w:after="32" w:line="273" w:lineRule="auto"/>
-        <w:ind w:left="181" w:hanging="181"/>
+        <w:ind w:left="240" w:hanging="240"/>
       </w:pPr>
       <w:r>
         <w:rPr>
-          <w:rFonts w:ascii="Arial Black" w:hAnsi="Arial Black" w:cs="Arial Black" w:eastAsia="Microsoft YaHei"/>
+          <w:rFonts w:ascii="Calibri" w:hAnsi="Calibri" w:cs="Calibri" w:eastAsia="Microsoft YaHei"/>
           <w:b/>
           <w:sz w:val="11"/>
           <w:color w:val="E63846"/>
@@ -2019,7 +2019,7 @@
       </w:r>
       <w:r>
         <w:rPr>
-          <w:rFonts w:ascii="Arial" w:hAnsi="Arial" w:cs="Arial" w:eastAsia="Microsoft YaHei"/>
+          <w:rFonts w:ascii="Calibri" w:hAnsi="Calibri" w:cs="Calibri" w:eastAsia="Microsoft YaHei"/>
           <w:b w:val="0"/>
           <w:sz w:val="14"/>
           <w:color w:val="000000"/>
@@ -2033,11 +2033,11 @@
     <w:p>
       <w:pPr>
         <w:spacing w:before="0" w:after="32" w:line="273" w:lineRule="auto"/>
-        <w:ind w:left="181" w:hanging="181"/>
+        <w:ind w:left="240" w:hanging="240"/>
       </w:pPr>
       <w:r>
         <w:rPr>
-          <w:rFonts w:ascii="Arial Black" w:hAnsi="Arial Black" w:cs="Arial Black" w:eastAsia="Microsoft YaHei"/>
+          <w:rFonts w:ascii="Calibri" w:hAnsi="Calibri" w:cs="Calibri" w:eastAsia="Microsoft YaHei"/>
           <w:b/>
           <w:sz w:val="11"/>
           <w:color w:val="E63846"/>
@@ -2047,7 +2047,7 @@
       </w:r>
       <w:r>
         <w:rPr>
-          <w:rFonts w:ascii="Arial" w:hAnsi="Arial" w:cs="Arial" w:eastAsia="Microsoft YaHei"/>
+          <w:rFonts w:ascii="Calibri" w:hAnsi="Calibri" w:cs="Calibri" w:eastAsia="Microsoft YaHei"/>
           <w:b w:val="0"/>
           <w:sz w:val="14"/>
           <w:color w:val="000000"/>
@@ -2067,7 +2067,7 @@
       </w:pPr>
       <w:r>
         <w:rPr>
-          <w:rFonts w:ascii="Arial Black" w:hAnsi="Arial Black" w:cs="Arial Black" w:eastAsia="Microsoft YaHei"/>
+          <w:rFonts w:ascii="Calibri" w:hAnsi="Calibri" w:cs="Calibri" w:eastAsia="Microsoft YaHei"/>
           <w:b/>
           <w:sz w:val="15"/>
           <w:color w:val="000000"/>
@@ -2079,11 +2079,11 @@
     <w:p>
       <w:pPr>
         <w:spacing w:before="0" w:after="32" w:line="273" w:lineRule="auto"/>
-        <w:ind w:left="181" w:hanging="181"/>
+        <w:ind w:left="240" w:hanging="240"/>
       </w:pPr>
       <w:r>
         <w:rPr>
-          <w:rFonts w:ascii="Arial Black" w:hAnsi="Arial Black" w:cs="Arial Black" w:eastAsia="Microsoft YaHei"/>
+          <w:rFonts w:ascii="Calibri" w:hAnsi="Calibri" w:cs="Calibri" w:eastAsia="Microsoft YaHei"/>
           <w:b/>
           <w:sz w:val="11"/>
           <w:color w:val="E63846"/>
@@ -2093,7 +2093,7 @@
       </w:r>
       <w:r>
         <w:rPr>
-          <w:rFonts w:ascii="Arial" w:hAnsi="Arial" w:cs="Arial" w:eastAsia="Microsoft YaHei"/>
+          <w:rFonts w:ascii="Calibri" w:hAnsi="Calibri" w:cs="Calibri" w:eastAsia="Microsoft YaHei"/>
           <w:b w:val="0"/>
           <w:sz w:val="14"/>
           <w:color w:val="000000"/>
@@ -2105,11 +2105,11 @@
     <w:p>
       <w:pPr>
         <w:spacing w:before="0" w:after="32" w:line="273" w:lineRule="auto"/>
-        <w:ind w:left="181" w:hanging="181"/>
+        <w:ind w:left="240" w:hanging="240"/>
       </w:pPr>
       <w:r>
         <w:rPr>
-          <w:rFonts w:ascii="Arial Black" w:hAnsi="Arial Black" w:cs="Arial Black" w:eastAsia="Microsoft YaHei"/>
+          <w:rFonts w:ascii="Calibri" w:hAnsi="Calibri" w:cs="Calibri" w:eastAsia="Microsoft YaHei"/>
           <w:b/>
           <w:sz w:val="11"/>
           <w:color w:val="E63846"/>
@@ -2119,7 +2119,7 @@
       </w:r>
       <w:r>
         <w:rPr>
-          <w:rFonts w:ascii="Arial" w:hAnsi="Arial" w:cs="Arial" w:eastAsia="Microsoft YaHei"/>
+          <w:rFonts w:ascii="Calibri" w:hAnsi="Calibri" w:cs="Calibri" w:eastAsia="Microsoft YaHei"/>
           <w:b w:val="0"/>
           <w:sz w:val="14"/>
           <w:color w:val="000000"/>
@@ -2133,11 +2133,11 @@
     <w:p>
       <w:pPr>
         <w:spacing w:before="0" w:after="32" w:line="273" w:lineRule="auto"/>
-        <w:ind w:left="181" w:hanging="181"/>
+        <w:ind w:left="240" w:hanging="240"/>
       </w:pPr>
       <w:r>
         <w:rPr>
-          <w:rFonts w:ascii="Arial Black" w:hAnsi="Arial Black" w:cs="Arial Black" w:eastAsia="Microsoft YaHei"/>
+          <w:rFonts w:ascii="Calibri" w:hAnsi="Calibri" w:cs="Calibri" w:eastAsia="Microsoft YaHei"/>
           <w:b/>
           <w:sz w:val="11"/>
           <w:color w:val="E63846"/>
@@ -2147,7 +2147,7 @@
       </w:r>
       <w:r>
         <w:rPr>
-          <w:rFonts w:ascii="Arial" w:hAnsi="Arial" w:cs="Arial" w:eastAsia="Microsoft YaHei"/>
+          <w:rFonts w:ascii="Calibri" w:hAnsi="Calibri" w:cs="Calibri" w:eastAsia="Microsoft YaHei"/>
           <w:b w:val="0"/>
           <w:sz w:val="14"/>
           <w:color w:val="000000"/>
@@ -2163,11 +2163,11 @@
     <w:p>
       <w:pPr>
         <w:spacing w:before="0" w:after="32" w:line="273" w:lineRule="auto"/>
-        <w:ind w:left="181" w:hanging="181"/>
+        <w:ind w:left="240" w:hanging="240"/>
       </w:pPr>
       <w:r>
         <w:rPr>
-          <w:rFonts w:ascii="Arial Black" w:hAnsi="Arial Black" w:cs="Arial Black" w:eastAsia="Microsoft YaHei"/>
+          <w:rFonts w:ascii="Calibri" w:hAnsi="Calibri" w:cs="Calibri" w:eastAsia="Microsoft YaHei"/>
           <w:b/>
           <w:sz w:val="11"/>
           <w:color w:val="E63846"/>
@@ -2177,7 +2177,7 @@
       </w:r>
       <w:r>
         <w:rPr>
-          <w:rFonts w:ascii="Arial Black" w:hAnsi="Arial Black" w:cs="Arial Black" w:eastAsia="Microsoft YaHei"/>
+          <w:rFonts w:ascii="Calibri" w:hAnsi="Calibri" w:cs="Calibri" w:eastAsia="Microsoft YaHei"/>
           <w:b/>
           <w:sz w:val="14"/>
           <w:color w:val="000000"/>
@@ -2187,7 +2187,7 @@
       </w:r>
       <w:r>
         <w:rPr>
-          <w:rFonts w:ascii="Arial" w:hAnsi="Arial" w:cs="Arial" w:eastAsia="Microsoft YaHei"/>
+          <w:rFonts w:ascii="Calibri" w:hAnsi="Calibri" w:cs="Calibri" w:eastAsia="Microsoft YaHei"/>
           <w:b w:val="0"/>
           <w:sz w:val="14"/>
           <w:color w:val="000000"/>
@@ -2205,7 +2205,7 @@
       </w:pPr>
       <w:r>
         <w:rPr>
-          <w:rFonts w:ascii="Arial Black" w:hAnsi="Arial Black" w:cs="Arial Black" w:eastAsia="Microsoft YaHei"/>
+          <w:rFonts w:ascii="Calibri" w:hAnsi="Calibri" w:cs="Calibri" w:eastAsia="Microsoft YaHei"/>
           <w:b/>
           <w:sz w:val="15"/>
           <w:color w:val="000000"/>
@@ -2217,11 +2217,11 @@
     <w:p>
       <w:pPr>
         <w:spacing w:before="0" w:after="32" w:line="273" w:lineRule="auto"/>
-        <w:ind w:left="181" w:hanging="181"/>
+        <w:ind w:left="240" w:hanging="240"/>
       </w:pPr>
       <w:r>
         <w:rPr>
-          <w:rFonts w:ascii="Arial Black" w:hAnsi="Arial Black" w:cs="Arial Black" w:eastAsia="Microsoft YaHei"/>
+          <w:rFonts w:ascii="Calibri" w:hAnsi="Calibri" w:cs="Calibri" w:eastAsia="Microsoft YaHei"/>
           <w:b/>
           <w:sz w:val="11"/>
           <w:color w:val="E63846"/>
@@ -2231,7 +2231,7 @@
       </w:r>
       <w:r>
         <w:rPr>
-          <w:rFonts w:ascii="Arial" w:hAnsi="Arial" w:cs="Arial" w:eastAsia="Microsoft YaHei"/>
+          <w:rFonts w:ascii="Calibri" w:hAnsi="Calibri" w:cs="Calibri" w:eastAsia="Microsoft YaHei"/>
           <w:b w:val="0"/>
           <w:sz w:val="14"/>
           <w:color w:val="000000"/>
@@ -2243,11 +2243,11 @@
     <w:p>
       <w:pPr>
         <w:spacing w:before="0" w:after="32" w:line="273" w:lineRule="auto"/>
-        <w:ind w:left="181" w:hanging="181"/>
+        <w:ind w:left="240" w:hanging="240"/>
       </w:pPr>
       <w:r>
         <w:rPr>
-          <w:rFonts w:ascii="Arial Black" w:hAnsi="Arial Black" w:cs="Arial Black" w:eastAsia="Microsoft YaHei"/>
+          <w:rFonts w:ascii="Calibri" w:hAnsi="Calibri" w:cs="Calibri" w:eastAsia="Microsoft YaHei"/>
           <w:b/>
           <w:sz w:val="11"/>
           <w:color w:val="E63846"/>
@@ -2257,7 +2257,7 @@
       </w:r>
       <w:r>
         <w:rPr>
-          <w:rFonts w:ascii="Arial" w:hAnsi="Arial" w:cs="Arial" w:eastAsia="Microsoft YaHei"/>
+          <w:rFonts w:ascii="Calibri" w:hAnsi="Calibri" w:cs="Calibri" w:eastAsia="Microsoft YaHei"/>
           <w:b w:val="0"/>
           <w:sz w:val="14"/>
           <w:color w:val="000000"/>
@@ -2269,11 +2269,11 @@
     <w:p>
       <w:pPr>
         <w:spacing w:before="0" w:after="32" w:line="273" w:lineRule="auto"/>
-        <w:ind w:left="181" w:hanging="181"/>
+        <w:ind w:left="240" w:hanging="240"/>
       </w:pPr>
       <w:r>
         <w:rPr>
-          <w:rFonts w:ascii="Arial Black" w:hAnsi="Arial Black" w:cs="Arial Black" w:eastAsia="Microsoft YaHei"/>
+          <w:rFonts w:ascii="Calibri" w:hAnsi="Calibri" w:cs="Calibri" w:eastAsia="Microsoft YaHei"/>
           <w:b/>
           <w:sz w:val="11"/>
           <w:color w:val="E63846"/>
@@ -2283,7 +2283,7 @@
       </w:r>
       <w:r>
         <w:rPr>
-          <w:rFonts w:ascii="Arial" w:hAnsi="Arial" w:cs="Arial" w:eastAsia="Microsoft YaHei"/>
+          <w:rFonts w:ascii="Calibri" w:hAnsi="Calibri" w:cs="Calibri" w:eastAsia="Microsoft YaHei"/>
           <w:b w:val="0"/>
           <w:sz w:val="14"/>
           <w:color w:val="000000"/>
@@ -2295,11 +2295,11 @@
     <w:p>
       <w:pPr>
         <w:spacing w:before="0" w:after="32" w:line="273" w:lineRule="auto"/>
-        <w:ind w:left="181" w:hanging="181"/>
+        <w:ind w:left="240" w:hanging="240"/>
       </w:pPr>
       <w:r>
         <w:rPr>
-          <w:rFonts w:ascii="Arial Black" w:hAnsi="Arial Black" w:cs="Arial Black" w:eastAsia="Microsoft YaHei"/>
+          <w:rFonts w:ascii="Calibri" w:hAnsi="Calibri" w:cs="Calibri" w:eastAsia="Microsoft YaHei"/>
           <w:b/>
           <w:sz w:val="11"/>
           <w:color w:val="E63846"/>
@@ -2309,7 +2309,7 @@
       </w:r>
       <w:r>
         <w:rPr>
-          <w:rFonts w:ascii="Arial" w:hAnsi="Arial" w:cs="Arial" w:eastAsia="Microsoft YaHei"/>
+          <w:rFonts w:ascii="Calibri" w:hAnsi="Calibri" w:cs="Calibri" w:eastAsia="Microsoft YaHei"/>
           <w:b w:val="0"/>
           <w:sz w:val="14"/>
           <w:color w:val="000000"/>
@@ -2341,7 +2341,7 @@
       </w:pPr>
       <w:r>
         <w:rPr>
-          <w:rFonts w:ascii="Arial Black" w:hAnsi="Arial Black" w:cs="Arial Black" w:eastAsia="Microsoft YaHei"/>
+          <w:rFonts w:ascii="Calibri" w:hAnsi="Calibri" w:cs="Calibri" w:eastAsia="Microsoft YaHei"/>
           <w:b/>
           <w:sz w:val="13"/>
           <w:color w:val="000000"/>
@@ -2370,7 +2370,7 @@
       </w:pPr>
       <w:r>
         <w:rPr>
-          <w:rFonts w:ascii="Arial Black" w:hAnsi="Arial Black" w:cs="Arial Black" w:eastAsia="Microsoft YaHei"/>
+          <w:rFonts w:ascii="Calibri" w:hAnsi="Calibri" w:cs="Calibri" w:eastAsia="Microsoft YaHei"/>
           <w:b/>
           <w:sz w:val="27"/>
           <w:color w:val="E63846"/>
@@ -2380,7 +2380,7 @@
       </w:r>
       <w:r>
         <w:rPr>
-          <w:rFonts w:ascii="Arial Black" w:hAnsi="Arial Black" w:cs="Arial Black" w:eastAsia="Microsoft YaHei"/>
+          <w:rFonts w:ascii="Calibri" w:hAnsi="Calibri" w:cs="Calibri" w:eastAsia="Microsoft YaHei"/>
           <w:b/>
           <w:sz w:val="22"/>
           <w:color w:val="000000"/>
@@ -2480,7 +2480,7 @@
             </w:pPr>
             <w:r>
               <w:rPr>
-                <w:rFonts w:ascii="Arial Black" w:hAnsi="Arial Black" w:cs="Arial Black" w:eastAsia="Microsoft YaHei"/>
+                <w:rFonts w:ascii="Calibri" w:hAnsi="Calibri" w:cs="Calibri" w:eastAsia="Microsoft YaHei"/>
                 <w:b/>
                 <w:sz w:val="12"/>
                 <w:color w:val="FFFFFF"/>
@@ -2516,7 +2516,7 @@
             </w:pPr>
             <w:r>
               <w:rPr>
-                <w:rFonts w:ascii="Arial Black" w:hAnsi="Arial Black" w:cs="Arial Black" w:eastAsia="Microsoft YaHei"/>
+                <w:rFonts w:ascii="Calibri" w:hAnsi="Calibri" w:cs="Calibri" w:eastAsia="Microsoft YaHei"/>
                 <w:b/>
                 <w:sz w:val="12"/>
                 <w:color w:val="FFFFFF"/>
@@ -2552,7 +2552,7 @@
             </w:pPr>
             <w:r>
               <w:rPr>
-                <w:rFonts w:ascii="Arial Black" w:hAnsi="Arial Black" w:cs="Arial Black" w:eastAsia="Microsoft YaHei"/>
+                <w:rFonts w:ascii="Calibri" w:hAnsi="Calibri" w:cs="Calibri" w:eastAsia="Microsoft YaHei"/>
                 <w:b/>
                 <w:sz w:val="12"/>
                 <w:color w:val="FFFFFF"/>
@@ -2588,7 +2588,7 @@
             </w:pPr>
             <w:r>
               <w:rPr>
-                <w:rFonts w:ascii="Arial Black" w:hAnsi="Arial Black" w:cs="Arial Black" w:eastAsia="Microsoft YaHei"/>
+                <w:rFonts w:ascii="Calibri" w:hAnsi="Calibri" w:cs="Calibri" w:eastAsia="Microsoft YaHei"/>
                 <w:b/>
                 <w:sz w:val="12"/>
                 <w:color w:val="FFFFFF"/>
@@ -2629,7 +2629,7 @@
             </w:pPr>
             <w:r>
               <w:rPr>
-                <w:rFonts w:ascii="Arial" w:hAnsi="Arial" w:cs="Arial" w:eastAsia="Microsoft YaHei"/>
+                <w:rFonts w:ascii="Calibri" w:hAnsi="Calibri" w:cs="Calibri" w:eastAsia="Microsoft YaHei"/>
                 <w:b w:val="0"/>
                 <w:sz w:val="13"/>
                 <w:color w:val="1A1A1A"/>
@@ -2665,7 +2665,7 @@
             </w:pPr>
             <w:r>
               <w:rPr>
-                <w:rFonts w:ascii="Arial" w:hAnsi="Arial" w:cs="Arial" w:eastAsia="Microsoft YaHei"/>
+                <w:rFonts w:ascii="Calibri" w:hAnsi="Calibri" w:cs="Calibri" w:eastAsia="Microsoft YaHei"/>
                 <w:b w:val="0"/>
                 <w:sz w:val="13"/>
                 <w:color w:val="1A1A1A"/>
@@ -2701,7 +2701,7 @@
             </w:pPr>
             <w:r>
               <w:rPr>
-                <w:rFonts w:ascii="Arial" w:hAnsi="Arial" w:cs="Arial" w:eastAsia="Microsoft YaHei"/>
+                <w:rFonts w:ascii="Calibri" w:hAnsi="Calibri" w:cs="Calibri" w:eastAsia="Microsoft YaHei"/>
                 <w:b w:val="0"/>
                 <w:sz w:val="13"/>
                 <w:color w:val="1A1A1A"/>
@@ -2737,7 +2737,7 @@
             </w:pPr>
             <w:r>
               <w:rPr>
-                <w:rFonts w:ascii="Arial" w:hAnsi="Arial" w:cs="Arial" w:eastAsia="Microsoft YaHei"/>
+                <w:rFonts w:ascii="Calibri" w:hAnsi="Calibri" w:cs="Calibri" w:eastAsia="Microsoft YaHei"/>
                 <w:b w:val="0"/>
                 <w:sz w:val="13"/>
                 <w:color w:val="1A1A1A"/>
@@ -2778,7 +2778,7 @@
             </w:pPr>
             <w:r>
               <w:rPr>
-                <w:rFonts w:ascii="Arial" w:hAnsi="Arial" w:cs="Arial" w:eastAsia="Microsoft YaHei"/>
+                <w:rFonts w:ascii="Calibri" w:hAnsi="Calibri" w:cs="Calibri" w:eastAsia="Microsoft YaHei"/>
                 <w:b w:val="0"/>
                 <w:sz w:val="13"/>
                 <w:color w:val="1A1A1A"/>
@@ -2814,7 +2814,7 @@
             </w:pPr>
             <w:r>
               <w:rPr>
-                <w:rFonts w:ascii="Arial" w:hAnsi="Arial" w:cs="Arial" w:eastAsia="Microsoft YaHei"/>
+                <w:rFonts w:ascii="Calibri" w:hAnsi="Calibri" w:cs="Calibri" w:eastAsia="Microsoft YaHei"/>
                 <w:b w:val="0"/>
                 <w:sz w:val="13"/>
                 <w:color w:val="1A1A1A"/>
@@ -2850,7 +2850,7 @@
             </w:pPr>
             <w:r>
               <w:rPr>
-                <w:rFonts w:ascii="Arial" w:hAnsi="Arial" w:cs="Arial" w:eastAsia="Microsoft YaHei"/>
+                <w:rFonts w:ascii="Calibri" w:hAnsi="Calibri" w:cs="Calibri" w:eastAsia="Microsoft YaHei"/>
                 <w:b w:val="0"/>
                 <w:sz w:val="13"/>
                 <w:color w:val="1A1A1A"/>
@@ -2886,7 +2886,7 @@
             </w:pPr>
             <w:r>
               <w:rPr>
-                <w:rFonts w:ascii="Arial" w:hAnsi="Arial" w:cs="Arial" w:eastAsia="Microsoft YaHei"/>
+                <w:rFonts w:ascii="Calibri" w:hAnsi="Calibri" w:cs="Calibri" w:eastAsia="Microsoft YaHei"/>
                 <w:b w:val="0"/>
                 <w:sz w:val="13"/>
                 <w:color w:val="1A1A1A"/>
@@ -2927,7 +2927,7 @@
             </w:pPr>
             <w:r>
               <w:rPr>
-                <w:rFonts w:ascii="Arial" w:hAnsi="Arial" w:cs="Arial" w:eastAsia="Microsoft YaHei"/>
+                <w:rFonts w:ascii="Calibri" w:hAnsi="Calibri" w:cs="Calibri" w:eastAsia="Microsoft YaHei"/>
                 <w:b w:val="0"/>
                 <w:sz w:val="13"/>
                 <w:color w:val="1A1A1A"/>
@@ -2963,7 +2963,7 @@
             </w:pPr>
             <w:r>
               <w:rPr>
-                <w:rFonts w:ascii="Arial" w:hAnsi="Arial" w:cs="Arial" w:eastAsia="Microsoft YaHei"/>
+                <w:rFonts w:ascii="Calibri" w:hAnsi="Calibri" w:cs="Calibri" w:eastAsia="Microsoft YaHei"/>
                 <w:b w:val="0"/>
                 <w:sz w:val="13"/>
                 <w:color w:val="1A1A1A"/>
@@ -2999,7 +2999,7 @@
             </w:pPr>
             <w:r>
               <w:rPr>
-                <w:rFonts w:ascii="Arial" w:hAnsi="Arial" w:cs="Arial" w:eastAsia="Microsoft YaHei"/>
+                <w:rFonts w:ascii="Calibri" w:hAnsi="Calibri" w:cs="Calibri" w:eastAsia="Microsoft YaHei"/>
                 <w:b w:val="0"/>
                 <w:sz w:val="13"/>
                 <w:color w:val="1A1A1A"/>
@@ -3035,7 +3035,7 @@
             </w:pPr>
             <w:r>
               <w:rPr>
-                <w:rFonts w:ascii="Arial" w:hAnsi="Arial" w:cs="Arial" w:eastAsia="Microsoft YaHei"/>
+                <w:rFonts w:ascii="Calibri" w:hAnsi="Calibri" w:cs="Calibri" w:eastAsia="Microsoft YaHei"/>
                 <w:b w:val="0"/>
                 <w:sz w:val="13"/>
                 <w:color w:val="1A1A1A"/>
@@ -3076,7 +3076,7 @@
             </w:pPr>
             <w:r>
               <w:rPr>
-                <w:rFonts w:ascii="Arial" w:hAnsi="Arial" w:cs="Arial" w:eastAsia="Microsoft YaHei"/>
+                <w:rFonts w:ascii="Calibri" w:hAnsi="Calibri" w:cs="Calibri" w:eastAsia="Microsoft YaHei"/>
                 <w:b w:val="0"/>
                 <w:sz w:val="13"/>
                 <w:color w:val="1A1A1A"/>
@@ -3112,7 +3112,7 @@
             </w:pPr>
             <w:r>
               <w:rPr>
-                <w:rFonts w:ascii="Arial" w:hAnsi="Arial" w:cs="Arial" w:eastAsia="Microsoft YaHei"/>
+                <w:rFonts w:ascii="Calibri" w:hAnsi="Calibri" w:cs="Calibri" w:eastAsia="Microsoft YaHei"/>
                 <w:b w:val="0"/>
                 <w:sz w:val="13"/>
                 <w:color w:val="1A1A1A"/>
@@ -3148,7 +3148,7 @@
             </w:pPr>
             <w:r>
               <w:rPr>
-                <w:rFonts w:ascii="Arial" w:hAnsi="Arial" w:cs="Arial" w:eastAsia="Microsoft YaHei"/>
+                <w:rFonts w:ascii="Calibri" w:hAnsi="Calibri" w:cs="Calibri" w:eastAsia="Microsoft YaHei"/>
                 <w:b w:val="0"/>
                 <w:sz w:val="13"/>
                 <w:color w:val="1A1A1A"/>
@@ -3183,7 +3183,7 @@
             </w:pPr>
             <w:r>
               <w:rPr>
-                <w:rFonts w:ascii="Arial" w:hAnsi="Arial" w:cs="Arial" w:eastAsia="Microsoft YaHei"/>
+                <w:rFonts w:ascii="Calibri" w:hAnsi="Calibri" w:cs="Calibri" w:eastAsia="Microsoft YaHei"/>
                 <w:b w:val="0"/>
                 <w:sz w:val="13"/>
                 <w:color w:val="1A1A1A"/>
@@ -3217,7 +3217,7 @@
       </w:pPr>
       <w:r>
         <w:rPr>
-          <w:rFonts w:ascii="Arial Black" w:hAnsi="Arial Black" w:cs="Arial Black" w:eastAsia="Microsoft YaHei"/>
+          <w:rFonts w:ascii="Calibri" w:hAnsi="Calibri" w:cs="Calibri" w:eastAsia="Microsoft YaHei"/>
           <w:b/>
           <w:sz w:val="13"/>
           <w:color w:val="000000"/>
@@ -3246,7 +3246,7 @@
       </w:pPr>
       <w:r>
         <w:rPr>
-          <w:rFonts w:ascii="Arial Black" w:hAnsi="Arial Black" w:cs="Arial Black" w:eastAsia="Microsoft YaHei"/>
+          <w:rFonts w:ascii="Calibri" w:hAnsi="Calibri" w:cs="Calibri" w:eastAsia="Microsoft YaHei"/>
           <w:b/>
           <w:sz w:val="27"/>
           <w:color w:val="E63846"/>
@@ -3256,7 +3256,7 @@
       </w:r>
       <w:r>
         <w:rPr>
-          <w:rFonts w:ascii="Arial Black" w:hAnsi="Arial Black" w:cs="Arial Black" w:eastAsia="Microsoft YaHei"/>
+          <w:rFonts w:ascii="Calibri" w:hAnsi="Calibri" w:cs="Calibri" w:eastAsia="Microsoft YaHei"/>
           <w:b/>
           <w:sz w:val="22"/>
           <w:color w:val="000000"/>
@@ -3394,7 +3394,7 @@
             </w:pPr>
             <w:r>
               <w:rPr>
-                <w:rFonts w:ascii="Arial Black" w:hAnsi="Arial Black" w:cs="Arial Black" w:eastAsia="Microsoft YaHei"/>
+                <w:rFonts w:ascii="Calibri" w:hAnsi="Calibri" w:cs="Calibri" w:eastAsia="Microsoft YaHei"/>
                 <w:b/>
                 <w:sz w:val="12"/>
                 <w:color w:val="FFFFFF"/>
@@ -3431,7 +3431,7 @@
             </w:pPr>
             <w:r>
               <w:rPr>
-                <w:rFonts w:ascii="Arial Black" w:hAnsi="Arial Black" w:cs="Arial Black" w:eastAsia="Microsoft YaHei"/>
+                <w:rFonts w:ascii="Calibri" w:hAnsi="Calibri" w:cs="Calibri" w:eastAsia="Microsoft YaHei"/>
                 <w:b/>
                 <w:sz w:val="12"/>
                 <w:color w:val="FFFFFF"/>
@@ -3472,7 +3472,7 @@
             </w:pPr>
             <w:r>
               <w:rPr>
-                <w:rFonts w:ascii="Arial" w:hAnsi="Arial" w:cs="Arial" w:eastAsia="Microsoft YaHei"/>
+                <w:rFonts w:ascii="Calibri" w:hAnsi="Calibri" w:cs="Calibri" w:eastAsia="Microsoft YaHei"/>
                 <w:b w:val="0"/>
                 <w:sz w:val="13"/>
                 <w:color w:val="1A1A1A"/>
@@ -3512,7 +3512,7 @@
             </w:pPr>
             <w:r>
               <w:rPr>
-                <w:rFonts w:ascii="Arial" w:hAnsi="Arial" w:cs="Arial" w:eastAsia="Microsoft YaHei"/>
+                <w:rFonts w:ascii="Calibri" w:hAnsi="Calibri" w:cs="Calibri" w:eastAsia="Microsoft YaHei"/>
                 <w:b w:val="0"/>
                 <w:sz w:val="13"/>
                 <w:color w:val="1A1A1A"/>
@@ -3553,7 +3553,7 @@
             </w:pPr>
             <w:r>
               <w:rPr>
-                <w:rFonts w:ascii="Arial" w:hAnsi="Arial" w:cs="Arial" w:eastAsia="Microsoft YaHei"/>
+                <w:rFonts w:ascii="Calibri" w:hAnsi="Calibri" w:cs="Calibri" w:eastAsia="Microsoft YaHei"/>
                 <w:b w:val="0"/>
                 <w:sz w:val="13"/>
                 <w:color w:val="1A1A1A"/>
@@ -3593,7 +3593,7 @@
             </w:pPr>
             <w:r>
               <w:rPr>
-                <w:rFonts w:ascii="Arial" w:hAnsi="Arial" w:cs="Arial" w:eastAsia="Microsoft YaHei"/>
+                <w:rFonts w:ascii="Calibri" w:hAnsi="Calibri" w:cs="Calibri" w:eastAsia="Microsoft YaHei"/>
                 <w:b w:val="0"/>
                 <w:sz w:val="13"/>
                 <w:color w:val="1A1A1A"/>
@@ -3636,7 +3636,7 @@
             </w:pPr>
             <w:r>
               <w:rPr>
-                <w:rFonts w:ascii="Arial" w:hAnsi="Arial" w:cs="Arial" w:eastAsia="Microsoft YaHei"/>
+                <w:rFonts w:ascii="Calibri" w:hAnsi="Calibri" w:cs="Calibri" w:eastAsia="Microsoft YaHei"/>
                 <w:b w:val="0"/>
                 <w:sz w:val="13"/>
                 <w:color w:val="1A1A1A"/>
@@ -3676,7 +3676,7 @@
             </w:pPr>
             <w:r>
               <w:rPr>
-                <w:rFonts w:ascii="Arial" w:hAnsi="Arial" w:cs="Arial" w:eastAsia="Microsoft YaHei"/>
+                <w:rFonts w:ascii="Calibri" w:hAnsi="Calibri" w:cs="Calibri" w:eastAsia="Microsoft YaHei"/>
                 <w:b w:val="0"/>
                 <w:sz w:val="13"/>
                 <w:color w:val="1A1A1A"/>
@@ -3717,7 +3717,7 @@
             </w:pPr>
             <w:r>
               <w:rPr>
-                <w:rFonts w:ascii="Arial" w:hAnsi="Arial" w:cs="Arial" w:eastAsia="Microsoft YaHei"/>
+                <w:rFonts w:ascii="Calibri" w:hAnsi="Calibri" w:cs="Calibri" w:eastAsia="Microsoft YaHei"/>
                 <w:b w:val="0"/>
                 <w:sz w:val="13"/>
                 <w:color w:val="1A1A1A"/>
@@ -3757,7 +3757,7 @@
             </w:pPr>
             <w:r>
               <w:rPr>
-                <w:rFonts w:ascii="Arial" w:hAnsi="Arial" w:cs="Arial" w:eastAsia="Microsoft YaHei"/>
+                <w:rFonts w:ascii="Calibri" w:hAnsi="Calibri" w:cs="Calibri" w:eastAsia="Microsoft YaHei"/>
                 <w:b w:val="0"/>
                 <w:sz w:val="13"/>
                 <w:color w:val="1A1A1A"/>
@@ -3800,7 +3800,7 @@
             </w:pPr>
             <w:r>
               <w:rPr>
-                <w:rFonts w:ascii="Arial" w:hAnsi="Arial" w:cs="Arial" w:eastAsia="Microsoft YaHei"/>
+                <w:rFonts w:ascii="Calibri" w:hAnsi="Calibri" w:cs="Calibri" w:eastAsia="Microsoft YaHei"/>
                 <w:b w:val="0"/>
                 <w:sz w:val="13"/>
                 <w:color w:val="1A1A1A"/>
@@ -3840,7 +3840,7 @@
             </w:pPr>
             <w:r>
               <w:rPr>
-                <w:rFonts w:ascii="Arial" w:hAnsi="Arial" w:cs="Arial" w:eastAsia="Microsoft YaHei"/>
+                <w:rFonts w:ascii="Calibri" w:hAnsi="Calibri" w:cs="Calibri" w:eastAsia="Microsoft YaHei"/>
                 <w:b w:val="0"/>
                 <w:sz w:val="13"/>
                 <w:color w:val="1A1A1A"/>
@@ -3877,7 +3877,7 @@
       </w:pPr>
       <w:r>
         <w:rPr>
-          <w:rFonts w:ascii="Arial Black" w:hAnsi="Arial Black" w:cs="Arial Black" w:eastAsia="Microsoft YaHei"/>
+          <w:rFonts w:ascii="Calibri" w:hAnsi="Calibri" w:cs="Calibri" w:eastAsia="Microsoft YaHei"/>
           <w:b/>
           <w:sz w:val="13"/>
           <w:color w:val="000000"/>
@@ -3906,7 +3906,7 @@
       </w:pPr>
       <w:r>
         <w:rPr>
-          <w:rFonts w:ascii="Arial Black" w:hAnsi="Arial Black" w:cs="Arial Black" w:eastAsia="Microsoft YaHei"/>
+          <w:rFonts w:ascii="Calibri" w:hAnsi="Calibri" w:cs="Calibri" w:eastAsia="Microsoft YaHei"/>
           <w:b/>
           <w:sz w:val="27"/>
           <w:color w:val="E63846"/>
@@ -3916,7 +3916,7 @@
       </w:r>
       <w:r>
         <w:rPr>
-          <w:rFonts w:ascii="Arial Black" w:hAnsi="Arial Black" w:cs="Arial Black" w:eastAsia="Microsoft YaHei"/>
+          <w:rFonts w:ascii="Calibri" w:hAnsi="Calibri" w:cs="Calibri" w:eastAsia="Microsoft YaHei"/>
           <w:b/>
           <w:sz w:val="22"/>
           <w:color w:val="000000"/>
@@ -3974,7 +3974,7 @@
             </w:pPr>
             <w:r>
               <w:rPr>
-                <w:rFonts w:ascii="Arial Black" w:hAnsi="Arial Black" w:cs="Arial Black" w:eastAsia="Microsoft YaHei"/>
+                <w:rFonts w:ascii="Calibri" w:hAnsi="Calibri" w:cs="Calibri" w:eastAsia="Microsoft YaHei"/>
                 <w:b/>
                 <w:sz w:val="12"/>
                 <w:color w:val="FFFFFF"/>
@@ -4010,7 +4010,7 @@
             </w:pPr>
             <w:r>
               <w:rPr>
-                <w:rFonts w:ascii="Arial Black" w:hAnsi="Arial Black" w:cs="Arial Black" w:eastAsia="Microsoft YaHei"/>
+                <w:rFonts w:ascii="Calibri" w:hAnsi="Calibri" w:cs="Calibri" w:eastAsia="Microsoft YaHei"/>
                 <w:b/>
                 <w:sz w:val="12"/>
                 <w:color w:val="FFFFFF"/>
@@ -4051,7 +4051,7 @@
             </w:pPr>
             <w:r>
               <w:rPr>
-                <w:rFonts w:ascii="Arial" w:hAnsi="Arial" w:cs="Arial" w:eastAsia="Microsoft YaHei"/>
+                <w:rFonts w:ascii="Calibri" w:hAnsi="Calibri" w:cs="Calibri" w:eastAsia="Microsoft YaHei"/>
                 <w:b w:val="0"/>
                 <w:sz w:val="13"/>
                 <w:color w:val="1A1A1A"/>
@@ -4087,7 +4087,7 @@
             </w:pPr>
             <w:r>
               <w:rPr>
-                <w:rFonts w:ascii="Arial" w:hAnsi="Arial" w:cs="Arial" w:eastAsia="Microsoft YaHei"/>
+                <w:rFonts w:ascii="Calibri" w:hAnsi="Calibri" w:cs="Calibri" w:eastAsia="Microsoft YaHei"/>
                 <w:b w:val="0"/>
                 <w:sz w:val="13"/>
                 <w:color w:val="1A1A1A"/>
@@ -4128,7 +4128,7 @@
             </w:pPr>
             <w:r>
               <w:rPr>
-                <w:rFonts w:ascii="Arial" w:hAnsi="Arial" w:cs="Arial" w:eastAsia="Microsoft YaHei"/>
+                <w:rFonts w:ascii="Calibri" w:hAnsi="Calibri" w:cs="Calibri" w:eastAsia="Microsoft YaHei"/>
                 <w:b w:val="0"/>
                 <w:sz w:val="13"/>
                 <w:color w:val="1A1A1A"/>
@@ -4164,7 +4164,7 @@
             </w:pPr>
             <w:r>
               <w:rPr>
-                <w:rFonts w:ascii="Arial" w:hAnsi="Arial" w:cs="Arial" w:eastAsia="Microsoft YaHei"/>
+                <w:rFonts w:ascii="Calibri" w:hAnsi="Calibri" w:cs="Calibri" w:eastAsia="Microsoft YaHei"/>
                 <w:b w:val="0"/>
                 <w:sz w:val="13"/>
                 <w:color w:val="1A1A1A"/>
@@ -4205,7 +4205,7 @@
             </w:pPr>
             <w:r>
               <w:rPr>
-                <w:rFonts w:ascii="Arial" w:hAnsi="Arial" w:cs="Arial" w:eastAsia="Microsoft YaHei"/>
+                <w:rFonts w:ascii="Calibri" w:hAnsi="Calibri" w:cs="Calibri" w:eastAsia="Microsoft YaHei"/>
                 <w:b w:val="0"/>
                 <w:sz w:val="13"/>
                 <w:color w:val="1A1A1A"/>
@@ -4241,7 +4241,7 @@
             </w:pPr>
             <w:r>
               <w:rPr>
-                <w:rFonts w:ascii="Arial" w:hAnsi="Arial" w:cs="Arial" w:eastAsia="Microsoft YaHei"/>
+                <w:rFonts w:ascii="Calibri" w:hAnsi="Calibri" w:cs="Calibri" w:eastAsia="Microsoft YaHei"/>
                 <w:b w:val="0"/>
                 <w:sz w:val="13"/>
                 <w:color w:val="1A1A1A"/>
@@ -4282,7 +4282,7 @@
             </w:pPr>
             <w:r>
               <w:rPr>
-                <w:rFonts w:ascii="Arial" w:hAnsi="Arial" w:cs="Arial" w:eastAsia="Microsoft YaHei"/>
+                <w:rFonts w:ascii="Calibri" w:hAnsi="Calibri" w:cs="Calibri" w:eastAsia="Microsoft YaHei"/>
                 <w:b w:val="0"/>
                 <w:sz w:val="13"/>
                 <w:color w:val="1A1A1A"/>
@@ -4318,7 +4318,7 @@
             </w:pPr>
             <w:r>
               <w:rPr>
-                <w:rFonts w:ascii="Arial" w:hAnsi="Arial" w:cs="Arial" w:eastAsia="Microsoft YaHei"/>
+                <w:rFonts w:ascii="Calibri" w:hAnsi="Calibri" w:cs="Calibri" w:eastAsia="Microsoft YaHei"/>
                 <w:b w:val="0"/>
                 <w:sz w:val="13"/>
                 <w:color w:val="1A1A1A"/>
@@ -4359,7 +4359,7 @@
             </w:pPr>
             <w:r>
               <w:rPr>
-                <w:rFonts w:ascii="Arial" w:hAnsi="Arial" w:cs="Arial" w:eastAsia="Microsoft YaHei"/>
+                <w:rFonts w:ascii="Calibri" w:hAnsi="Calibri" w:cs="Calibri" w:eastAsia="Microsoft YaHei"/>
                 <w:b w:val="0"/>
                 <w:sz w:val="13"/>
                 <w:color w:val="1A1A1A"/>
@@ -4399,7 +4399,7 @@
             </w:pPr>
             <w:r>
               <w:rPr>
-                <w:rFonts w:ascii="Arial" w:hAnsi="Arial" w:cs="Arial" w:eastAsia="Microsoft YaHei"/>
+                <w:rFonts w:ascii="Calibri" w:hAnsi="Calibri" w:cs="Calibri" w:eastAsia="Microsoft YaHei"/>
                 <w:b w:val="0"/>
                 <w:sz w:val="13"/>
                 <w:color w:val="1A1A1A"/>
@@ -4440,7 +4440,7 @@
             </w:pPr>
             <w:r>
               <w:rPr>
-                <w:rFonts w:ascii="Arial" w:hAnsi="Arial" w:cs="Arial" w:eastAsia="Microsoft YaHei"/>
+                <w:rFonts w:ascii="Calibri" w:hAnsi="Calibri" w:cs="Calibri" w:eastAsia="Microsoft YaHei"/>
                 <w:b w:val="0"/>
                 <w:sz w:val="13"/>
                 <w:color w:val="1A1A1A"/>
@@ -4476,7 +4476,7 @@
             </w:pPr>
             <w:r>
               <w:rPr>
-                <w:rFonts w:ascii="Arial" w:hAnsi="Arial" w:cs="Arial" w:eastAsia="Microsoft YaHei"/>
+                <w:rFonts w:ascii="Calibri" w:hAnsi="Calibri" w:cs="Calibri" w:eastAsia="Microsoft YaHei"/>
                 <w:b w:val="0"/>
                 <w:sz w:val="13"/>
                 <w:color w:val="1A1A1A"/>
@@ -4517,7 +4517,7 @@
             </w:pPr>
             <w:r>
               <w:rPr>
-                <w:rFonts w:ascii="Arial" w:hAnsi="Arial" w:cs="Arial" w:eastAsia="Microsoft YaHei"/>
+                <w:rFonts w:ascii="Calibri" w:hAnsi="Calibri" w:cs="Calibri" w:eastAsia="Microsoft YaHei"/>
                 <w:b w:val="0"/>
                 <w:sz w:val="13"/>
                 <w:color w:val="1A1A1A"/>
@@ -4554,7 +4554,7 @@
             </w:pPr>
             <w:r>
               <w:rPr>
-                <w:rFonts w:ascii="Arial" w:hAnsi="Arial" w:cs="Arial" w:eastAsia="Microsoft YaHei"/>
+                <w:rFonts w:ascii="Calibri" w:hAnsi="Calibri" w:cs="Calibri" w:eastAsia="Microsoft YaHei"/>
                 <w:b w:val="0"/>
                 <w:sz w:val="13"/>
                 <w:color w:val="1A1A1A"/>
@@ -4595,7 +4595,7 @@
             </w:pPr>
             <w:r>
               <w:rPr>
-                <w:rFonts w:ascii="Arial" w:hAnsi="Arial" w:cs="Arial" w:eastAsia="Microsoft YaHei"/>
+                <w:rFonts w:ascii="Calibri" w:hAnsi="Calibri" w:cs="Calibri" w:eastAsia="Microsoft YaHei"/>
                 <w:b w:val="0"/>
                 <w:sz w:val="13"/>
                 <w:color w:val="1A1A1A"/>
@@ -4631,7 +4631,7 @@
             </w:pPr>
             <w:r>
               <w:rPr>
-                <w:rFonts w:ascii="Arial" w:hAnsi="Arial" w:cs="Arial" w:eastAsia="Microsoft YaHei"/>
+                <w:rFonts w:ascii="Calibri" w:hAnsi="Calibri" w:cs="Calibri" w:eastAsia="Microsoft YaHei"/>
                 <w:b w:val="0"/>
                 <w:sz w:val="13"/>
                 <w:color w:val="1A1A1A"/>
@@ -4672,7 +4672,7 @@
             </w:pPr>
             <w:r>
               <w:rPr>
-                <w:rFonts w:ascii="Arial" w:hAnsi="Arial" w:cs="Arial" w:eastAsia="Microsoft YaHei"/>
+                <w:rFonts w:ascii="Calibri" w:hAnsi="Calibri" w:cs="Calibri" w:eastAsia="Microsoft YaHei"/>
                 <w:b w:val="0"/>
                 <w:sz w:val="13"/>
                 <w:color w:val="1A1A1A"/>
@@ -4709,7 +4709,7 @@
             </w:pPr>
             <w:r>
               <w:rPr>
-                <w:rFonts w:ascii="Arial" w:hAnsi="Arial" w:cs="Arial" w:eastAsia="Microsoft YaHei"/>
+                <w:rFonts w:ascii="Calibri" w:hAnsi="Calibri" w:cs="Calibri" w:eastAsia="Microsoft YaHei"/>
                 <w:b w:val="0"/>
                 <w:sz w:val="13"/>
                 <w:color w:val="1A1A1A"/>
@@ -4750,7 +4750,7 @@
             </w:pPr>
             <w:r>
               <w:rPr>
-                <w:rFonts w:ascii="Arial" w:hAnsi="Arial" w:cs="Arial" w:eastAsia="Microsoft YaHei"/>
+                <w:rFonts w:ascii="Calibri" w:hAnsi="Calibri" w:cs="Calibri" w:eastAsia="Microsoft YaHei"/>
                 <w:b w:val="0"/>
                 <w:sz w:val="13"/>
                 <w:color w:val="1A1A1A"/>
@@ -4787,7 +4787,7 @@
             </w:pPr>
             <w:r>
               <w:rPr>
-                <w:rFonts w:ascii="Arial" w:hAnsi="Arial" w:cs="Arial" w:eastAsia="Microsoft YaHei"/>
+                <w:rFonts w:ascii="Calibri" w:hAnsi="Calibri" w:cs="Calibri" w:eastAsia="Microsoft YaHei"/>
                 <w:b w:val="0"/>
                 <w:sz w:val="13"/>
                 <w:color w:val="1A1A1A"/>
@@ -4828,7 +4828,7 @@
             </w:pPr>
             <w:r>
               <w:rPr>
-                <w:rFonts w:ascii="Arial" w:hAnsi="Arial" w:cs="Arial" w:eastAsia="Microsoft YaHei"/>
+                <w:rFonts w:ascii="Calibri" w:hAnsi="Calibri" w:cs="Calibri" w:eastAsia="Microsoft YaHei"/>
                 <w:b w:val="0"/>
                 <w:sz w:val="13"/>
                 <w:color w:val="1A1A1A"/>
@@ -4865,7 +4865,7 @@
             </w:pPr>
             <w:r>
               <w:rPr>
-                <w:rFonts w:ascii="Arial" w:hAnsi="Arial" w:cs="Arial" w:eastAsia="Microsoft YaHei"/>
+                <w:rFonts w:ascii="Calibri" w:hAnsi="Calibri" w:cs="Calibri" w:eastAsia="Microsoft YaHei"/>
                 <w:b w:val="0"/>
                 <w:sz w:val="13"/>
                 <w:color w:val="1A1A1A"/>
@@ -4906,7 +4906,7 @@
             </w:pPr>
             <w:r>
               <w:rPr>
-                <w:rFonts w:ascii="Arial" w:hAnsi="Arial" w:cs="Arial" w:eastAsia="Microsoft YaHei"/>
+                <w:rFonts w:ascii="Calibri" w:hAnsi="Calibri" w:cs="Calibri" w:eastAsia="Microsoft YaHei"/>
                 <w:b w:val="0"/>
                 <w:sz w:val="13"/>
                 <w:color w:val="1A1A1A"/>
@@ -4942,7 +4942,7 @@
             </w:pPr>
             <w:r>
               <w:rPr>
-                <w:rFonts w:ascii="Arial" w:hAnsi="Arial" w:cs="Arial" w:eastAsia="Microsoft YaHei"/>
+                <w:rFonts w:ascii="Calibri" w:hAnsi="Calibri" w:cs="Calibri" w:eastAsia="Microsoft YaHei"/>
                 <w:b w:val="0"/>
                 <w:sz w:val="13"/>
                 <w:color w:val="1A1A1A"/>
@@ -4983,7 +4983,7 @@
             </w:pPr>
             <w:r>
               <w:rPr>
-                <w:rFonts w:ascii="Arial" w:hAnsi="Arial" w:cs="Arial" w:eastAsia="Microsoft YaHei"/>
+                <w:rFonts w:ascii="Calibri" w:hAnsi="Calibri" w:cs="Calibri" w:eastAsia="Microsoft YaHei"/>
                 <w:b w:val="0"/>
                 <w:sz w:val="13"/>
                 <w:color w:val="1A1A1A"/>
@@ -5019,7 +5019,7 @@
             </w:pPr>
             <w:r>
               <w:rPr>
-                <w:rFonts w:ascii="Arial" w:hAnsi="Arial" w:cs="Arial" w:eastAsia="Microsoft YaHei"/>
+                <w:rFonts w:ascii="Calibri" w:hAnsi="Calibri" w:cs="Calibri" w:eastAsia="Microsoft YaHei"/>
                 <w:b w:val="0"/>
                 <w:sz w:val="13"/>
                 <w:color w:val="1A1A1A"/>
@@ -5060,7 +5060,7 @@
             </w:pPr>
             <w:r>
               <w:rPr>
-                <w:rFonts w:ascii="Arial" w:hAnsi="Arial" w:cs="Arial" w:eastAsia="Microsoft YaHei"/>
+                <w:rFonts w:ascii="Calibri" w:hAnsi="Calibri" w:cs="Calibri" w:eastAsia="Microsoft YaHei"/>
                 <w:b w:val="0"/>
                 <w:sz w:val="13"/>
                 <w:color w:val="1A1A1A"/>
@@ -5096,7 +5096,7 @@
             </w:pPr>
             <w:r>
               <w:rPr>
-                <w:rFonts w:ascii="Arial" w:hAnsi="Arial" w:cs="Arial" w:eastAsia="Microsoft YaHei"/>
+                <w:rFonts w:ascii="Calibri" w:hAnsi="Calibri" w:cs="Calibri" w:eastAsia="Microsoft YaHei"/>
                 <w:b w:val="0"/>
                 <w:sz w:val="13"/>
                 <w:color w:val="1A1A1A"/>
@@ -5137,7 +5137,7 @@
             </w:pPr>
             <w:r>
               <w:rPr>
-                <w:rFonts w:ascii="Arial" w:hAnsi="Arial" w:cs="Arial" w:eastAsia="Microsoft YaHei"/>
+                <w:rFonts w:ascii="Calibri" w:hAnsi="Calibri" w:cs="Calibri" w:eastAsia="Microsoft YaHei"/>
                 <w:b w:val="0"/>
                 <w:sz w:val="13"/>
                 <w:color w:val="1A1A1A"/>
@@ -5173,7 +5173,7 @@
             </w:pPr>
             <w:r>
               <w:rPr>
-                <w:rFonts w:ascii="Arial" w:hAnsi="Arial" w:cs="Arial" w:eastAsia="Microsoft YaHei"/>
+                <w:rFonts w:ascii="Calibri" w:hAnsi="Calibri" w:cs="Calibri" w:eastAsia="Microsoft YaHei"/>
                 <w:b w:val="0"/>
                 <w:sz w:val="13"/>
                 <w:color w:val="1A1A1A"/>
@@ -5214,7 +5214,7 @@
             </w:pPr>
             <w:r>
               <w:rPr>
-                <w:rFonts w:ascii="Arial" w:hAnsi="Arial" w:cs="Arial" w:eastAsia="Microsoft YaHei"/>
+                <w:rFonts w:ascii="Calibri" w:hAnsi="Calibri" w:cs="Calibri" w:eastAsia="Microsoft YaHei"/>
                 <w:b w:val="0"/>
                 <w:sz w:val="13"/>
                 <w:color w:val="1A1A1A"/>
@@ -5250,7 +5250,7 @@
             </w:pPr>
             <w:r>
               <w:rPr>
-                <w:rFonts w:ascii="Arial" w:hAnsi="Arial" w:cs="Arial" w:eastAsia="Microsoft YaHei"/>
+                <w:rFonts w:ascii="Calibri" w:hAnsi="Calibri" w:cs="Calibri" w:eastAsia="Microsoft YaHei"/>
                 <w:b w:val="0"/>
                 <w:sz w:val="13"/>
                 <w:color w:val="1A1A1A"/>
@@ -5291,7 +5291,7 @@
             </w:pPr>
             <w:r>
               <w:rPr>
-                <w:rFonts w:ascii="Arial" w:hAnsi="Arial" w:cs="Arial" w:eastAsia="Microsoft YaHei"/>
+                <w:rFonts w:ascii="Calibri" w:hAnsi="Calibri" w:cs="Calibri" w:eastAsia="Microsoft YaHei"/>
                 <w:b w:val="0"/>
                 <w:sz w:val="13"/>
                 <w:color w:val="1A1A1A"/>
@@ -5327,7 +5327,7 @@
             </w:pPr>
             <w:r>
               <w:rPr>
-                <w:rFonts w:ascii="Arial" w:hAnsi="Arial" w:cs="Arial" w:eastAsia="Microsoft YaHei"/>
+                <w:rFonts w:ascii="Calibri" w:hAnsi="Calibri" w:cs="Calibri" w:eastAsia="Microsoft YaHei"/>
                 <w:b w:val="0"/>
                 <w:sz w:val="13"/>
                 <w:color w:val="1A1A1A"/>
@@ -5362,7 +5362,7 @@
       </w:pPr>
       <w:r>
         <w:rPr>
-          <w:rFonts w:ascii="Arial Black" w:hAnsi="Arial Black" w:cs="Arial Black" w:eastAsia="Microsoft YaHei"/>
+          <w:rFonts w:ascii="Calibri" w:hAnsi="Calibri" w:cs="Calibri" w:eastAsia="Microsoft YaHei"/>
           <w:b/>
           <w:sz w:val="13"/>
           <w:color w:val="000000"/>
@@ -5391,7 +5391,7 @@
       </w:pPr>
       <w:r>
         <w:rPr>
-          <w:rFonts w:ascii="Arial Black" w:hAnsi="Arial Black" w:cs="Arial Black" w:eastAsia="Microsoft YaHei"/>
+          <w:rFonts w:ascii="Calibri" w:hAnsi="Calibri" w:cs="Calibri" w:eastAsia="Microsoft YaHei"/>
           <w:b/>
           <w:sz w:val="27"/>
           <w:color w:val="E63846"/>
@@ -5401,7 +5401,7 @@
       </w:r>
       <w:r>
         <w:rPr>
-          <w:rFonts w:ascii="Arial Black" w:hAnsi="Arial Black" w:cs="Arial Black" w:eastAsia="Microsoft YaHei"/>
+          <w:rFonts w:ascii="Calibri" w:hAnsi="Calibri" w:cs="Calibri" w:eastAsia="Microsoft YaHei"/>
           <w:b/>
           <w:sz w:val="22"/>
           <w:color w:val="000000"/>
@@ -5419,7 +5419,7 @@
       </w:pPr>
       <w:r>
         <w:rPr>
-          <w:rFonts w:ascii="Arial Black" w:hAnsi="Arial Black" w:cs="Arial Black" w:eastAsia="Microsoft YaHei"/>
+          <w:rFonts w:ascii="Calibri" w:hAnsi="Calibri" w:cs="Calibri" w:eastAsia="Microsoft YaHei"/>
           <w:b/>
           <w:sz w:val="15"/>
           <w:color w:val="000000"/>
@@ -5431,11 +5431,11 @@
     <w:p>
       <w:pPr>
         <w:spacing w:before="0" w:after="32" w:line="244" w:lineRule="auto"/>
-        <w:ind w:left="181" w:hanging="181"/>
+        <w:ind w:left="240" w:hanging="240"/>
       </w:pPr>
       <w:r>
         <w:rPr>
-          <w:rFonts w:ascii="Arial Black" w:hAnsi="Arial Black" w:cs="Arial Black" w:eastAsia="Microsoft YaHei"/>
+          <w:rFonts w:ascii="Calibri" w:hAnsi="Calibri" w:cs="Calibri" w:eastAsia="Microsoft YaHei"/>
           <w:b/>
           <w:sz w:val="11"/>
           <w:color w:val="E63846"/>
@@ -5445,7 +5445,7 @@
       </w:r>
       <w:r>
         <w:rPr>
-          <w:rFonts w:ascii="Arial" w:hAnsi="Arial" w:cs="Arial" w:eastAsia="Microsoft YaHei"/>
+          <w:rFonts w:ascii="Calibri" w:hAnsi="Calibri" w:cs="Calibri" w:eastAsia="Microsoft YaHei"/>
           <w:b w:val="0"/>
           <w:sz w:val="14"/>
           <w:color w:val="000000"/>
@@ -5461,11 +5461,11 @@
     <w:p>
       <w:pPr>
         <w:spacing w:before="0" w:after="32" w:line="244" w:lineRule="auto"/>
-        <w:ind w:left="181" w:hanging="181"/>
+        <w:ind w:left="240" w:hanging="240"/>
       </w:pPr>
       <w:r>
         <w:rPr>
-          <w:rFonts w:ascii="Arial Black" w:hAnsi="Arial Black" w:cs="Arial Black" w:eastAsia="Microsoft YaHei"/>
+          <w:rFonts w:ascii="Calibri" w:hAnsi="Calibri" w:cs="Calibri" w:eastAsia="Microsoft YaHei"/>
           <w:b/>
           <w:sz w:val="11"/>
           <w:color w:val="E63846"/>
@@ -5475,7 +5475,7 @@
       </w:r>
       <w:r>
         <w:rPr>
-          <w:rFonts w:ascii="Arial" w:hAnsi="Arial" w:cs="Arial" w:eastAsia="Microsoft YaHei"/>
+          <w:rFonts w:ascii="Calibri" w:hAnsi="Calibri" w:cs="Calibri" w:eastAsia="Microsoft YaHei"/>
           <w:b w:val="0"/>
           <w:sz w:val="14"/>
           <w:color w:val="000000"/>
@@ -5495,7 +5495,7 @@
       </w:pPr>
       <w:r>
         <w:rPr>
-          <w:rFonts w:ascii="Arial Black" w:hAnsi="Arial Black" w:cs="Arial Black" w:eastAsia="Microsoft YaHei"/>
+          <w:rFonts w:ascii="Calibri" w:hAnsi="Calibri" w:cs="Calibri" w:eastAsia="Microsoft YaHei"/>
           <w:b/>
           <w:sz w:val="15"/>
           <w:color w:val="000000"/>
@@ -5507,11 +5507,11 @@
     <w:p>
       <w:pPr>
         <w:spacing w:before="0" w:after="32" w:line="244" w:lineRule="auto"/>
-        <w:ind w:left="181" w:hanging="181"/>
+        <w:ind w:left="240" w:hanging="240"/>
       </w:pPr>
       <w:r>
         <w:rPr>
-          <w:rFonts w:ascii="Arial Black" w:hAnsi="Arial Black" w:cs="Arial Black" w:eastAsia="Microsoft YaHei"/>
+          <w:rFonts w:ascii="Calibri" w:hAnsi="Calibri" w:cs="Calibri" w:eastAsia="Microsoft YaHei"/>
           <w:b/>
           <w:sz w:val="11"/>
           <w:color w:val="E63846"/>
@@ -5521,7 +5521,7 @@
       </w:r>
       <w:r>
         <w:rPr>
-          <w:rFonts w:ascii="Arial" w:hAnsi="Arial" w:cs="Arial" w:eastAsia="Microsoft YaHei"/>
+          <w:rFonts w:ascii="Calibri" w:hAnsi="Calibri" w:cs="Calibri" w:eastAsia="Microsoft YaHei"/>
           <w:b w:val="0"/>
           <w:sz w:val="14"/>
           <w:color w:val="000000"/>
@@ -5537,11 +5537,11 @@
     <w:p>
       <w:pPr>
         <w:spacing w:before="0" w:after="32" w:line="244" w:lineRule="auto"/>
-        <w:ind w:left="181" w:hanging="181"/>
+        <w:ind w:left="240" w:hanging="240"/>
       </w:pPr>
       <w:r>
         <w:rPr>
-          <w:rFonts w:ascii="Arial Black" w:hAnsi="Arial Black" w:cs="Arial Black" w:eastAsia="Microsoft YaHei"/>
+          <w:rFonts w:ascii="Calibri" w:hAnsi="Calibri" w:cs="Calibri" w:eastAsia="Microsoft YaHei"/>
           <w:b/>
           <w:sz w:val="11"/>
           <w:color w:val="E63846"/>
@@ -5551,7 +5551,7 @@
       </w:r>
       <w:r>
         <w:rPr>
-          <w:rFonts w:ascii="Arial" w:hAnsi="Arial" w:cs="Arial" w:eastAsia="Microsoft YaHei"/>
+          <w:rFonts w:ascii="Calibri" w:hAnsi="Calibri" w:cs="Calibri" w:eastAsia="Microsoft YaHei"/>
           <w:b w:val="0"/>
           <w:sz w:val="14"/>
           <w:color w:val="000000"/>
@@ -5561,7 +5561,7 @@
       </w:r>
       <w:r>
         <w:rPr>
-          <w:rFonts w:ascii="Arial Black" w:hAnsi="Arial Black" w:cs="Arial Black" w:eastAsia="Microsoft YaHei"/>
+          <w:rFonts w:ascii="Calibri" w:hAnsi="Calibri" w:cs="Calibri" w:eastAsia="Microsoft YaHei"/>
           <w:b/>
           <w:sz w:val="14"/>
           <w:color w:val="000000"/>
@@ -5571,7 +5571,7 @@
       </w:r>
       <w:r>
         <w:rPr>
-          <w:rFonts w:ascii="Arial" w:hAnsi="Arial" w:cs="Arial" w:eastAsia="Microsoft YaHei"/>
+          <w:rFonts w:ascii="Calibri" w:hAnsi="Calibri" w:cs="Calibri" w:eastAsia="Microsoft YaHei"/>
           <w:b w:val="0"/>
           <w:sz w:val="14"/>
           <w:color w:val="000000"/>
@@ -5589,7 +5589,7 @@
       </w:pPr>
       <w:r>
         <w:rPr>
-          <w:rFonts w:ascii="Arial Black" w:hAnsi="Arial Black" w:cs="Arial Black" w:eastAsia="Microsoft YaHei"/>
+          <w:rFonts w:ascii="Calibri" w:hAnsi="Calibri" w:cs="Calibri" w:eastAsia="Microsoft YaHei"/>
           <w:b/>
           <w:sz w:val="15"/>
           <w:color w:val="000000"/>
@@ -5604,7 +5604,7 @@
       </w:pPr>
       <w:r>
         <w:rPr>
-          <w:rFonts w:ascii="Arial Black" w:hAnsi="Arial Black" w:cs="Arial Black" w:eastAsia="Microsoft YaHei"/>
+          <w:rFonts w:ascii="Calibri" w:hAnsi="Calibri" w:cs="Calibri" w:eastAsia="Microsoft YaHei"/>
           <w:b/>
           <w:sz w:val="14"/>
           <w:color w:val="FFFFFF"/>
@@ -5615,7 +5615,7 @@
       </w:r>
       <w:r>
         <w:rPr>
-          <w:rFonts w:ascii="Arial" w:hAnsi="Arial" w:cs="Arial" w:eastAsia="Microsoft YaHei"/>
+          <w:rFonts w:ascii="Calibri" w:hAnsi="Calibri" w:cs="Calibri" w:eastAsia="Microsoft YaHei"/>
           <w:b w:val="0"/>
           <w:sz w:val="14"/>
           <w:color w:val="000000"/>
@@ -5630,7 +5630,7 @@
       </w:pPr>
       <w:r>
         <w:rPr>
-          <w:rFonts w:ascii="Arial Black" w:hAnsi="Arial Black" w:cs="Arial Black" w:eastAsia="Microsoft YaHei"/>
+          <w:rFonts w:ascii="Calibri" w:hAnsi="Calibri" w:cs="Calibri" w:eastAsia="Microsoft YaHei"/>
           <w:b/>
           <w:sz w:val="14"/>
           <w:color w:val="FFFFFF"/>
@@ -5641,7 +5641,7 @@
       </w:r>
       <w:r>
         <w:rPr>
-          <w:rFonts w:ascii="Arial" w:hAnsi="Arial" w:cs="Arial" w:eastAsia="Microsoft YaHei"/>
+          <w:rFonts w:ascii="Calibri" w:hAnsi="Calibri" w:cs="Calibri" w:eastAsia="Microsoft YaHei"/>
           <w:b w:val="0"/>
           <w:sz w:val="14"/>
           <w:color w:val="000000"/>
@@ -5692,7 +5692,7 @@
       </w:r>
       <w:r>
         <w:rPr>
-          <w:rFonts w:ascii="Arial" w:hAnsi="Arial" w:cs="Arial" w:eastAsia="Microsoft YaHei"/>
+          <w:rFonts w:ascii="Calibri" w:hAnsi="Calibri" w:cs="Calibri" w:eastAsia="Microsoft YaHei"/>
           <w:b w:val="0"/>
           <w:sz w:val="14"/>
           <w:color w:val="000000"/>
@@ -5744,7 +5744,7 @@
       </w:pPr>
       <w:r>
         <w:rPr>
-          <w:rFonts w:ascii="Arial Black" w:hAnsi="Arial Black" w:cs="Arial Black" w:eastAsia="Microsoft YaHei"/>
+          <w:rFonts w:ascii="Calibri" w:hAnsi="Calibri" w:cs="Calibri" w:eastAsia="Microsoft YaHei"/>
           <w:b/>
           <w:sz w:val="14"/>
           <w:color w:val="FFFFFF"/>
@@ -5755,7 +5755,7 @@
       </w:r>
       <w:r>
         <w:rPr>
-          <w:rFonts w:ascii="Arial" w:hAnsi="Arial" w:cs="Arial" w:eastAsia="Microsoft YaHei"/>
+          <w:rFonts w:ascii="Calibri" w:hAnsi="Calibri" w:cs="Calibri" w:eastAsia="Microsoft YaHei"/>
           <w:b w:val="0"/>
           <w:sz w:val="14"/>
           <w:color w:val="000000"/>
@@ -5858,7 +5858,7 @@
       </w:pPr>
       <w:r>
         <w:rPr>
-          <w:rFonts w:ascii="Arial Black" w:hAnsi="Arial Black" w:cs="Arial Black" w:eastAsia="Microsoft YaHei"/>
+          <w:rFonts w:ascii="Calibri" w:hAnsi="Calibri" w:cs="Calibri" w:eastAsia="Microsoft YaHei"/>
           <w:b/>
           <w:sz w:val="13"/>
           <w:color w:val="000000"/>
@@ -5887,7 +5887,7 @@
       </w:pPr>
       <w:r>
         <w:rPr>
-          <w:rFonts w:ascii="Arial Black" w:hAnsi="Arial Black" w:cs="Arial Black" w:eastAsia="Microsoft YaHei"/>
+          <w:rFonts w:ascii="Calibri" w:hAnsi="Calibri" w:cs="Calibri" w:eastAsia="Microsoft YaHei"/>
           <w:b/>
           <w:sz w:val="27"/>
           <w:color w:val="E63846"/>
@@ -5897,7 +5897,7 @@
       </w:r>
       <w:r>
         <w:rPr>
-          <w:rFonts w:ascii="Arial Black" w:hAnsi="Arial Black" w:cs="Arial Black" w:eastAsia="Microsoft YaHei"/>
+          <w:rFonts w:ascii="Calibri" w:hAnsi="Calibri" w:cs="Calibri" w:eastAsia="Microsoft YaHei"/>
           <w:b/>
           <w:sz w:val="22"/>
           <w:color w:val="000000"/>
@@ -5912,7 +5912,7 @@
       </w:pPr>
       <w:r>
         <w:rPr>
-          <w:rFonts w:ascii="Arial Black" w:hAnsi="Arial Black" w:cs="Arial Black" w:eastAsia="Microsoft YaHei"/>
+          <w:rFonts w:ascii="Calibri" w:hAnsi="Calibri" w:cs="Calibri" w:eastAsia="Microsoft YaHei"/>
           <w:b/>
           <w:sz w:val="14"/>
           <w:color w:val="FFFFFF"/>
@@ -5923,7 +5923,7 @@
       </w:r>
       <w:r>
         <w:rPr>
-          <w:rFonts w:ascii="Arial" w:hAnsi="Arial" w:cs="Arial" w:eastAsia="Microsoft YaHei"/>
+          <w:rFonts w:ascii="Calibri" w:hAnsi="Calibri" w:cs="Calibri" w:eastAsia="Microsoft YaHei"/>
           <w:b w:val="0"/>
           <w:sz w:val="14"/>
           <w:color w:val="000000"/>
@@ -6111,7 +6111,7 @@
       </w:pPr>
       <w:r>
         <w:rPr>
-          <w:rFonts w:ascii="Arial Black" w:hAnsi="Arial Black" w:cs="Arial Black" w:eastAsia="Microsoft YaHei"/>
+          <w:rFonts w:ascii="Calibri" w:hAnsi="Calibri" w:cs="Calibri" w:eastAsia="Microsoft YaHei"/>
           <w:b/>
           <w:sz w:val="14"/>
           <w:color w:val="FFFFFF"/>
@@ -6122,7 +6122,7 @@
       </w:r>
       <w:r>
         <w:rPr>
-          <w:rFonts w:ascii="Arial" w:hAnsi="Arial" w:cs="Arial" w:eastAsia="Microsoft YaHei"/>
+          <w:rFonts w:ascii="Calibri" w:hAnsi="Calibri" w:cs="Calibri" w:eastAsia="Microsoft YaHei"/>
           <w:b w:val="0"/>
           <w:sz w:val="14"/>
           <w:color w:val="000000"/>
@@ -6132,7 +6132,7 @@
       </w:r>
       <w:r>
         <w:rPr>
-          <w:rFonts w:ascii="Arial Black" w:hAnsi="Arial Black" w:cs="Arial Black" w:eastAsia="Microsoft YaHei"/>
+          <w:rFonts w:ascii="Calibri" w:hAnsi="Calibri" w:cs="Calibri" w:eastAsia="Microsoft YaHei"/>
           <w:b/>
           <w:sz w:val="14"/>
           <w:color w:val="000000"/>
@@ -6142,7 +6142,7 @@
       </w:r>
       <w:r>
         <w:rPr>
-          <w:rFonts w:ascii="Arial" w:hAnsi="Arial" w:cs="Arial" w:eastAsia="Microsoft YaHei"/>
+          <w:rFonts w:ascii="Calibri" w:hAnsi="Calibri" w:cs="Calibri" w:eastAsia="Microsoft YaHei"/>
           <w:b w:val="0"/>
           <w:sz w:val="14"/>
           <w:color w:val="000000"/>
@@ -6230,7 +6230,7 @@
       </w:pPr>
       <w:r>
         <w:rPr>
-          <w:rFonts w:ascii="Arial Black" w:hAnsi="Arial Black" w:cs="Arial Black" w:eastAsia="Microsoft YaHei"/>
+          <w:rFonts w:ascii="Calibri" w:hAnsi="Calibri" w:cs="Calibri" w:eastAsia="Microsoft YaHei"/>
           <w:b/>
           <w:sz w:val="14"/>
           <w:color w:val="FFFFFF"/>
@@ -6241,7 +6241,7 @@
       </w:r>
       <w:r>
         <w:rPr>
-          <w:rFonts w:ascii="Arial" w:hAnsi="Arial" w:cs="Arial" w:eastAsia="Microsoft YaHei"/>
+          <w:rFonts w:ascii="Calibri" w:hAnsi="Calibri" w:cs="Calibri" w:eastAsia="Microsoft YaHei"/>
           <w:b w:val="0"/>
           <w:sz w:val="14"/>
           <w:color w:val="000000"/>
@@ -6257,7 +6257,7 @@
       </w:pPr>
       <w:r>
         <w:rPr>
-          <w:rFonts w:ascii="Arial" w:hAnsi="Arial" w:cs="Arial" w:eastAsia="Microsoft YaHei"/>
+          <w:rFonts w:ascii="Calibri" w:hAnsi="Calibri" w:cs="Calibri" w:eastAsia="Microsoft YaHei"/>
           <w:b w:val="0"/>
           <w:sz w:val="12"/>
           <w:color w:val="000000"/>
@@ -6302,7 +6302,7 @@
       </w:r>
       <w:r>
         <w:rPr>
-          <w:rFonts w:ascii="Arial" w:hAnsi="Arial" w:cs="Arial" w:eastAsia="Microsoft YaHei"/>
+          <w:rFonts w:ascii="Calibri" w:hAnsi="Calibri" w:cs="Calibri" w:eastAsia="Microsoft YaHei"/>
           <w:b w:val="0"/>
           <w:sz w:val="12"/>
           <w:color w:val="000000"/>
@@ -6383,7 +6383,7 @@
             </w:pPr>
             <w:r>
               <w:rPr>
-                <w:rFonts w:ascii="Arial Black" w:hAnsi="Arial Black" w:cs="Arial Black" w:eastAsia="Microsoft YaHei"/>
+                <w:rFonts w:ascii="Calibri" w:hAnsi="Calibri" w:cs="Calibri" w:eastAsia="Microsoft YaHei"/>
                 <w:b/>
                 <w:sz w:val="13"/>
                 <w:color w:val="000000"/>
@@ -6396,11 +6396,11 @@
           <w:p>
             <w:pPr>
               <w:spacing w:before="0" w:after="27" w:line="216" w:lineRule="auto"/>
-              <w:ind w:left="266" w:hanging="266"/>
+              <w:ind w:left="360" w:hanging="360"/>
             </w:pPr>
             <w:r>
               <w:rPr>
-                <w:rFonts w:ascii="Arial Black" w:hAnsi="Arial Black" w:cs="Arial Black" w:eastAsia="Microsoft YaHei"/>
+                <w:rFonts w:ascii="Calibri" w:hAnsi="Calibri" w:cs="Calibri" w:eastAsia="Microsoft YaHei"/>
                 <w:b/>
                 <w:sz w:val="10"/>
                 <w:color w:val="E63846"/>
@@ -6410,7 +6410,7 @@
             </w:r>
             <w:r>
               <w:rPr>
-                <w:rFonts w:ascii="Arial" w:hAnsi="Arial" w:cs="Arial" w:eastAsia="Microsoft YaHei"/>
+                <w:rFonts w:ascii="Calibri" w:hAnsi="Calibri" w:cs="Calibri" w:eastAsia="Microsoft YaHei"/>
                 <w:b w:val="0"/>
                 <w:sz w:val="14"/>
                 <w:color w:val="000000"/>
@@ -6420,7 +6420,7 @@
             </w:r>
             <w:r>
               <w:rPr>
-                <w:rFonts w:ascii="Arial Black" w:hAnsi="Arial Black" w:cs="Arial Black" w:eastAsia="Microsoft YaHei"/>
+                <w:rFonts w:ascii="Calibri" w:hAnsi="Calibri" w:cs="Calibri" w:eastAsia="Microsoft YaHei"/>
                 <w:b/>
                 <w:sz w:val="14"/>
                 <w:color w:val="000000"/>
@@ -6430,7 +6430,7 @@
             </w:r>
             <w:r>
               <w:rPr>
-                <w:rFonts w:ascii="Arial" w:hAnsi="Arial" w:cs="Arial" w:eastAsia="Microsoft YaHei"/>
+                <w:rFonts w:ascii="Calibri" w:hAnsi="Calibri" w:cs="Calibri" w:eastAsia="Microsoft YaHei"/>
                 <w:b w:val="0"/>
                 <w:sz w:val="14"/>
                 <w:color w:val="000000"/>
@@ -6442,11 +6442,11 @@
           <w:p>
             <w:pPr>
               <w:spacing w:before="0" w:after="27" w:line="216" w:lineRule="auto"/>
-              <w:ind w:left="266" w:hanging="266"/>
+              <w:ind w:left="360" w:hanging="360"/>
             </w:pPr>
             <w:r>
               <w:rPr>
-                <w:rFonts w:ascii="Arial Black" w:hAnsi="Arial Black" w:cs="Arial Black" w:eastAsia="Microsoft YaHei"/>
+                <w:rFonts w:ascii="Calibri" w:hAnsi="Calibri" w:cs="Calibri" w:eastAsia="Microsoft YaHei"/>
                 <w:b/>
                 <w:sz w:val="10"/>
                 <w:color w:val="E63846"/>
@@ -6456,7 +6456,7 @@
             </w:r>
             <w:r>
               <w:rPr>
-                <w:rFonts w:ascii="Arial" w:hAnsi="Arial" w:cs="Arial" w:eastAsia="Microsoft YaHei"/>
+                <w:rFonts w:ascii="Calibri" w:hAnsi="Calibri" w:cs="Calibri" w:eastAsia="Microsoft YaHei"/>
                 <w:b w:val="0"/>
                 <w:sz w:val="14"/>
                 <w:color w:val="000000"/>
@@ -6466,7 +6466,7 @@
             </w:r>
             <w:r>
               <w:rPr>
-                <w:rFonts w:ascii="Arial Black" w:hAnsi="Arial Black" w:cs="Arial Black" w:eastAsia="Microsoft YaHei"/>
+                <w:rFonts w:ascii="Calibri" w:hAnsi="Calibri" w:cs="Calibri" w:eastAsia="Microsoft YaHei"/>
                 <w:b/>
                 <w:sz w:val="14"/>
                 <w:color w:val="000000"/>
@@ -6476,7 +6476,7 @@
             </w:r>
             <w:r>
               <w:rPr>
-                <w:rFonts w:ascii="Arial" w:hAnsi="Arial" w:cs="Arial" w:eastAsia="Microsoft YaHei"/>
+                <w:rFonts w:ascii="Calibri" w:hAnsi="Calibri" w:cs="Calibri" w:eastAsia="Microsoft YaHei"/>
                 <w:b w:val="0"/>
                 <w:sz w:val="14"/>
                 <w:color w:val="000000"/>
@@ -6488,11 +6488,11 @@
           <w:p>
             <w:pPr>
               <w:spacing w:before="0" w:after="27" w:line="216" w:lineRule="auto"/>
-              <w:ind w:left="266" w:hanging="266"/>
+              <w:ind w:left="360" w:hanging="360"/>
             </w:pPr>
             <w:r>
               <w:rPr>
-                <w:rFonts w:ascii="Arial Black" w:hAnsi="Arial Black" w:cs="Arial Black" w:eastAsia="Microsoft YaHei"/>
+                <w:rFonts w:ascii="Calibri" w:hAnsi="Calibri" w:cs="Calibri" w:eastAsia="Microsoft YaHei"/>
                 <w:b/>
                 <w:sz w:val="10"/>
                 <w:color w:val="E63846"/>
@@ -6502,7 +6502,7 @@
             </w:r>
             <w:r>
               <w:rPr>
-                <w:rFonts w:ascii="Arial" w:hAnsi="Arial" w:cs="Arial" w:eastAsia="Microsoft YaHei"/>
+                <w:rFonts w:ascii="Calibri" w:hAnsi="Calibri" w:cs="Calibri" w:eastAsia="Microsoft YaHei"/>
                 <w:b w:val="0"/>
                 <w:sz w:val="14"/>
                 <w:color w:val="000000"/>
@@ -6512,7 +6512,7 @@
             </w:r>
             <w:r>
               <w:rPr>
-                <w:rFonts w:ascii="Arial Black" w:hAnsi="Arial Black" w:cs="Arial Black" w:eastAsia="Microsoft YaHei"/>
+                <w:rFonts w:ascii="Calibri" w:hAnsi="Calibri" w:cs="Calibri" w:eastAsia="Microsoft YaHei"/>
                 <w:b/>
                 <w:sz w:val="14"/>
                 <w:color w:val="000000"/>
@@ -6522,7 +6522,7 @@
             </w:r>
             <w:r>
               <w:rPr>
-                <w:rFonts w:ascii="Arial" w:hAnsi="Arial" w:cs="Arial" w:eastAsia="Microsoft YaHei"/>
+                <w:rFonts w:ascii="Calibri" w:hAnsi="Calibri" w:cs="Calibri" w:eastAsia="Microsoft YaHei"/>
                 <w:b w:val="0"/>
                 <w:sz w:val="14"/>
                 <w:color w:val="000000"/>
@@ -6534,11 +6534,11 @@
           <w:p>
             <w:pPr>
               <w:spacing w:before="0" w:after="27" w:line="216" w:lineRule="auto"/>
-              <w:ind w:left="266" w:hanging="266"/>
+              <w:ind w:left="360" w:hanging="360"/>
             </w:pPr>
             <w:r>
               <w:rPr>
-                <w:rFonts w:ascii="Arial Black" w:hAnsi="Arial Black" w:cs="Arial Black" w:eastAsia="Microsoft YaHei"/>
+                <w:rFonts w:ascii="Calibri" w:hAnsi="Calibri" w:cs="Calibri" w:eastAsia="Microsoft YaHei"/>
                 <w:b/>
                 <w:sz w:val="10"/>
                 <w:color w:val="E63846"/>
@@ -6548,7 +6548,7 @@
             </w:r>
             <w:r>
               <w:rPr>
-                <w:rFonts w:ascii="Arial" w:hAnsi="Arial" w:cs="Arial" w:eastAsia="Microsoft YaHei"/>
+                <w:rFonts w:ascii="Calibri" w:hAnsi="Calibri" w:cs="Calibri" w:eastAsia="Microsoft YaHei"/>
                 <w:b w:val="0"/>
                 <w:sz w:val="14"/>
                 <w:color w:val="000000"/>
@@ -6558,7 +6558,7 @@
             </w:r>
             <w:r>
               <w:rPr>
-                <w:rFonts w:ascii="Arial Black" w:hAnsi="Arial Black" w:cs="Arial Black" w:eastAsia="Microsoft YaHei"/>
+                <w:rFonts w:ascii="Calibri" w:hAnsi="Calibri" w:cs="Calibri" w:eastAsia="Microsoft YaHei"/>
                 <w:b/>
                 <w:sz w:val="14"/>
                 <w:color w:val="000000"/>
@@ -6568,7 +6568,7 @@
             </w:r>
             <w:r>
               <w:rPr>
-                <w:rFonts w:ascii="Arial" w:hAnsi="Arial" w:cs="Arial" w:eastAsia="Microsoft YaHei"/>
+                <w:rFonts w:ascii="Calibri" w:hAnsi="Calibri" w:cs="Calibri" w:eastAsia="Microsoft YaHei"/>
                 <w:b w:val="0"/>
                 <w:sz w:val="14"/>
                 <w:color w:val="000000"/>
@@ -6608,7 +6608,7 @@
       </w:pPr>
       <w:r>
         <w:rPr>
-          <w:rFonts w:ascii="Arial Black" w:hAnsi="Arial Black" w:cs="Arial Black" w:eastAsia="Microsoft YaHei"/>
+          <w:rFonts w:ascii="Calibri" w:hAnsi="Calibri" w:cs="Calibri" w:eastAsia="Microsoft YaHei"/>
           <w:b/>
           <w:sz w:val="13"/>
           <w:color w:val="000000"/>
@@ -6637,7 +6637,7 @@
       </w:pPr>
       <w:r>
         <w:rPr>
-          <w:rFonts w:ascii="Arial Black" w:hAnsi="Arial Black" w:cs="Arial Black" w:eastAsia="Microsoft YaHei"/>
+          <w:rFonts w:ascii="Calibri" w:hAnsi="Calibri" w:cs="Calibri" w:eastAsia="Microsoft YaHei"/>
           <w:b/>
           <w:sz w:val="27"/>
           <w:color w:val="E63846"/>
@@ -6647,7 +6647,7 @@
       </w:r>
       <w:r>
         <w:rPr>
-          <w:rFonts w:ascii="Arial Black" w:hAnsi="Arial Black" w:cs="Arial Black" w:eastAsia="Microsoft YaHei"/>
+          <w:rFonts w:ascii="Calibri" w:hAnsi="Calibri" w:cs="Calibri" w:eastAsia="Microsoft YaHei"/>
           <w:b/>
           <w:sz w:val="22"/>
           <w:color w:val="000000"/>
@@ -6706,7 +6706,7 @@
             </w:pPr>
             <w:r>
               <w:rPr>
-                <w:rFonts w:ascii="Arial Black" w:hAnsi="Arial Black" w:cs="Arial Black" w:eastAsia="Microsoft YaHei"/>
+                <w:rFonts w:ascii="Calibri" w:hAnsi="Calibri" w:cs="Calibri" w:eastAsia="Microsoft YaHei"/>
                 <w:b/>
                 <w:sz w:val="12"/>
                 <w:color w:val="FFFFFF"/>
@@ -6742,7 +6742,7 @@
             </w:pPr>
             <w:r>
               <w:rPr>
-                <w:rFonts w:ascii="Arial Black" w:hAnsi="Arial Black" w:cs="Arial Black" w:eastAsia="Microsoft YaHei"/>
+                <w:rFonts w:ascii="Calibri" w:hAnsi="Calibri" w:cs="Calibri" w:eastAsia="Microsoft YaHei"/>
                 <w:b/>
                 <w:sz w:val="12"/>
                 <w:color w:val="FFFFFF"/>
@@ -6778,7 +6778,7 @@
             </w:pPr>
             <w:r>
               <w:rPr>
-                <w:rFonts w:ascii="Arial Black" w:hAnsi="Arial Black" w:cs="Arial Black" w:eastAsia="Microsoft YaHei"/>
+                <w:rFonts w:ascii="Calibri" w:hAnsi="Calibri" w:cs="Calibri" w:eastAsia="Microsoft YaHei"/>
                 <w:b/>
                 <w:sz w:val="12"/>
                 <w:color w:val="FFFFFF"/>
@@ -6819,7 +6819,7 @@
             </w:pPr>
             <w:r>
               <w:rPr>
-                <w:rFonts w:ascii="Arial" w:hAnsi="Arial" w:cs="Arial" w:eastAsia="Microsoft YaHei"/>
+                <w:rFonts w:ascii="Calibri" w:hAnsi="Calibri" w:cs="Calibri" w:eastAsia="Microsoft YaHei"/>
                 <w:b w:val="0"/>
                 <w:sz w:val="13"/>
                 <w:color w:val="1A1A1A"/>
@@ -6855,7 +6855,7 @@
             </w:pPr>
             <w:r>
               <w:rPr>
-                <w:rFonts w:ascii="Arial" w:hAnsi="Arial" w:cs="Arial" w:eastAsia="Microsoft YaHei"/>
+                <w:rFonts w:ascii="Calibri" w:hAnsi="Calibri" w:cs="Calibri" w:eastAsia="Microsoft YaHei"/>
                 <w:b w:val="0"/>
                 <w:sz w:val="13"/>
                 <w:color w:val="1A1A1A"/>
@@ -6891,7 +6891,7 @@
             </w:pPr>
             <w:r>
               <w:rPr>
-                <w:rFonts w:ascii="Arial" w:hAnsi="Arial" w:cs="Arial" w:eastAsia="Microsoft YaHei"/>
+                <w:rFonts w:ascii="Calibri" w:hAnsi="Calibri" w:cs="Calibri" w:eastAsia="Microsoft YaHei"/>
                 <w:b w:val="0"/>
                 <w:sz w:val="13"/>
                 <w:color w:val="1A1A1A"/>
@@ -6932,7 +6932,7 @@
             </w:pPr>
             <w:r>
               <w:rPr>
-                <w:rFonts w:ascii="Arial" w:hAnsi="Arial" w:cs="Arial" w:eastAsia="Microsoft YaHei"/>
+                <w:rFonts w:ascii="Calibri" w:hAnsi="Calibri" w:cs="Calibri" w:eastAsia="Microsoft YaHei"/>
                 <w:b w:val="0"/>
                 <w:sz w:val="13"/>
                 <w:color w:val="1A1A1A"/>
@@ -6968,7 +6968,7 @@
             </w:pPr>
             <w:r>
               <w:rPr>
-                <w:rFonts w:ascii="Arial" w:hAnsi="Arial" w:cs="Arial" w:eastAsia="Microsoft YaHei"/>
+                <w:rFonts w:ascii="Calibri" w:hAnsi="Calibri" w:cs="Calibri" w:eastAsia="Microsoft YaHei"/>
                 <w:b w:val="0"/>
                 <w:sz w:val="13"/>
                 <w:color w:val="1A1A1A"/>
@@ -7004,7 +7004,7 @@
             </w:pPr>
             <w:r>
               <w:rPr>
-                <w:rFonts w:ascii="Arial" w:hAnsi="Arial" w:cs="Arial" w:eastAsia="Microsoft YaHei"/>
+                <w:rFonts w:ascii="Calibri" w:hAnsi="Calibri" w:cs="Calibri" w:eastAsia="Microsoft YaHei"/>
                 <w:b w:val="0"/>
                 <w:sz w:val="13"/>
                 <w:color w:val="1A1A1A"/>
@@ -7045,7 +7045,7 @@
             </w:pPr>
             <w:r>
               <w:rPr>
-                <w:rFonts w:ascii="Arial" w:hAnsi="Arial" w:cs="Arial" w:eastAsia="Microsoft YaHei"/>
+                <w:rFonts w:ascii="Calibri" w:hAnsi="Calibri" w:cs="Calibri" w:eastAsia="Microsoft YaHei"/>
                 <w:b w:val="0"/>
                 <w:sz w:val="13"/>
                 <w:color w:val="1A1A1A"/>
@@ -7081,7 +7081,7 @@
             </w:pPr>
             <w:r>
               <w:rPr>
-                <w:rFonts w:ascii="Arial" w:hAnsi="Arial" w:cs="Arial" w:eastAsia="Microsoft YaHei"/>
+                <w:rFonts w:ascii="Calibri" w:hAnsi="Calibri" w:cs="Calibri" w:eastAsia="Microsoft YaHei"/>
                 <w:b w:val="0"/>
                 <w:sz w:val="13"/>
                 <w:color w:val="1A1A1A"/>
@@ -7119,7 +7119,7 @@
             </w:pPr>
             <w:r>
               <w:rPr>
-                <w:rFonts w:ascii="Arial" w:hAnsi="Arial" w:cs="Arial" w:eastAsia="Microsoft YaHei"/>
+                <w:rFonts w:ascii="Calibri" w:hAnsi="Calibri" w:cs="Calibri" w:eastAsia="Microsoft YaHei"/>
                 <w:b w:val="0"/>
                 <w:sz w:val="13"/>
                 <w:color w:val="1A1A1A"/>
@@ -7160,7 +7160,7 @@
             </w:pPr>
             <w:r>
               <w:rPr>
-                <w:rFonts w:ascii="Arial" w:hAnsi="Arial" w:cs="Arial" w:eastAsia="Microsoft YaHei"/>
+                <w:rFonts w:ascii="Calibri" w:hAnsi="Calibri" w:cs="Calibri" w:eastAsia="Microsoft YaHei"/>
                 <w:b w:val="0"/>
                 <w:sz w:val="13"/>
                 <w:color w:val="1A1A1A"/>
@@ -7196,7 +7196,7 @@
             </w:pPr>
             <w:r>
               <w:rPr>
-                <w:rFonts w:ascii="Arial" w:hAnsi="Arial" w:cs="Arial" w:eastAsia="Microsoft YaHei"/>
+                <w:rFonts w:ascii="Calibri" w:hAnsi="Calibri" w:cs="Calibri" w:eastAsia="Microsoft YaHei"/>
                 <w:b w:val="0"/>
                 <w:sz w:val="13"/>
                 <w:color w:val="1A1A1A"/>
@@ -7232,7 +7232,7 @@
             </w:pPr>
             <w:r>
               <w:rPr>
-                <w:rFonts w:ascii="Arial" w:hAnsi="Arial" w:cs="Arial" w:eastAsia="Microsoft YaHei"/>
+                <w:rFonts w:ascii="Calibri" w:hAnsi="Calibri" w:cs="Calibri" w:eastAsia="Microsoft YaHei"/>
                 <w:b w:val="0"/>
                 <w:sz w:val="13"/>
                 <w:color w:val="1A1A1A"/>
@@ -7273,7 +7273,7 @@
             </w:pPr>
             <w:r>
               <w:rPr>
-                <w:rFonts w:ascii="Arial" w:hAnsi="Arial" w:cs="Arial" w:eastAsia="Microsoft YaHei"/>
+                <w:rFonts w:ascii="Calibri" w:hAnsi="Calibri" w:cs="Calibri" w:eastAsia="Microsoft YaHei"/>
                 <w:b w:val="0"/>
                 <w:sz w:val="13"/>
                 <w:color w:val="1A1A1A"/>
@@ -7309,7 +7309,7 @@
             </w:pPr>
             <w:r>
               <w:rPr>
-                <w:rFonts w:ascii="Arial" w:hAnsi="Arial" w:cs="Arial" w:eastAsia="Microsoft YaHei"/>
+                <w:rFonts w:ascii="Calibri" w:hAnsi="Calibri" w:cs="Calibri" w:eastAsia="Microsoft YaHei"/>
                 <w:b w:val="0"/>
                 <w:sz w:val="13"/>
                 <w:color w:val="1A1A1A"/>
@@ -7347,7 +7347,7 @@
             </w:pPr>
             <w:r>
               <w:rPr>
-                <w:rFonts w:ascii="Arial" w:hAnsi="Arial" w:cs="Arial" w:eastAsia="Microsoft YaHei"/>
+                <w:rFonts w:ascii="Calibri" w:hAnsi="Calibri" w:cs="Calibri" w:eastAsia="Microsoft YaHei"/>
                 <w:b w:val="0"/>
                 <w:sz w:val="13"/>
                 <w:color w:val="1A1A1A"/>
@@ -7388,7 +7388,7 @@
             </w:pPr>
             <w:r>
               <w:rPr>
-                <w:rFonts w:ascii="Arial" w:hAnsi="Arial" w:cs="Arial" w:eastAsia="Microsoft YaHei"/>
+                <w:rFonts w:ascii="Calibri" w:hAnsi="Calibri" w:cs="Calibri" w:eastAsia="Microsoft YaHei"/>
                 <w:b w:val="0"/>
                 <w:sz w:val="13"/>
                 <w:color w:val="1A1A1A"/>
@@ -7424,7 +7424,7 @@
             </w:pPr>
             <w:r>
               <w:rPr>
-                <w:rFonts w:ascii="Arial" w:hAnsi="Arial" w:cs="Arial" w:eastAsia="Microsoft YaHei"/>
+                <w:rFonts w:ascii="Calibri" w:hAnsi="Calibri" w:cs="Calibri" w:eastAsia="Microsoft YaHei"/>
                 <w:b w:val="0"/>
                 <w:sz w:val="13"/>
                 <w:color w:val="1A1A1A"/>
@@ -7462,7 +7462,7 @@
             </w:pPr>
             <w:r>
               <w:rPr>
-                <w:rFonts w:ascii="Arial" w:hAnsi="Arial" w:cs="Arial" w:eastAsia="Microsoft YaHei"/>
+                <w:rFonts w:ascii="Calibri" w:hAnsi="Calibri" w:cs="Calibri" w:eastAsia="Microsoft YaHei"/>
                 <w:b w:val="0"/>
                 <w:sz w:val="13"/>
                 <w:color w:val="1A1A1A"/>
@@ -7503,7 +7503,7 @@
             </w:pPr>
             <w:r>
               <w:rPr>
-                <w:rFonts w:ascii="Arial" w:hAnsi="Arial" w:cs="Arial" w:eastAsia="Microsoft YaHei"/>
+                <w:rFonts w:ascii="Calibri" w:hAnsi="Calibri" w:cs="Calibri" w:eastAsia="Microsoft YaHei"/>
                 <w:b w:val="0"/>
                 <w:sz w:val="13"/>
                 <w:color w:val="1A1A1A"/>
@@ -7541,7 +7541,7 @@
             </w:pPr>
             <w:r>
               <w:rPr>
-                <w:rFonts w:ascii="Arial" w:hAnsi="Arial" w:cs="Arial" w:eastAsia="Microsoft YaHei"/>
+                <w:rFonts w:ascii="Calibri" w:hAnsi="Calibri" w:cs="Calibri" w:eastAsia="Microsoft YaHei"/>
                 <w:b w:val="0"/>
                 <w:sz w:val="13"/>
                 <w:color w:val="1A1A1A"/>
@@ -7577,7 +7577,7 @@
             </w:pPr>
             <w:r>
               <w:rPr>
-                <w:rFonts w:ascii="Arial" w:hAnsi="Arial" w:cs="Arial" w:eastAsia="Microsoft YaHei"/>
+                <w:rFonts w:ascii="Calibri" w:hAnsi="Calibri" w:cs="Calibri" w:eastAsia="Microsoft YaHei"/>
                 <w:b w:val="0"/>
                 <w:sz w:val="13"/>
                 <w:color w:val="1A1A1A"/>
@@ -7618,7 +7618,7 @@
             </w:pPr>
             <w:r>
               <w:rPr>
-                <w:rFonts w:ascii="Arial" w:hAnsi="Arial" w:cs="Arial" w:eastAsia="Microsoft YaHei"/>
+                <w:rFonts w:ascii="Calibri" w:hAnsi="Calibri" w:cs="Calibri" w:eastAsia="Microsoft YaHei"/>
                 <w:b w:val="0"/>
                 <w:sz w:val="13"/>
                 <w:color w:val="1A1A1A"/>
@@ -7654,7 +7654,7 @@
             </w:pPr>
             <w:r>
               <w:rPr>
-                <w:rFonts w:ascii="Arial" w:hAnsi="Arial" w:cs="Arial" w:eastAsia="Microsoft YaHei"/>
+                <w:rFonts w:ascii="Calibri" w:hAnsi="Calibri" w:cs="Calibri" w:eastAsia="Microsoft YaHei"/>
                 <w:b w:val="0"/>
                 <w:sz w:val="13"/>
                 <w:color w:val="1A1A1A"/>
@@ -7690,7 +7690,7 @@
             </w:pPr>
             <w:r>
               <w:rPr>
-                <w:rFonts w:ascii="Arial" w:hAnsi="Arial" w:cs="Arial" w:eastAsia="Microsoft YaHei"/>
+                <w:rFonts w:ascii="Calibri" w:hAnsi="Calibri" w:cs="Calibri" w:eastAsia="Microsoft YaHei"/>
                 <w:b w:val="0"/>
                 <w:sz w:val="13"/>
                 <w:color w:val="1A1A1A"/>
@@ -7733,7 +7733,7 @@
             </w:pPr>
             <w:r>
               <w:rPr>
-                <w:rFonts w:ascii="Arial" w:hAnsi="Arial" w:cs="Arial" w:eastAsia="Microsoft YaHei"/>
+                <w:rFonts w:ascii="Calibri" w:hAnsi="Calibri" w:cs="Calibri" w:eastAsia="Microsoft YaHei"/>
                 <w:b w:val="0"/>
                 <w:sz w:val="13"/>
                 <w:color w:val="1A1A1A"/>
@@ -7769,7 +7769,7 @@
             </w:pPr>
             <w:r>
               <w:rPr>
-                <w:rFonts w:ascii="Arial" w:hAnsi="Arial" w:cs="Arial" w:eastAsia="Microsoft YaHei"/>
+                <w:rFonts w:ascii="Calibri" w:hAnsi="Calibri" w:cs="Calibri" w:eastAsia="Microsoft YaHei"/>
                 <w:b w:val="0"/>
                 <w:sz w:val="13"/>
                 <w:color w:val="1A1A1A"/>
@@ -7807,7 +7807,7 @@
             </w:pPr>
             <w:r>
               <w:rPr>
-                <w:rFonts w:ascii="Arial" w:hAnsi="Arial" w:cs="Arial" w:eastAsia="Microsoft YaHei"/>
+                <w:rFonts w:ascii="Calibri" w:hAnsi="Calibri" w:cs="Calibri" w:eastAsia="Microsoft YaHei"/>
                 <w:b w:val="0"/>
                 <w:sz w:val="13"/>
                 <w:color w:val="1A1A1A"/>
@@ -7868,7 +7868,7 @@
             </w:pPr>
             <w:r>
               <w:rPr>
-                <w:rFonts w:ascii="Arial Black" w:hAnsi="Arial Black" w:cs="Arial Black" w:eastAsia="Microsoft YaHei"/>
+                <w:rFonts w:ascii="Calibri" w:hAnsi="Calibri" w:cs="Calibri" w:eastAsia="Microsoft YaHei"/>
                 <w:b/>
                 <w:sz w:val="13"/>
                 <w:color w:val="000000"/>
@@ -7884,7 +7884,7 @@
             </w:pPr>
             <w:r>
               <w:rPr>
-                <w:rFonts w:ascii="Arial" w:hAnsi="Arial" w:cs="Arial" w:eastAsia="Microsoft YaHei"/>
+                <w:rFonts w:ascii="Calibri" w:hAnsi="Calibri" w:cs="Calibri" w:eastAsia="Microsoft YaHei"/>
                 <w:b w:val="0"/>
                 <w:sz w:val="14"/>
                 <w:color w:val="000000"/>
@@ -7924,7 +7924,7 @@
       </w:pPr>
       <w:r>
         <w:rPr>
-          <w:rFonts w:ascii="Arial Black" w:hAnsi="Arial Black" w:cs="Arial Black" w:eastAsia="Microsoft YaHei"/>
+          <w:rFonts w:ascii="Calibri" w:hAnsi="Calibri" w:cs="Calibri" w:eastAsia="Microsoft YaHei"/>
           <w:b/>
           <w:sz w:val="13"/>
           <w:color w:val="000000"/>
@@ -7953,7 +7953,7 @@
       </w:pPr>
       <w:r>
         <w:rPr>
-          <w:rFonts w:ascii="Arial Black" w:hAnsi="Arial Black" w:cs="Arial Black" w:eastAsia="Microsoft YaHei"/>
+          <w:rFonts w:ascii="Calibri" w:hAnsi="Calibri" w:cs="Calibri" w:eastAsia="Microsoft YaHei"/>
           <w:b/>
           <w:sz w:val="27"/>
           <w:color w:val="E63846"/>
@@ -7963,7 +7963,7 @@
       </w:r>
       <w:r>
         <w:rPr>
-          <w:rFonts w:ascii="Arial Black" w:hAnsi="Arial Black" w:cs="Arial Black" w:eastAsia="Microsoft YaHei"/>
+          <w:rFonts w:ascii="Calibri" w:hAnsi="Calibri" w:cs="Calibri" w:eastAsia="Microsoft YaHei"/>
           <w:b/>
           <w:sz w:val="22"/>
           <w:color w:val="000000"/>
@@ -7981,7 +7981,7 @@
       </w:pPr>
       <w:r>
         <w:rPr>
-          <w:rFonts w:ascii="Arial Black" w:hAnsi="Arial Black" w:cs="Arial Black" w:eastAsia="Microsoft YaHei"/>
+          <w:rFonts w:ascii="Calibri" w:hAnsi="Calibri" w:cs="Calibri" w:eastAsia="Microsoft YaHei"/>
           <w:b/>
           <w:sz w:val="15"/>
           <w:color w:val="000000"/>
@@ -7996,7 +7996,7 @@
       </w:pPr>
       <w:r>
         <w:rPr>
-          <w:rFonts w:ascii="Arial Black" w:hAnsi="Arial Black" w:cs="Arial Black" w:eastAsia="Microsoft YaHei"/>
+          <w:rFonts w:ascii="Calibri" w:hAnsi="Calibri" w:cs="Calibri" w:eastAsia="Microsoft YaHei"/>
           <w:b/>
           <w:sz w:val="14"/>
           <w:color w:val="FFFFFF"/>
@@ -8007,7 +8007,7 @@
       </w:r>
       <w:r>
         <w:rPr>
-          <w:rFonts w:ascii="Arial" w:hAnsi="Arial" w:cs="Arial" w:eastAsia="Microsoft YaHei"/>
+          <w:rFonts w:ascii="Calibri" w:hAnsi="Calibri" w:cs="Calibri" w:eastAsia="Microsoft YaHei"/>
           <w:b w:val="0"/>
           <w:sz w:val="14"/>
           <w:color w:val="000000"/>
@@ -8022,7 +8022,7 @@
       </w:pPr>
       <w:r>
         <w:rPr>
-          <w:rFonts w:ascii="Arial Black" w:hAnsi="Arial Black" w:cs="Arial Black" w:eastAsia="Microsoft YaHei"/>
+          <w:rFonts w:ascii="Calibri" w:hAnsi="Calibri" w:cs="Calibri" w:eastAsia="Microsoft YaHei"/>
           <w:b/>
           <w:sz w:val="14"/>
           <w:color w:val="FFFFFF"/>
@@ -8033,7 +8033,7 @@
       </w:r>
       <w:r>
         <w:rPr>
-          <w:rFonts w:ascii="Arial" w:hAnsi="Arial" w:cs="Arial" w:eastAsia="Microsoft YaHei"/>
+          <w:rFonts w:ascii="Calibri" w:hAnsi="Calibri" w:cs="Calibri" w:eastAsia="Microsoft YaHei"/>
           <w:b w:val="0"/>
           <w:sz w:val="14"/>
           <w:color w:val="000000"/>
@@ -8043,7 +8043,7 @@
       </w:r>
       <w:r>
         <w:rPr>
-          <w:rFonts w:ascii="Arial Black" w:hAnsi="Arial Black" w:cs="Arial Black" w:eastAsia="Microsoft YaHei"/>
+          <w:rFonts w:ascii="Calibri" w:hAnsi="Calibri" w:cs="Calibri" w:eastAsia="Microsoft YaHei"/>
           <w:b/>
           <w:sz w:val="14"/>
           <w:color w:val="000000"/>
@@ -8053,7 +8053,7 @@
       </w:r>
       <w:r>
         <w:rPr>
-          <w:rFonts w:ascii="Arial" w:hAnsi="Arial" w:cs="Arial" w:eastAsia="Microsoft YaHei"/>
+          <w:rFonts w:ascii="Calibri" w:hAnsi="Calibri" w:cs="Calibri" w:eastAsia="Microsoft YaHei"/>
           <w:b w:val="0"/>
           <w:sz w:val="14"/>
           <w:color w:val="000000"/>
@@ -8068,7 +8068,7 @@
       </w:pPr>
       <w:r>
         <w:rPr>
-          <w:rFonts w:ascii="Arial Black" w:hAnsi="Arial Black" w:cs="Arial Black" w:eastAsia="Microsoft YaHei"/>
+          <w:rFonts w:ascii="Calibri" w:hAnsi="Calibri" w:cs="Calibri" w:eastAsia="Microsoft YaHei"/>
           <w:b/>
           <w:sz w:val="14"/>
           <w:color w:val="FFFFFF"/>
@@ -8079,7 +8079,7 @@
       </w:r>
       <w:r>
         <w:rPr>
-          <w:rFonts w:ascii="Arial" w:hAnsi="Arial" w:cs="Arial" w:eastAsia="Microsoft YaHei"/>
+          <w:rFonts w:ascii="Calibri" w:hAnsi="Calibri" w:cs="Calibri" w:eastAsia="Microsoft YaHei"/>
           <w:b w:val="0"/>
           <w:sz w:val="14"/>
           <w:color w:val="000000"/>
@@ -8097,7 +8097,7 @@
       </w:pPr>
       <w:r>
         <w:rPr>
-          <w:rFonts w:ascii="Arial Black" w:hAnsi="Arial Black" w:cs="Arial Black" w:eastAsia="Microsoft YaHei"/>
+          <w:rFonts w:ascii="Calibri" w:hAnsi="Calibri" w:cs="Calibri" w:eastAsia="Microsoft YaHei"/>
           <w:b/>
           <w:sz w:val="15"/>
           <w:color w:val="000000"/>
@@ -8112,7 +8112,7 @@
       </w:pPr>
       <w:r>
         <w:rPr>
-          <w:rFonts w:ascii="Arial Black" w:hAnsi="Arial Black" w:cs="Arial Black" w:eastAsia="Microsoft YaHei"/>
+          <w:rFonts w:ascii="Calibri" w:hAnsi="Calibri" w:cs="Calibri" w:eastAsia="Microsoft YaHei"/>
           <w:b/>
           <w:sz w:val="14"/>
           <w:color w:val="FFFFFF"/>
@@ -8123,7 +8123,7 @@
       </w:r>
       <w:r>
         <w:rPr>
-          <w:rFonts w:ascii="Arial" w:hAnsi="Arial" w:cs="Arial" w:eastAsia="Microsoft YaHei"/>
+          <w:rFonts w:ascii="Calibri" w:hAnsi="Calibri" w:cs="Calibri" w:eastAsia="Microsoft YaHei"/>
           <w:b w:val="0"/>
           <w:sz w:val="14"/>
           <w:color w:val="000000"/>
@@ -8138,7 +8138,7 @@
       </w:pPr>
       <w:r>
         <w:rPr>
-          <w:rFonts w:ascii="Arial Black" w:hAnsi="Arial Black" w:cs="Arial Black" w:eastAsia="Microsoft YaHei"/>
+          <w:rFonts w:ascii="Calibri" w:hAnsi="Calibri" w:cs="Calibri" w:eastAsia="Microsoft YaHei"/>
           <w:b/>
           <w:sz w:val="14"/>
           <w:color w:val="FFFFFF"/>
@@ -8149,7 +8149,7 @@
       </w:r>
       <w:r>
         <w:rPr>
-          <w:rFonts w:ascii="Arial" w:hAnsi="Arial" w:cs="Arial" w:eastAsia="Microsoft YaHei"/>
+          <w:rFonts w:ascii="Calibri" w:hAnsi="Calibri" w:cs="Calibri" w:eastAsia="Microsoft YaHei"/>
           <w:b w:val="0"/>
           <w:sz w:val="14"/>
           <w:color w:val="000000"/>
@@ -8164,7 +8164,7 @@
       </w:pPr>
       <w:r>
         <w:rPr>
-          <w:rFonts w:ascii="Arial Black" w:hAnsi="Arial Black" w:cs="Arial Black" w:eastAsia="Microsoft YaHei"/>
+          <w:rFonts w:ascii="Calibri" w:hAnsi="Calibri" w:cs="Calibri" w:eastAsia="Microsoft YaHei"/>
           <w:b/>
           <w:sz w:val="14"/>
           <w:color w:val="FFFFFF"/>
@@ -8175,7 +8175,7 @@
       </w:r>
       <w:r>
         <w:rPr>
-          <w:rFonts w:ascii="Arial" w:hAnsi="Arial" w:cs="Arial" w:eastAsia="Microsoft YaHei"/>
+          <w:rFonts w:ascii="Calibri" w:hAnsi="Calibri" w:cs="Calibri" w:eastAsia="Microsoft YaHei"/>
           <w:b w:val="0"/>
           <w:sz w:val="14"/>
           <w:color w:val="000000"/>
@@ -8315,7 +8315,7 @@
       </w:pPr>
       <w:r>
         <w:rPr>
-          <w:rFonts w:ascii="Arial Black" w:hAnsi="Arial Black" w:cs="Arial Black" w:eastAsia="Microsoft YaHei"/>
+          <w:rFonts w:ascii="Calibri" w:hAnsi="Calibri" w:cs="Calibri" w:eastAsia="Microsoft YaHei"/>
           <w:b/>
           <w:sz w:val="15"/>
           <w:color w:val="000000"/>
@@ -8327,11 +8327,11 @@
     <w:p>
       <w:pPr>
         <w:spacing w:before="0" w:after="32" w:line="260" w:lineRule="auto"/>
-        <w:ind w:left="181" w:hanging="181"/>
+        <w:ind w:left="240" w:hanging="240"/>
       </w:pPr>
       <w:r>
         <w:rPr>
-          <w:rFonts w:ascii="Arial Black" w:hAnsi="Arial Black" w:cs="Arial Black" w:eastAsia="Microsoft YaHei"/>
+          <w:rFonts w:ascii="Calibri" w:hAnsi="Calibri" w:cs="Calibri" w:eastAsia="Microsoft YaHei"/>
           <w:b/>
           <w:sz w:val="11"/>
           <w:color w:val="E63846"/>
@@ -8341,7 +8341,7 @@
       </w:r>
       <w:r>
         <w:rPr>
-          <w:rFonts w:ascii="Arial" w:hAnsi="Arial" w:cs="Arial" w:eastAsia="Microsoft YaHei"/>
+          <w:rFonts w:ascii="Calibri" w:hAnsi="Calibri" w:cs="Calibri" w:eastAsia="Microsoft YaHei"/>
           <w:b w:val="0"/>
           <w:sz w:val="14"/>
           <w:color w:val="000000"/>
@@ -8351,7 +8351,7 @@
       </w:r>
       <w:r>
         <w:rPr>
-          <w:rFonts w:ascii="Arial Black" w:hAnsi="Arial Black" w:cs="Arial Black" w:eastAsia="Microsoft YaHei"/>
+          <w:rFonts w:ascii="Calibri" w:hAnsi="Calibri" w:cs="Calibri" w:eastAsia="Microsoft YaHei"/>
           <w:b/>
           <w:sz w:val="14"/>
           <w:color w:val="000000"/>
@@ -8361,7 +8361,7 @@
       </w:r>
       <w:r>
         <w:rPr>
-          <w:rFonts w:ascii="Arial" w:hAnsi="Arial" w:cs="Arial" w:eastAsia="Microsoft YaHei"/>
+          <w:rFonts w:ascii="Calibri" w:hAnsi="Calibri" w:cs="Calibri" w:eastAsia="Microsoft YaHei"/>
           <w:b w:val="0"/>
           <w:sz w:val="14"/>
           <w:color w:val="000000"/>
@@ -8373,11 +8373,11 @@
     <w:p>
       <w:pPr>
         <w:spacing w:before="0" w:after="32" w:line="260" w:lineRule="auto"/>
-        <w:ind w:left="181" w:hanging="181"/>
+        <w:ind w:left="240" w:hanging="240"/>
       </w:pPr>
       <w:r>
         <w:rPr>
-          <w:rFonts w:ascii="Arial Black" w:hAnsi="Arial Black" w:cs="Arial Black" w:eastAsia="Microsoft YaHei"/>
+          <w:rFonts w:ascii="Calibri" w:hAnsi="Calibri" w:cs="Calibri" w:eastAsia="Microsoft YaHei"/>
           <w:b/>
           <w:sz w:val="11"/>
           <w:color w:val="E63846"/>
@@ -8387,7 +8387,7 @@
       </w:r>
       <w:r>
         <w:rPr>
-          <w:rFonts w:ascii="Arial" w:hAnsi="Arial" w:cs="Arial" w:eastAsia="Microsoft YaHei"/>
+          <w:rFonts w:ascii="Calibri" w:hAnsi="Calibri" w:cs="Calibri" w:eastAsia="Microsoft YaHei"/>
           <w:b w:val="0"/>
           <w:sz w:val="14"/>
           <w:color w:val="000000"/>
@@ -8399,11 +8399,11 @@
     <w:p>
       <w:pPr>
         <w:spacing w:before="0" w:after="32" w:line="260" w:lineRule="auto"/>
-        <w:ind w:left="181" w:hanging="181"/>
+        <w:ind w:left="240" w:hanging="240"/>
       </w:pPr>
       <w:r>
         <w:rPr>
-          <w:rFonts w:ascii="Arial Black" w:hAnsi="Arial Black" w:cs="Arial Black" w:eastAsia="Microsoft YaHei"/>
+          <w:rFonts w:ascii="Calibri" w:hAnsi="Calibri" w:cs="Calibri" w:eastAsia="Microsoft YaHei"/>
           <w:b/>
           <w:sz w:val="11"/>
           <w:color w:val="E63846"/>
@@ -8413,7 +8413,7 @@
       </w:r>
       <w:r>
         <w:rPr>
-          <w:rFonts w:ascii="Arial" w:hAnsi="Arial" w:cs="Arial" w:eastAsia="Microsoft YaHei"/>
+          <w:rFonts w:ascii="Calibri" w:hAnsi="Calibri" w:cs="Calibri" w:eastAsia="Microsoft YaHei"/>
           <w:b w:val="0"/>
           <w:sz w:val="14"/>
           <w:color w:val="000000"/>
@@ -8425,11 +8425,11 @@
     <w:p>
       <w:pPr>
         <w:spacing w:before="0" w:after="32" w:line="260" w:lineRule="auto"/>
-        <w:ind w:left="181" w:hanging="181"/>
+        <w:ind w:left="240" w:hanging="240"/>
       </w:pPr>
       <w:r>
         <w:rPr>
-          <w:rFonts w:ascii="Arial Black" w:hAnsi="Arial Black" w:cs="Arial Black" w:eastAsia="Microsoft YaHei"/>
+          <w:rFonts w:ascii="Calibri" w:hAnsi="Calibri" w:cs="Calibri" w:eastAsia="Microsoft YaHei"/>
           <w:b/>
           <w:sz w:val="11"/>
           <w:color w:val="E63846"/>
@@ -8439,7 +8439,7 @@
       </w:r>
       <w:r>
         <w:rPr>
-          <w:rFonts w:ascii="Arial" w:hAnsi="Arial" w:cs="Arial" w:eastAsia="Microsoft YaHei"/>
+          <w:rFonts w:ascii="Calibri" w:hAnsi="Calibri" w:cs="Calibri" w:eastAsia="Microsoft YaHei"/>
           <w:b w:val="0"/>
           <w:sz w:val="14"/>
           <w:color w:val="000000"/>
@@ -8471,7 +8471,7 @@
       </w:pPr>
       <w:r>
         <w:rPr>
-          <w:rFonts w:ascii="Arial Black" w:hAnsi="Arial Black" w:cs="Arial Black" w:eastAsia="Microsoft YaHei"/>
+          <w:rFonts w:ascii="Calibri" w:hAnsi="Calibri" w:cs="Calibri" w:eastAsia="Microsoft YaHei"/>
           <w:b/>
           <w:sz w:val="13"/>
           <w:color w:val="000000"/>
@@ -8500,7 +8500,7 @@
       </w:pPr>
       <w:r>
         <w:rPr>
-          <w:rFonts w:ascii="Arial Black" w:hAnsi="Arial Black" w:cs="Arial Black" w:eastAsia="Microsoft YaHei"/>
+          <w:rFonts w:ascii="Calibri" w:hAnsi="Calibri" w:cs="Calibri" w:eastAsia="Microsoft YaHei"/>
           <w:b/>
           <w:sz w:val="27"/>
           <w:color w:val="E63846"/>
@@ -8510,7 +8510,7 @@
       </w:r>
       <w:r>
         <w:rPr>
-          <w:rFonts w:ascii="Arial Black" w:hAnsi="Arial Black" w:cs="Arial Black" w:eastAsia="Microsoft YaHei"/>
+          <w:rFonts w:ascii="Calibri" w:hAnsi="Calibri" w:cs="Calibri" w:eastAsia="Microsoft YaHei"/>
           <w:b/>
           <w:sz w:val="22"/>
           <w:color w:val="000000"/>
@@ -8528,7 +8528,7 @@
       </w:pPr>
       <w:r>
         <w:rPr>
-          <w:rFonts w:ascii="Arial Black" w:hAnsi="Arial Black" w:cs="Arial Black" w:eastAsia="Microsoft YaHei"/>
+          <w:rFonts w:ascii="Calibri" w:hAnsi="Calibri" w:cs="Calibri" w:eastAsia="Microsoft YaHei"/>
           <w:b/>
           <w:sz w:val="15"/>
           <w:color w:val="000000"/>
@@ -8540,11 +8540,11 @@
     <w:p>
       <w:pPr>
         <w:spacing w:before="0" w:after="32" w:line="278" w:lineRule="auto"/>
-        <w:ind w:left="181" w:hanging="181"/>
+        <w:ind w:left="240" w:hanging="240"/>
       </w:pPr>
       <w:r>
         <w:rPr>
-          <w:rFonts w:ascii="Arial Black" w:hAnsi="Arial Black" w:cs="Arial Black" w:eastAsia="Microsoft YaHei"/>
+          <w:rFonts w:ascii="Calibri" w:hAnsi="Calibri" w:cs="Calibri" w:eastAsia="Microsoft YaHei"/>
           <w:b/>
           <w:sz w:val="11"/>
           <w:color w:val="E63846"/>
@@ -8554,7 +8554,7 @@
       </w:r>
       <w:r>
         <w:rPr>
-          <w:rFonts w:ascii="Arial" w:hAnsi="Arial" w:cs="Arial" w:eastAsia="Microsoft YaHei"/>
+          <w:rFonts w:ascii="Calibri" w:hAnsi="Calibri" w:cs="Calibri" w:eastAsia="Microsoft YaHei"/>
           <w:b w:val="0"/>
           <w:sz w:val="14"/>
           <w:color w:val="000000"/>
@@ -8568,11 +8568,11 @@
     <w:p>
       <w:pPr>
         <w:spacing w:before="0" w:after="32" w:line="278" w:lineRule="auto"/>
-        <w:ind w:left="181" w:hanging="181"/>
+        <w:ind w:left="240" w:hanging="240"/>
       </w:pPr>
       <w:r>
         <w:rPr>
-          <w:rFonts w:ascii="Arial Black" w:hAnsi="Arial Black" w:cs="Arial Black" w:eastAsia="Microsoft YaHei"/>
+          <w:rFonts w:ascii="Calibri" w:hAnsi="Calibri" w:cs="Calibri" w:eastAsia="Microsoft YaHei"/>
           <w:b/>
           <w:sz w:val="11"/>
           <w:color w:val="E63846"/>
@@ -8582,7 +8582,7 @@
       </w:r>
       <w:r>
         <w:rPr>
-          <w:rFonts w:ascii="Arial" w:hAnsi="Arial" w:cs="Arial" w:eastAsia="Microsoft YaHei"/>
+          <w:rFonts w:ascii="Calibri" w:hAnsi="Calibri" w:cs="Calibri" w:eastAsia="Microsoft YaHei"/>
           <w:b w:val="0"/>
           <w:sz w:val="14"/>
           <w:color w:val="000000"/>
@@ -8594,11 +8594,11 @@
     <w:p>
       <w:pPr>
         <w:spacing w:before="0" w:after="32" w:line="278" w:lineRule="auto"/>
-        <w:ind w:left="181" w:hanging="181"/>
+        <w:ind w:left="240" w:hanging="240"/>
       </w:pPr>
       <w:r>
         <w:rPr>
-          <w:rFonts w:ascii="Arial Black" w:hAnsi="Arial Black" w:cs="Arial Black" w:eastAsia="Microsoft YaHei"/>
+          <w:rFonts w:ascii="Calibri" w:hAnsi="Calibri" w:cs="Calibri" w:eastAsia="Microsoft YaHei"/>
           <w:b/>
           <w:sz w:val="11"/>
           <w:color w:val="E63846"/>
@@ -8608,7 +8608,7 @@
       </w:r>
       <w:r>
         <w:rPr>
-          <w:rFonts w:ascii="Arial" w:hAnsi="Arial" w:cs="Arial" w:eastAsia="Microsoft YaHei"/>
+          <w:rFonts w:ascii="Calibri" w:hAnsi="Calibri" w:cs="Calibri" w:eastAsia="Microsoft YaHei"/>
           <w:b w:val="0"/>
           <w:sz w:val="14"/>
           <w:color w:val="000000"/>
@@ -8628,7 +8628,7 @@
       </w:pPr>
       <w:r>
         <w:rPr>
-          <w:rFonts w:ascii="Arial Black" w:hAnsi="Arial Black" w:cs="Arial Black" w:eastAsia="Microsoft YaHei"/>
+          <w:rFonts w:ascii="Calibri" w:hAnsi="Calibri" w:cs="Calibri" w:eastAsia="Microsoft YaHei"/>
           <w:b/>
           <w:sz w:val="15"/>
           <w:color w:val="000000"/>
@@ -8640,11 +8640,11 @@
     <w:p>
       <w:pPr>
         <w:spacing w:before="0" w:after="32" w:line="278" w:lineRule="auto"/>
-        <w:ind w:left="181" w:hanging="181"/>
+        <w:ind w:left="240" w:hanging="240"/>
       </w:pPr>
       <w:r>
         <w:rPr>
-          <w:rFonts w:ascii="Arial Black" w:hAnsi="Arial Black" w:cs="Arial Black" w:eastAsia="Microsoft YaHei"/>
+          <w:rFonts w:ascii="Calibri" w:hAnsi="Calibri" w:cs="Calibri" w:eastAsia="Microsoft YaHei"/>
           <w:b/>
           <w:sz w:val="11"/>
           <w:color w:val="E63846"/>
@@ -8654,7 +8654,7 @@
       </w:r>
       <w:r>
         <w:rPr>
-          <w:rFonts w:ascii="Arial" w:hAnsi="Arial" w:cs="Arial" w:eastAsia="Microsoft YaHei"/>
+          <w:rFonts w:ascii="Calibri" w:hAnsi="Calibri" w:cs="Calibri" w:eastAsia="Microsoft YaHei"/>
           <w:b w:val="0"/>
           <w:sz w:val="14"/>
           <w:color w:val="000000"/>
@@ -8666,11 +8666,11 @@
     <w:p>
       <w:pPr>
         <w:spacing w:before="0" w:after="32" w:line="278" w:lineRule="auto"/>
-        <w:ind w:left="181" w:hanging="181"/>
+        <w:ind w:left="240" w:hanging="240"/>
       </w:pPr>
       <w:r>
         <w:rPr>
-          <w:rFonts w:ascii="Arial Black" w:hAnsi="Arial Black" w:cs="Arial Black" w:eastAsia="Microsoft YaHei"/>
+          <w:rFonts w:ascii="Calibri" w:hAnsi="Calibri" w:cs="Calibri" w:eastAsia="Microsoft YaHei"/>
           <w:b/>
           <w:sz w:val="11"/>
           <w:color w:val="E63846"/>
@@ -8680,7 +8680,7 @@
       </w:r>
       <w:r>
         <w:rPr>
-          <w:rFonts w:ascii="Arial" w:hAnsi="Arial" w:cs="Arial" w:eastAsia="Microsoft YaHei"/>
+          <w:rFonts w:ascii="Calibri" w:hAnsi="Calibri" w:cs="Calibri" w:eastAsia="Microsoft YaHei"/>
           <w:b w:val="0"/>
           <w:sz w:val="14"/>
           <w:color w:val="000000"/>
@@ -8692,11 +8692,11 @@
     <w:p>
       <w:pPr>
         <w:spacing w:before="0" w:after="32" w:line="278" w:lineRule="auto"/>
-        <w:ind w:left="181" w:hanging="181"/>
+        <w:ind w:left="240" w:hanging="240"/>
       </w:pPr>
       <w:r>
         <w:rPr>
-          <w:rFonts w:ascii="Arial Black" w:hAnsi="Arial Black" w:cs="Arial Black" w:eastAsia="Microsoft YaHei"/>
+          <w:rFonts w:ascii="Calibri" w:hAnsi="Calibri" w:cs="Calibri" w:eastAsia="Microsoft YaHei"/>
           <w:b/>
           <w:sz w:val="11"/>
           <w:color w:val="E63846"/>
@@ -8706,7 +8706,7 @@
       </w:r>
       <w:r>
         <w:rPr>
-          <w:rFonts w:ascii="Arial" w:hAnsi="Arial" w:cs="Arial" w:eastAsia="Microsoft YaHei"/>
+          <w:rFonts w:ascii="Calibri" w:hAnsi="Calibri" w:cs="Calibri" w:eastAsia="Microsoft YaHei"/>
           <w:b w:val="0"/>
           <w:sz w:val="14"/>
           <w:color w:val="000000"/>
@@ -8722,11 +8722,11 @@
     <w:p>
       <w:pPr>
         <w:spacing w:before="0" w:after="32" w:line="278" w:lineRule="auto"/>
-        <w:ind w:left="181" w:hanging="181"/>
+        <w:ind w:left="240" w:hanging="240"/>
       </w:pPr>
       <w:r>
         <w:rPr>
-          <w:rFonts w:ascii="Arial Black" w:hAnsi="Arial Black" w:cs="Arial Black" w:eastAsia="Microsoft YaHei"/>
+          <w:rFonts w:ascii="Calibri" w:hAnsi="Calibri" w:cs="Calibri" w:eastAsia="Microsoft YaHei"/>
           <w:b/>
           <w:sz w:val="11"/>
           <w:color w:val="E63846"/>
@@ -8736,7 +8736,7 @@
       </w:r>
       <w:r>
         <w:rPr>
-          <w:rFonts w:ascii="Arial" w:hAnsi="Arial" w:cs="Arial" w:eastAsia="Microsoft YaHei"/>
+          <w:rFonts w:ascii="Calibri" w:hAnsi="Calibri" w:cs="Calibri" w:eastAsia="Microsoft YaHei"/>
           <w:b w:val="0"/>
           <w:sz w:val="14"/>
           <w:color w:val="000000"/>
@@ -8754,7 +8754,7 @@
       </w:pPr>
       <w:r>
         <w:rPr>
-          <w:rFonts w:ascii="Arial Black" w:hAnsi="Arial Black" w:cs="Arial Black" w:eastAsia="Microsoft YaHei"/>
+          <w:rFonts w:ascii="Calibri" w:hAnsi="Calibri" w:cs="Calibri" w:eastAsia="Microsoft YaHei"/>
           <w:b/>
           <w:sz w:val="15"/>
           <w:color w:val="000000"/>
@@ -8766,11 +8766,11 @@
     <w:p>
       <w:pPr>
         <w:spacing w:before="0" w:after="32" w:line="278" w:lineRule="auto"/>
-        <w:ind w:left="181" w:hanging="181"/>
+        <w:ind w:left="240" w:hanging="240"/>
       </w:pPr>
       <w:r>
         <w:rPr>
-          <w:rFonts w:ascii="Arial Black" w:hAnsi="Arial Black" w:cs="Arial Black" w:eastAsia="Microsoft YaHei"/>
+          <w:rFonts w:ascii="Calibri" w:hAnsi="Calibri" w:cs="Calibri" w:eastAsia="Microsoft YaHei"/>
           <w:b/>
           <w:sz w:val="11"/>
           <w:color w:val="E63846"/>
@@ -8780,7 +8780,7 @@
       </w:r>
       <w:r>
         <w:rPr>
-          <w:rFonts w:ascii="Arial" w:hAnsi="Arial" w:cs="Arial" w:eastAsia="Microsoft YaHei"/>
+          <w:rFonts w:ascii="Calibri" w:hAnsi="Calibri" w:cs="Calibri" w:eastAsia="Microsoft YaHei"/>
           <w:b w:val="0"/>
           <w:sz w:val="14"/>
           <w:color w:val="000000"/>
@@ -8792,11 +8792,11 @@
     <w:p>
       <w:pPr>
         <w:spacing w:before="0" w:after="32" w:line="278" w:lineRule="auto"/>
-        <w:ind w:left="181" w:hanging="181"/>
+        <w:ind w:left="240" w:hanging="240"/>
       </w:pPr>
       <w:r>
         <w:rPr>
-          <w:rFonts w:ascii="Arial Black" w:hAnsi="Arial Black" w:cs="Arial Black" w:eastAsia="Microsoft YaHei"/>
+          <w:rFonts w:ascii="Calibri" w:hAnsi="Calibri" w:cs="Calibri" w:eastAsia="Microsoft YaHei"/>
           <w:b/>
           <w:sz w:val="11"/>
           <w:color w:val="E63846"/>
@@ -8806,7 +8806,7 @@
       </w:r>
       <w:r>
         <w:rPr>
-          <w:rFonts w:ascii="Arial" w:hAnsi="Arial" w:cs="Arial" w:eastAsia="Microsoft YaHei"/>
+          <w:rFonts w:ascii="Calibri" w:hAnsi="Calibri" w:cs="Calibri" w:eastAsia="Microsoft YaHei"/>
           <w:b w:val="0"/>
           <w:sz w:val="14"/>
           <w:color w:val="000000"/>
@@ -8818,11 +8818,11 @@
     <w:p>
       <w:pPr>
         <w:spacing w:before="0" w:after="32" w:line="278" w:lineRule="auto"/>
-        <w:ind w:left="181" w:hanging="181"/>
+        <w:ind w:left="240" w:hanging="240"/>
       </w:pPr>
       <w:r>
         <w:rPr>
-          <w:rFonts w:ascii="Arial Black" w:hAnsi="Arial Black" w:cs="Arial Black" w:eastAsia="Microsoft YaHei"/>
+          <w:rFonts w:ascii="Calibri" w:hAnsi="Calibri" w:cs="Calibri" w:eastAsia="Microsoft YaHei"/>
           <w:b/>
           <w:sz w:val="11"/>
           <w:color w:val="E63846"/>
@@ -8832,7 +8832,7 @@
       </w:r>
       <w:r>
         <w:rPr>
-          <w:rFonts w:ascii="Arial" w:hAnsi="Arial" w:cs="Arial" w:eastAsia="Microsoft YaHei"/>
+          <w:rFonts w:ascii="Calibri" w:hAnsi="Calibri" w:cs="Calibri" w:eastAsia="Microsoft YaHei"/>
           <w:b w:val="0"/>
           <w:sz w:val="14"/>
           <w:color w:val="000000"/>
@@ -8846,11 +8846,11 @@
     <w:p>
       <w:pPr>
         <w:spacing w:before="0" w:after="32" w:line="278" w:lineRule="auto"/>
-        <w:ind w:left="181" w:hanging="181"/>
+        <w:ind w:left="240" w:hanging="240"/>
       </w:pPr>
       <w:r>
         <w:rPr>
-          <w:rFonts w:ascii="Arial Black" w:hAnsi="Arial Black" w:cs="Arial Black" w:eastAsia="Microsoft YaHei"/>
+          <w:rFonts w:ascii="Calibri" w:hAnsi="Calibri" w:cs="Calibri" w:eastAsia="Microsoft YaHei"/>
           <w:b/>
           <w:sz w:val="11"/>
           <w:color w:val="E63846"/>
@@ -8860,7 +8860,7 @@
       </w:r>
       <w:r>
         <w:rPr>
-          <w:rFonts w:ascii="Arial" w:hAnsi="Arial" w:cs="Arial" w:eastAsia="Microsoft YaHei"/>
+          <w:rFonts w:ascii="Calibri" w:hAnsi="Calibri" w:cs="Calibri" w:eastAsia="Microsoft YaHei"/>
           <w:b w:val="0"/>
           <w:sz w:val="14"/>
           <w:color w:val="000000"/>
@@ -8911,7 +8911,7 @@
             </w:pPr>
             <w:r>
               <w:rPr>
-                <w:rFonts w:ascii="Arial Black" w:hAnsi="Arial Black" w:cs="Arial Black" w:eastAsia="Microsoft YaHei"/>
+                <w:rFonts w:ascii="Calibri" w:hAnsi="Calibri" w:cs="Calibri" w:eastAsia="Microsoft YaHei"/>
                 <w:b/>
                 <w:sz w:val="13"/>
                 <w:color w:val="000000"/>
@@ -8926,7 +8926,7 @@
             </w:pPr>
             <w:r>
               <w:rPr>
-                <w:rFonts w:ascii="Arial" w:hAnsi="Arial" w:cs="Arial" w:eastAsia="Microsoft YaHei"/>
+                <w:rFonts w:ascii="Calibri" w:hAnsi="Calibri" w:cs="Calibri" w:eastAsia="Microsoft YaHei"/>
                 <w:b w:val="0"/>
                 <w:sz w:val="14"/>
                 <w:color w:val="000000"/>
@@ -8966,7 +8966,7 @@
       </w:pPr>
       <w:r>
         <w:rPr>
-          <w:rFonts w:ascii="Arial Black" w:hAnsi="Arial Black" w:cs="Arial Black" w:eastAsia="Microsoft YaHei"/>
+          <w:rFonts w:ascii="Calibri" w:hAnsi="Calibri" w:cs="Calibri" w:eastAsia="Microsoft YaHei"/>
           <w:b/>
           <w:sz w:val="13"/>
           <w:color w:val="000000"/>
@@ -8995,7 +8995,7 @@
       </w:pPr>
       <w:r>
         <w:rPr>
-          <w:rFonts w:ascii="Arial Black" w:hAnsi="Arial Black" w:cs="Arial Black" w:eastAsia="Microsoft YaHei"/>
+          <w:rFonts w:ascii="Calibri" w:hAnsi="Calibri" w:cs="Calibri" w:eastAsia="Microsoft YaHei"/>
           <w:b/>
           <w:sz w:val="27"/>
           <w:color w:val="E63846"/>
@@ -9005,7 +9005,7 @@
       </w:r>
       <w:r>
         <w:rPr>
-          <w:rFonts w:ascii="Arial Black" w:hAnsi="Arial Black" w:cs="Arial Black" w:eastAsia="Microsoft YaHei"/>
+          <w:rFonts w:ascii="Calibri" w:hAnsi="Calibri" w:cs="Calibri" w:eastAsia="Microsoft YaHei"/>
           <w:b/>
           <w:sz w:val="22"/>
           <w:color w:val="000000"/>
@@ -9020,7 +9020,7 @@
       </w:pPr>
       <w:r>
         <w:rPr>
-          <w:rFonts w:ascii="Arial" w:hAnsi="Arial" w:cs="Arial" w:eastAsia="Microsoft YaHei"/>
+          <w:rFonts w:ascii="Calibri" w:hAnsi="Calibri" w:cs="Calibri" w:eastAsia="Microsoft YaHei"/>
           <w:b w:val="0"/>
           <w:sz w:val="14"/>
           <w:color w:val="1A1A1A"/>
@@ -9042,7 +9042,7 @@
       </w:pPr>
       <w:r>
         <w:rPr>
-          <w:rFonts w:ascii="Arial Black" w:hAnsi="Arial Black" w:cs="Arial Black" w:eastAsia="Microsoft YaHei"/>
+          <w:rFonts w:ascii="Calibri" w:hAnsi="Calibri" w:cs="Calibri" w:eastAsia="Microsoft YaHei"/>
           <w:b/>
           <w:sz w:val="15"/>
           <w:color w:val="000000"/>
@@ -9099,7 +9099,7 @@
             </w:pPr>
             <w:r>
               <w:rPr>
-                <w:rFonts w:ascii="Arial Black" w:hAnsi="Arial Black" w:cs="Arial Black" w:eastAsia="Microsoft YaHei"/>
+                <w:rFonts w:ascii="Calibri" w:hAnsi="Calibri" w:cs="Calibri" w:eastAsia="Microsoft YaHei"/>
                 <w:b/>
                 <w:sz w:val="12"/>
                 <w:color w:val="FFFFFF"/>
@@ -9134,7 +9134,7 @@
             </w:pPr>
             <w:r>
               <w:rPr>
-                <w:rFonts w:ascii="Arial Black" w:hAnsi="Arial Black" w:cs="Arial Black" w:eastAsia="Microsoft YaHei"/>
+                <w:rFonts w:ascii="Calibri" w:hAnsi="Calibri" w:cs="Calibri" w:eastAsia="Microsoft YaHei"/>
                 <w:b/>
                 <w:sz w:val="12"/>
                 <w:color w:val="FFFFFF"/>
@@ -9174,7 +9174,7 @@
             </w:pPr>
             <w:r>
               <w:rPr>
-                <w:rFonts w:ascii="Arial" w:hAnsi="Arial" w:cs="Arial" w:eastAsia="Microsoft YaHei"/>
+                <w:rFonts w:ascii="Calibri" w:hAnsi="Calibri" w:cs="Calibri" w:eastAsia="Microsoft YaHei"/>
                 <w:b w:val="0"/>
                 <w:sz w:val="13"/>
                 <w:color w:val="1A1A1A"/>
@@ -9209,7 +9209,7 @@
             </w:pPr>
             <w:r>
               <w:rPr>
-                <w:rFonts w:ascii="Arial" w:hAnsi="Arial" w:cs="Arial" w:eastAsia="Microsoft YaHei"/>
+                <w:rFonts w:ascii="Calibri" w:hAnsi="Calibri" w:cs="Calibri" w:eastAsia="Microsoft YaHei"/>
                 <w:b w:val="0"/>
                 <w:sz w:val="13"/>
                 <w:color w:val="1A1A1A"/>
@@ -9249,7 +9249,7 @@
             </w:pPr>
             <w:r>
               <w:rPr>
-                <w:rFonts w:ascii="Arial" w:hAnsi="Arial" w:cs="Arial" w:eastAsia="Microsoft YaHei"/>
+                <w:rFonts w:ascii="Calibri" w:hAnsi="Calibri" w:cs="Calibri" w:eastAsia="Microsoft YaHei"/>
                 <w:b w:val="0"/>
                 <w:sz w:val="13"/>
                 <w:color w:val="1A1A1A"/>
@@ -9284,7 +9284,7 @@
             </w:pPr>
             <w:r>
               <w:rPr>
-                <w:rFonts w:ascii="Arial" w:hAnsi="Arial" w:cs="Arial" w:eastAsia="Microsoft YaHei"/>
+                <w:rFonts w:ascii="Calibri" w:hAnsi="Calibri" w:cs="Calibri" w:eastAsia="Microsoft YaHei"/>
                 <w:b w:val="0"/>
                 <w:sz w:val="13"/>
                 <w:color w:val="1A1A1A"/>
@@ -9328,7 +9328,7 @@
             </w:pPr>
             <w:r>
               <w:rPr>
-                <w:rFonts w:ascii="Arial" w:hAnsi="Arial" w:cs="Arial" w:eastAsia="Microsoft YaHei"/>
+                <w:rFonts w:ascii="Calibri" w:hAnsi="Calibri" w:cs="Calibri" w:eastAsia="Microsoft YaHei"/>
                 <w:b w:val="0"/>
                 <w:sz w:val="13"/>
                 <w:color w:val="1A1A1A"/>
@@ -9363,7 +9363,7 @@
             </w:pPr>
             <w:r>
               <w:rPr>
-                <w:rFonts w:ascii="Arial" w:hAnsi="Arial" w:cs="Arial" w:eastAsia="Microsoft YaHei"/>
+                <w:rFonts w:ascii="Calibri" w:hAnsi="Calibri" w:cs="Calibri" w:eastAsia="Microsoft YaHei"/>
                 <w:b w:val="0"/>
                 <w:sz w:val="13"/>
                 <w:color w:val="1A1A1A"/>
@@ -9403,7 +9403,7 @@
             </w:pPr>
             <w:r>
               <w:rPr>
-                <w:rFonts w:ascii="Arial" w:hAnsi="Arial" w:cs="Arial" w:eastAsia="Microsoft YaHei"/>
+                <w:rFonts w:ascii="Calibri" w:hAnsi="Calibri" w:cs="Calibri" w:eastAsia="Microsoft YaHei"/>
                 <w:b w:val="0"/>
                 <w:sz w:val="13"/>
                 <w:color w:val="1A1A1A"/>
@@ -9438,7 +9438,7 @@
             </w:pPr>
             <w:r>
               <w:rPr>
-                <w:rFonts w:ascii="Arial" w:hAnsi="Arial" w:cs="Arial" w:eastAsia="Microsoft YaHei"/>
+                <w:rFonts w:ascii="Calibri" w:hAnsi="Calibri" w:cs="Calibri" w:eastAsia="Microsoft YaHei"/>
                 <w:b w:val="0"/>
                 <w:sz w:val="13"/>
                 <w:color w:val="1A1A1A"/>
@@ -9459,7 +9459,7 @@
       </w:pPr>
       <w:r>
         <w:rPr>
-          <w:rFonts w:ascii="Arial Black" w:hAnsi="Arial Black" w:cs="Arial Black" w:eastAsia="Microsoft YaHei"/>
+          <w:rFonts w:ascii="Calibri" w:hAnsi="Calibri" w:cs="Calibri" w:eastAsia="Microsoft YaHei"/>
           <w:b/>
           <w:sz w:val="15"/>
           <w:color w:val="000000"/>
@@ -9516,7 +9516,7 @@
             </w:pPr>
             <w:r>
               <w:rPr>
-                <w:rFonts w:ascii="Arial Black" w:hAnsi="Arial Black" w:cs="Arial Black" w:eastAsia="Microsoft YaHei"/>
+                <w:rFonts w:ascii="Calibri" w:hAnsi="Calibri" w:cs="Calibri" w:eastAsia="Microsoft YaHei"/>
                 <w:b/>
                 <w:sz w:val="12"/>
                 <w:color w:val="FFFFFF"/>
@@ -9551,7 +9551,7 @@
             </w:pPr>
             <w:r>
               <w:rPr>
-                <w:rFonts w:ascii="Arial Black" w:hAnsi="Arial Black" w:cs="Arial Black" w:eastAsia="Microsoft YaHei"/>
+                <w:rFonts w:ascii="Calibri" w:hAnsi="Calibri" w:cs="Calibri" w:eastAsia="Microsoft YaHei"/>
                 <w:b/>
                 <w:sz w:val="12"/>
                 <w:color w:val="FFFFFF"/>
@@ -9591,7 +9591,7 @@
             </w:pPr>
             <w:r>
               <w:rPr>
-                <w:rFonts w:ascii="Arial" w:hAnsi="Arial" w:cs="Arial" w:eastAsia="Microsoft YaHei"/>
+                <w:rFonts w:ascii="Calibri" w:hAnsi="Calibri" w:cs="Calibri" w:eastAsia="Microsoft YaHei"/>
                 <w:b w:val="0"/>
                 <w:sz w:val="13"/>
                 <w:color w:val="1A1A1A"/>
@@ -9626,7 +9626,7 @@
             </w:pPr>
             <w:r>
               <w:rPr>
-                <w:rFonts w:ascii="Arial" w:hAnsi="Arial" w:cs="Arial" w:eastAsia="Microsoft YaHei"/>
+                <w:rFonts w:ascii="Calibri" w:hAnsi="Calibri" w:cs="Calibri" w:eastAsia="Microsoft YaHei"/>
                 <w:b w:val="0"/>
                 <w:sz w:val="13"/>
                 <w:color w:val="1A1A1A"/>
@@ -9668,7 +9668,7 @@
             </w:pPr>
             <w:r>
               <w:rPr>
-                <w:rFonts w:ascii="Arial" w:hAnsi="Arial" w:cs="Arial" w:eastAsia="Microsoft YaHei"/>
+                <w:rFonts w:ascii="Calibri" w:hAnsi="Calibri" w:cs="Calibri" w:eastAsia="Microsoft YaHei"/>
                 <w:b w:val="0"/>
                 <w:sz w:val="13"/>
                 <w:color w:val="1A1A1A"/>
@@ -9703,7 +9703,7 @@
             </w:pPr>
             <w:r>
               <w:rPr>
-                <w:rFonts w:ascii="Arial" w:hAnsi="Arial" w:cs="Arial" w:eastAsia="Microsoft YaHei"/>
+                <w:rFonts w:ascii="Calibri" w:hAnsi="Calibri" w:cs="Calibri" w:eastAsia="Microsoft YaHei"/>
                 <w:b w:val="0"/>
                 <w:sz w:val="13"/>
                 <w:color w:val="1A1A1A"/>
@@ -9745,7 +9745,7 @@
             </w:pPr>
             <w:r>
               <w:rPr>
-                <w:rFonts w:ascii="Arial" w:hAnsi="Arial" w:cs="Arial" w:eastAsia="Microsoft YaHei"/>
+                <w:rFonts w:ascii="Calibri" w:hAnsi="Calibri" w:cs="Calibri" w:eastAsia="Microsoft YaHei"/>
                 <w:b w:val="0"/>
                 <w:sz w:val="13"/>
                 <w:color w:val="1A1A1A"/>
@@ -9780,7 +9780,7 @@
             </w:pPr>
             <w:r>
               <w:rPr>
-                <w:rFonts w:ascii="Arial" w:hAnsi="Arial" w:cs="Arial" w:eastAsia="Microsoft YaHei"/>
+                <w:rFonts w:ascii="Calibri" w:hAnsi="Calibri" w:cs="Calibri" w:eastAsia="Microsoft YaHei"/>
                 <w:b w:val="0"/>
                 <w:sz w:val="13"/>
                 <w:color w:val="1A1A1A"/>
@@ -9801,7 +9801,7 @@
       </w:pPr>
       <w:r>
         <w:rPr>
-          <w:rFonts w:ascii="Arial Black" w:hAnsi="Arial Black" w:cs="Arial Black" w:eastAsia="Microsoft YaHei"/>
+          <w:rFonts w:ascii="Calibri" w:hAnsi="Calibri" w:cs="Calibri" w:eastAsia="Microsoft YaHei"/>
           <w:b/>
           <w:sz w:val="15"/>
           <w:color w:val="000000"/>
@@ -9816,7 +9816,7 @@
       </w:pPr>
       <w:r>
         <w:rPr>
-          <w:rFonts w:ascii="Arial" w:hAnsi="Arial" w:cs="Arial" w:eastAsia="Microsoft YaHei"/>
+          <w:rFonts w:ascii="Calibri" w:hAnsi="Calibri" w:cs="Calibri" w:eastAsia="Microsoft YaHei"/>
           <w:b w:val="0"/>
           <w:sz w:val="14"/>
           <w:color w:val="1A1A1A"/>
@@ -9826,7 +9826,7 @@
       </w:r>
       <w:r>
         <w:rPr>
-          <w:rFonts w:ascii="Arial" w:hAnsi="Arial" w:cs="Arial" w:eastAsia="Microsoft YaHei"/>
+          <w:rFonts w:ascii="Calibri" w:hAnsi="Calibri" w:cs="Calibri" w:eastAsia="Microsoft YaHei"/>
           <w:b/>
           <w:sz w:val="14"/>
           <w:color w:val="1A1A1A"/>
@@ -9837,7 +9837,7 @@
       </w:r>
       <w:r>
         <w:rPr>
-          <w:rFonts w:ascii="Arial" w:hAnsi="Arial" w:cs="Arial" w:eastAsia="Microsoft YaHei"/>
+          <w:rFonts w:ascii="Calibri" w:hAnsi="Calibri" w:cs="Calibri" w:eastAsia="Microsoft YaHei"/>
           <w:b w:val="0"/>
           <w:sz w:val="14"/>
           <w:color w:val="1A1A1A"/>
@@ -9851,11 +9851,11 @@
     <w:p>
       <w:pPr>
         <w:spacing w:before="0" w:after="5" w:line="250" w:lineRule="auto"/>
-        <w:ind w:left="181" w:hanging="181"/>
+        <w:ind w:left="240" w:hanging="240"/>
       </w:pPr>
       <w:r>
         <w:rPr>
-          <w:rFonts w:ascii="Arial Black" w:hAnsi="Arial Black" w:cs="Arial Black" w:eastAsia="Microsoft YaHei"/>
+          <w:rFonts w:ascii="Calibri" w:hAnsi="Calibri" w:cs="Calibri" w:eastAsia="Microsoft YaHei"/>
           <w:b/>
           <w:sz w:val="11"/>
           <w:color w:val="E63846"/>
@@ -9865,7 +9865,7 @@
       </w:r>
       <w:r>
         <w:rPr>
-          <w:rFonts w:ascii="Arial" w:hAnsi="Arial" w:cs="Arial" w:eastAsia="Microsoft YaHei"/>
+          <w:rFonts w:ascii="Calibri" w:hAnsi="Calibri" w:cs="Calibri" w:eastAsia="Microsoft YaHei"/>
           <w:b w:val="0"/>
           <w:sz w:val="14"/>
           <w:color w:val="000000"/>
@@ -9879,11 +9879,11 @@
     <w:p>
       <w:pPr>
         <w:spacing w:before="0" w:after="5" w:line="250" w:lineRule="auto"/>
-        <w:ind w:left="181" w:hanging="181"/>
+        <w:ind w:left="240" w:hanging="240"/>
       </w:pPr>
       <w:r>
         <w:rPr>
-          <w:rFonts w:ascii="Arial Black" w:hAnsi="Arial Black" w:cs="Arial Black" w:eastAsia="Microsoft YaHei"/>
+          <w:rFonts w:ascii="Calibri" w:hAnsi="Calibri" w:cs="Calibri" w:eastAsia="Microsoft YaHei"/>
           <w:b/>
           <w:sz w:val="11"/>
           <w:color w:val="E63846"/>
@@ -9893,7 +9893,7 @@
       </w:r>
       <w:r>
         <w:rPr>
-          <w:rFonts w:ascii="Arial" w:hAnsi="Arial" w:cs="Arial" w:eastAsia="Microsoft YaHei"/>
+          <w:rFonts w:ascii="Calibri" w:hAnsi="Calibri" w:cs="Calibri" w:eastAsia="Microsoft YaHei"/>
           <w:b w:val="0"/>
           <w:sz w:val="14"/>
           <w:color w:val="000000"/>
@@ -9905,11 +9905,11 @@
     <w:p>
       <w:pPr>
         <w:spacing w:before="0" w:after="5" w:line="250" w:lineRule="auto"/>
-        <w:ind w:left="181" w:hanging="181"/>
+        <w:ind w:left="240" w:hanging="240"/>
       </w:pPr>
       <w:r>
         <w:rPr>
-          <w:rFonts w:ascii="Arial Black" w:hAnsi="Arial Black" w:cs="Arial Black" w:eastAsia="Microsoft YaHei"/>
+          <w:rFonts w:ascii="Calibri" w:hAnsi="Calibri" w:cs="Calibri" w:eastAsia="Microsoft YaHei"/>
           <w:b/>
           <w:sz w:val="11"/>
           <w:color w:val="E63846"/>
@@ -9919,7 +9919,7 @@
       </w:r>
       <w:r>
         <w:rPr>
-          <w:rFonts w:ascii="Arial" w:hAnsi="Arial" w:cs="Arial" w:eastAsia="Microsoft YaHei"/>
+          <w:rFonts w:ascii="Calibri" w:hAnsi="Calibri" w:cs="Calibri" w:eastAsia="Microsoft YaHei"/>
           <w:b w:val="0"/>
           <w:sz w:val="14"/>
           <w:color w:val="000000"/>
@@ -9934,7 +9934,7 @@
       </w:pPr>
       <w:r>
         <w:rPr>
-          <w:rFonts w:ascii="Arial" w:hAnsi="Arial" w:cs="Arial" w:eastAsia="Microsoft YaHei"/>
+          <w:rFonts w:ascii="Calibri" w:hAnsi="Calibri" w:cs="Calibri" w:eastAsia="Microsoft YaHei"/>
           <w:b w:val="0"/>
           <w:sz w:val="14"/>
           <w:color w:val="1A1A1A"/>
@@ -9967,7 +9967,7 @@
       </w:pPr>
       <w:r>
         <w:rPr>
-          <w:rFonts w:ascii="Arial Black" w:hAnsi="Arial Black" w:cs="Arial Black" w:eastAsia="Microsoft YaHei"/>
+          <w:rFonts w:ascii="Calibri" w:hAnsi="Calibri" w:cs="Calibri" w:eastAsia="Microsoft YaHei"/>
           <w:b/>
           <w:sz w:val="13"/>
           <w:color w:val="000000"/>
@@ -9996,7 +9996,7 @@
       </w:pPr>
       <w:r>
         <w:rPr>
-          <w:rFonts w:ascii="Arial Black" w:hAnsi="Arial Black" w:cs="Arial Black" w:eastAsia="Microsoft YaHei"/>
+          <w:rFonts w:ascii="Calibri" w:hAnsi="Calibri" w:cs="Calibri" w:eastAsia="Microsoft YaHei"/>
           <w:b/>
           <w:sz w:val="27"/>
           <w:color w:val="E63846"/>
@@ -10006,7 +10006,7 @@
       </w:r>
       <w:r>
         <w:rPr>
-          <w:rFonts w:ascii="Arial Black" w:hAnsi="Arial Black" w:cs="Arial Black" w:eastAsia="Microsoft YaHei"/>
+          <w:rFonts w:ascii="Calibri" w:hAnsi="Calibri" w:cs="Calibri" w:eastAsia="Microsoft YaHei"/>
           <w:b/>
           <w:sz w:val="22"/>
           <w:color w:val="000000"/>
@@ -10024,7 +10024,7 @@
       </w:pPr>
       <w:r>
         <w:rPr>
-          <w:rFonts w:ascii="Arial Black" w:hAnsi="Arial Black" w:cs="Arial Black" w:eastAsia="Microsoft YaHei"/>
+          <w:rFonts w:ascii="Calibri" w:hAnsi="Calibri" w:cs="Calibri" w:eastAsia="Microsoft YaHei"/>
           <w:b/>
           <w:sz w:val="15"/>
           <w:color w:val="000000"/>
@@ -10081,7 +10081,7 @@
             </w:pPr>
             <w:r>
               <w:rPr>
-                <w:rFonts w:ascii="Arial" w:hAnsi="Arial" w:cs="Arial" w:eastAsia="Microsoft YaHei"/>
+                <w:rFonts w:ascii="Calibri" w:hAnsi="Calibri" w:cs="Calibri" w:eastAsia="Microsoft YaHei"/>
                 <w:b w:val="0"/>
                 <w:sz w:val="12"/>
                 <w:color w:val="1A1A1A"/>
@@ -10116,7 +10116,7 @@
             </w:pPr>
             <w:r>
               <w:rPr>
-                <w:rFonts w:ascii="Arial" w:hAnsi="Arial" w:cs="Arial" w:eastAsia="Microsoft YaHei"/>
+                <w:rFonts w:ascii="Calibri" w:hAnsi="Calibri" w:cs="Calibri" w:eastAsia="Microsoft YaHei"/>
                 <w:b w:val="0"/>
                 <w:sz w:val="12"/>
                 <w:color w:val="1A1A1A"/>
@@ -10155,7 +10155,7 @@
             </w:pPr>
             <w:r>
               <w:rPr>
-                <w:rFonts w:ascii="Arial" w:hAnsi="Arial" w:cs="Arial" w:eastAsia="Microsoft YaHei"/>
+                <w:rFonts w:ascii="Calibri" w:hAnsi="Calibri" w:cs="Calibri" w:eastAsia="Microsoft YaHei"/>
                 <w:b w:val="0"/>
                 <w:sz w:val="13"/>
                 <w:color w:val="1A1A1A"/>
@@ -10190,7 +10190,7 @@
             </w:pPr>
             <w:r>
               <w:rPr>
-                <w:rFonts w:ascii="Arial" w:hAnsi="Arial" w:cs="Arial" w:eastAsia="Microsoft YaHei"/>
+                <w:rFonts w:ascii="Calibri" w:hAnsi="Calibri" w:cs="Calibri" w:eastAsia="Microsoft YaHei"/>
                 <w:b w:val="0"/>
                 <w:sz w:val="13"/>
                 <w:color w:val="1A1A1A"/>
@@ -10229,7 +10229,7 @@
             </w:pPr>
             <w:r>
               <w:rPr>
-                <w:rFonts w:ascii="Arial" w:hAnsi="Arial" w:cs="Arial" w:eastAsia="Microsoft YaHei"/>
+                <w:rFonts w:ascii="Calibri" w:hAnsi="Calibri" w:cs="Calibri" w:eastAsia="Microsoft YaHei"/>
                 <w:b w:val="0"/>
                 <w:sz w:val="13"/>
                 <w:color w:val="1A1A1A"/>
@@ -10268,7 +10268,7 @@
             </w:pPr>
             <w:r>
               <w:rPr>
-                <w:rFonts w:ascii="Arial" w:hAnsi="Arial" w:cs="Arial" w:eastAsia="Microsoft YaHei"/>
+                <w:rFonts w:ascii="Calibri" w:hAnsi="Calibri" w:cs="Calibri" w:eastAsia="Microsoft YaHei"/>
                 <w:b w:val="0"/>
                 <w:sz w:val="13"/>
                 <w:color w:val="1A1A1A"/>
@@ -10307,7 +10307,7 @@
             </w:pPr>
             <w:r>
               <w:rPr>
-                <w:rFonts w:ascii="Arial" w:hAnsi="Arial" w:cs="Arial" w:eastAsia="Microsoft YaHei"/>
+                <w:rFonts w:ascii="Calibri" w:hAnsi="Calibri" w:cs="Calibri" w:eastAsia="Microsoft YaHei"/>
                 <w:b w:val="0"/>
                 <w:sz w:val="13"/>
                 <w:color w:val="1A1A1A"/>
@@ -10342,7 +10342,7 @@
             </w:pPr>
             <w:r>
               <w:rPr>
-                <w:rFonts w:ascii="Arial" w:hAnsi="Arial" w:cs="Arial" w:eastAsia="Microsoft YaHei"/>
+                <w:rFonts w:ascii="Calibri" w:hAnsi="Calibri" w:cs="Calibri" w:eastAsia="Microsoft YaHei"/>
                 <w:b w:val="0"/>
                 <w:sz w:val="13"/>
                 <w:color w:val="1A1A1A"/>
@@ -10381,7 +10381,7 @@
             </w:pPr>
             <w:r>
               <w:rPr>
-                <w:rFonts w:ascii="Arial" w:hAnsi="Arial" w:cs="Arial" w:eastAsia="Microsoft YaHei"/>
+                <w:rFonts w:ascii="Calibri" w:hAnsi="Calibri" w:cs="Calibri" w:eastAsia="Microsoft YaHei"/>
                 <w:b w:val="0"/>
                 <w:sz w:val="13"/>
                 <w:color w:val="1A1A1A"/>
@@ -10416,7 +10416,7 @@
             </w:pPr>
             <w:r>
               <w:rPr>
-                <w:rFonts w:ascii="Arial" w:hAnsi="Arial" w:cs="Arial" w:eastAsia="Microsoft YaHei"/>
+                <w:rFonts w:ascii="Calibri" w:hAnsi="Calibri" w:cs="Calibri" w:eastAsia="Microsoft YaHei"/>
                 <w:b w:val="0"/>
                 <w:sz w:val="13"/>
                 <w:color w:val="1A1A1A"/>
@@ -10455,7 +10455,7 @@
             </w:pPr>
             <w:r>
               <w:rPr>
-                <w:rFonts w:ascii="Arial" w:hAnsi="Arial" w:cs="Arial" w:eastAsia="Microsoft YaHei"/>
+                <w:rFonts w:ascii="Calibri" w:hAnsi="Calibri" w:cs="Calibri" w:eastAsia="Microsoft YaHei"/>
                 <w:b w:val="0"/>
                 <w:sz w:val="13"/>
                 <w:color w:val="1A1A1A"/>
@@ -10490,7 +10490,7 @@
             </w:pPr>
             <w:r>
               <w:rPr>
-                <w:rFonts w:ascii="Arial" w:hAnsi="Arial" w:cs="Arial" w:eastAsia="Microsoft YaHei"/>
+                <w:rFonts w:ascii="Calibri" w:hAnsi="Calibri" w:cs="Calibri" w:eastAsia="Microsoft YaHei"/>
                 <w:b w:val="0"/>
                 <w:sz w:val="13"/>
                 <w:color w:val="1A1A1A"/>
@@ -10529,7 +10529,7 @@
             </w:pPr>
             <w:r>
               <w:rPr>
-                <w:rFonts w:ascii="Arial" w:hAnsi="Arial" w:cs="Arial" w:eastAsia="Microsoft YaHei"/>
+                <w:rFonts w:ascii="Calibri" w:hAnsi="Calibri" w:cs="Calibri" w:eastAsia="Microsoft YaHei"/>
                 <w:b w:val="0"/>
                 <w:sz w:val="13"/>
                 <w:color w:val="1A1A1A"/>
@@ -10564,7 +10564,7 @@
             </w:pPr>
             <w:r>
               <w:rPr>
-                <w:rFonts w:ascii="Arial" w:hAnsi="Arial" w:cs="Arial" w:eastAsia="Microsoft YaHei"/>
+                <w:rFonts w:ascii="Calibri" w:hAnsi="Calibri" w:cs="Calibri" w:eastAsia="Microsoft YaHei"/>
                 <w:b w:val="0"/>
                 <w:sz w:val="13"/>
                 <w:color w:val="1A1A1A"/>
@@ -10603,7 +10603,7 @@
             </w:pPr>
             <w:r>
               <w:rPr>
-                <w:rFonts w:ascii="Arial" w:hAnsi="Arial" w:cs="Arial" w:eastAsia="Microsoft YaHei"/>
+                <w:rFonts w:ascii="Calibri" w:hAnsi="Calibri" w:cs="Calibri" w:eastAsia="Microsoft YaHei"/>
                 <w:b w:val="0"/>
                 <w:sz w:val="13"/>
                 <w:color w:val="1A1A1A"/>
@@ -10638,7 +10638,7 @@
             </w:pPr>
             <w:r>
               <w:rPr>
-                <w:rFonts w:ascii="Arial" w:hAnsi="Arial" w:cs="Arial" w:eastAsia="Microsoft YaHei"/>
+                <w:rFonts w:ascii="Calibri" w:hAnsi="Calibri" w:cs="Calibri" w:eastAsia="Microsoft YaHei"/>
                 <w:b w:val="0"/>
                 <w:sz w:val="13"/>
                 <w:color w:val="1A1A1A"/>
@@ -10677,7 +10677,7 @@
             </w:pPr>
             <w:r>
               <w:rPr>
-                <w:rFonts w:ascii="Arial" w:hAnsi="Arial" w:cs="Arial" w:eastAsia="Microsoft YaHei"/>
+                <w:rFonts w:ascii="Calibri" w:hAnsi="Calibri" w:cs="Calibri" w:eastAsia="Microsoft YaHei"/>
                 <w:b w:val="0"/>
                 <w:sz w:val="13"/>
                 <w:color w:val="1A1A1A"/>
@@ -10712,7 +10712,7 @@
             </w:pPr>
             <w:r>
               <w:rPr>
-                <w:rFonts w:ascii="Arial" w:hAnsi="Arial" w:cs="Arial" w:eastAsia="Microsoft YaHei"/>
+                <w:rFonts w:ascii="Calibri" w:hAnsi="Calibri" w:cs="Calibri" w:eastAsia="Microsoft YaHei"/>
                 <w:b w:val="0"/>
                 <w:sz w:val="13"/>
                 <w:color w:val="1A1A1A"/>
@@ -10795,7 +10795,7 @@
           </w:pPr>
           <w:r>
             <w:rPr>
-              <w:rFonts w:ascii="Arial" w:hAnsi="Arial" w:cs="Arial" w:eastAsia="Microsoft YaHei"/>
+              <w:rFonts w:ascii="Calibri" w:hAnsi="Calibri" w:cs="Calibri" w:eastAsia="Microsoft YaHei"/>
               <w:b w:val="0"/>
               <w:sz w:val="10"/>
               <w:color w:val="E8E8E8"/>
@@ -10893,7 +10893,7 @@
           </w:pPr>
           <w:r>
             <w:rPr>
-              <w:rFonts w:ascii="Arial" w:hAnsi="Arial" w:cs="Arial" w:eastAsia="Microsoft YaHei"/>
+              <w:rFonts w:ascii="Calibri" w:hAnsi="Calibri" w:cs="Calibri" w:eastAsia="Microsoft YaHei"/>
               <w:b w:val="0"/>
               <w:sz w:val="10"/>
               <w:color w:val="E8E8E8"/>
@@ -10991,7 +10991,7 @@
           </w:pPr>
           <w:r>
             <w:rPr>
-              <w:rFonts w:ascii="Arial" w:hAnsi="Arial" w:cs="Arial" w:eastAsia="Microsoft YaHei"/>
+              <w:rFonts w:ascii="Calibri" w:hAnsi="Calibri" w:cs="Calibri" w:eastAsia="Microsoft YaHei"/>
               <w:b w:val="0"/>
               <w:sz w:val="10"/>
               <w:color w:val="E8E8E8"/>
@@ -11089,7 +11089,7 @@
           </w:pPr>
           <w:r>
             <w:rPr>
-              <w:rFonts w:ascii="Arial" w:hAnsi="Arial" w:cs="Arial" w:eastAsia="Microsoft YaHei"/>
+              <w:rFonts w:ascii="Calibri" w:hAnsi="Calibri" w:cs="Calibri" w:eastAsia="Microsoft YaHei"/>
               <w:b w:val="0"/>
               <w:sz w:val="10"/>
               <w:color w:val="E8E8E8"/>
@@ -11187,7 +11187,7 @@
           </w:pPr>
           <w:r>
             <w:rPr>
-              <w:rFonts w:ascii="Arial" w:hAnsi="Arial" w:cs="Arial" w:eastAsia="Microsoft YaHei"/>
+              <w:rFonts w:ascii="Calibri" w:hAnsi="Calibri" w:cs="Calibri" w:eastAsia="Microsoft YaHei"/>
               <w:b w:val="0"/>
               <w:sz w:val="10"/>
               <w:color w:val="E8E8E8"/>
@@ -11285,7 +11285,7 @@
           </w:pPr>
           <w:r>
             <w:rPr>
-              <w:rFonts w:ascii="Arial" w:hAnsi="Arial" w:cs="Arial" w:eastAsia="Microsoft YaHei"/>
+              <w:rFonts w:ascii="Calibri" w:hAnsi="Calibri" w:cs="Calibri" w:eastAsia="Microsoft YaHei"/>
               <w:b w:val="0"/>
               <w:sz w:val="10"/>
               <w:color w:val="E8E8E8"/>
@@ -11383,7 +11383,7 @@
           </w:pPr>
           <w:r>
             <w:rPr>
-              <w:rFonts w:ascii="Arial" w:hAnsi="Arial" w:cs="Arial" w:eastAsia="Microsoft YaHei"/>
+              <w:rFonts w:ascii="Calibri" w:hAnsi="Calibri" w:cs="Calibri" w:eastAsia="Microsoft YaHei"/>
               <w:b w:val="0"/>
               <w:sz w:val="10"/>
               <w:color w:val="E8E8E8"/>
@@ -11481,7 +11481,7 @@
           </w:pPr>
           <w:r>
             <w:rPr>
-              <w:rFonts w:ascii="Arial" w:hAnsi="Arial" w:cs="Arial" w:eastAsia="Microsoft YaHei"/>
+              <w:rFonts w:ascii="Calibri" w:hAnsi="Calibri" w:cs="Calibri" w:eastAsia="Microsoft YaHei"/>
               <w:b w:val="0"/>
               <w:sz w:val="10"/>
               <w:color w:val="E8E8E8"/>
@@ -11579,7 +11579,7 @@
           </w:pPr>
           <w:r>
             <w:rPr>
-              <w:rFonts w:ascii="Arial" w:hAnsi="Arial" w:cs="Arial" w:eastAsia="Microsoft YaHei"/>
+              <w:rFonts w:ascii="Calibri" w:hAnsi="Calibri" w:cs="Calibri" w:eastAsia="Microsoft YaHei"/>
               <w:b w:val="0"/>
               <w:sz w:val="10"/>
               <w:color w:val="E8E8E8"/>
@@ -11677,7 +11677,7 @@
           </w:pPr>
           <w:r>
             <w:rPr>
-              <w:rFonts w:ascii="Arial" w:hAnsi="Arial" w:cs="Arial" w:eastAsia="Microsoft YaHei"/>
+              <w:rFonts w:ascii="Calibri" w:hAnsi="Calibri" w:cs="Calibri" w:eastAsia="Microsoft YaHei"/>
               <w:b w:val="0"/>
               <w:sz w:val="10"/>
               <w:color w:val="E8E8E8"/>
@@ -11775,7 +11775,7 @@
           </w:pPr>
           <w:r>
             <w:rPr>
-              <w:rFonts w:ascii="Arial" w:hAnsi="Arial" w:cs="Arial" w:eastAsia="Microsoft YaHei"/>
+              <w:rFonts w:ascii="Calibri" w:hAnsi="Calibri" w:cs="Calibri" w:eastAsia="Microsoft YaHei"/>
               <w:b w:val="0"/>
               <w:sz w:val="10"/>
               <w:color w:val="E8E8E8"/>
@@ -11873,7 +11873,7 @@
           </w:pPr>
           <w:r>
             <w:rPr>
-              <w:rFonts w:ascii="Arial" w:hAnsi="Arial" w:cs="Arial" w:eastAsia="Microsoft YaHei"/>
+              <w:rFonts w:ascii="Calibri" w:hAnsi="Calibri" w:cs="Calibri" w:eastAsia="Microsoft YaHei"/>
               <w:b w:val="0"/>
               <w:sz w:val="10"/>
               <w:color w:val="E8E8E8"/>
@@ -11971,7 +11971,7 @@
           </w:pPr>
           <w:r>
             <w:rPr>
-              <w:rFonts w:ascii="Arial" w:hAnsi="Arial" w:cs="Arial" w:eastAsia="Microsoft YaHei"/>
+              <w:rFonts w:ascii="Calibri" w:hAnsi="Calibri" w:cs="Calibri" w:eastAsia="Microsoft YaHei"/>
               <w:b w:val="0"/>
               <w:sz w:val="10"/>
               <w:color w:val="E8E8E8"/>
@@ -12069,7 +12069,7 @@
           </w:pPr>
           <w:r>
             <w:rPr>
-              <w:rFonts w:ascii="Arial" w:hAnsi="Arial" w:cs="Arial" w:eastAsia="Microsoft YaHei"/>
+              <w:rFonts w:ascii="Calibri" w:hAnsi="Calibri" w:cs="Calibri" w:eastAsia="Microsoft YaHei"/>
               <w:b w:val="0"/>
               <w:sz w:val="10"/>
               <w:color w:val="E8E8E8"/>
@@ -12132,7 +12132,7 @@
         <w:tabs>
           <w:tab w:val="num" w:pos="1800"/>
         </w:tabs>
-        <w:ind w:left="1800" w:hanging="360"/>
+        <w:ind w:left="1800" w:hanging="480"/>
       </w:pPr>
     </w:lvl>
   </w:abstractNum>
@@ -12149,7 +12149,7 @@
         <w:tabs>
           <w:tab w:val="num" w:pos="1440"/>
         </w:tabs>
-        <w:ind w:left="1440" w:hanging="360"/>
+        <w:ind w:left="1440" w:hanging="480"/>
       </w:pPr>
     </w:lvl>
   </w:abstractNum>
@@ -12167,7 +12167,7 @@
         <w:tabs>
           <w:tab w:val="num" w:pos="1080"/>
         </w:tabs>
-        <w:ind w:left="1080" w:hanging="360"/>
+        <w:ind w:left="1080" w:hanging="480"/>
       </w:pPr>
     </w:lvl>
   </w:abstractNum>
@@ -12185,7 +12185,7 @@
         <w:tabs>
           <w:tab w:val="num" w:pos="720"/>
         </w:tabs>
-        <w:ind w:left="720" w:hanging="360"/>
+        <w:ind w:left="720" w:hanging="480"/>
       </w:pPr>
     </w:lvl>
   </w:abstractNum>
@@ -12202,7 +12202,7 @@
         <w:tabs>
           <w:tab w:val="num" w:pos="1440"/>
         </w:tabs>
-        <w:ind w:left="1440" w:hanging="360"/>
+        <w:ind w:left="1440" w:hanging="480"/>
       </w:pPr>
       <w:rPr>
         <w:rFonts w:ascii="Symbol" w:hAnsi="Symbol" w:hint="default"/>
@@ -12223,7 +12223,7 @@
         <w:tabs>
           <w:tab w:val="num" w:pos="1080"/>
         </w:tabs>
-        <w:ind w:left="1080" w:hanging="360"/>
+        <w:ind w:left="1080" w:hanging="480"/>
       </w:pPr>
       <w:rPr>
         <w:rFonts w:ascii="Symbol" w:hAnsi="Symbol" w:hint="default"/>
@@ -12244,7 +12244,7 @@
         <w:tabs>
           <w:tab w:val="num" w:pos="720"/>
         </w:tabs>
-        <w:ind w:left="720" w:hanging="360"/>
+        <w:ind w:left="720" w:hanging="480"/>
       </w:pPr>
       <w:rPr>
         <w:rFonts w:ascii="Symbol" w:hAnsi="Symbol" w:hint="default"/>
@@ -12265,7 +12265,7 @@
         <w:tabs>
           <w:tab w:val="num" w:pos="360"/>
         </w:tabs>
-        <w:ind w:left="360" w:hanging="360"/>
+        <w:ind w:left="360" w:hanging="480"/>
       </w:pPr>
     </w:lvl>
   </w:abstractNum>
@@ -12283,7 +12283,7 @@
         <w:tabs>
           <w:tab w:val="num" w:pos="360"/>
         </w:tabs>
-        <w:ind w:left="360" w:hanging="360"/>
+        <w:ind w:left="360" w:hanging="480"/>
       </w:pPr>
       <w:rPr>
         <w:rFonts w:ascii="Symbol" w:hAnsi="Symbol" w:hint="default"/>
@@ -36053,8 +36053,8 @@
         <a:font script="Hang" typeface="맑은 고딕"/>
         <a:font script="Hans" typeface="宋体"/>
         <a:font script="Hant" typeface="新細明體"/>
-        <a:font script="Arab" typeface="Arial"/>
-        <a:font script="Hebr" typeface="Arial"/>
+        <a:font script="Arab" typeface="Calibri"/>
+        <a:font script="Hebr" typeface="Calibri"/>
         <a:font script="Thai" typeface="Cordia New"/>
         <a:font script="Ethi" typeface="Nyala"/>
         <a:font script="Beng" typeface="Vrinda"/>
@@ -36076,7 +36076,7 @@
         <a:font script="Laoo" typeface="DokChampa"/>
         <a:font script="Sinh" typeface="Iskoola Pota"/>
         <a:font script="Mong" typeface="Mongolian Baiti"/>
-        <a:font script="Viet" typeface="Arial"/>
+        <a:font script="Viet" typeface="Calibri"/>
         <a:font script="Uigh" typeface="Microsoft Uighur"/>
         <a:font script="Geor" typeface="Sylfaen"/>
       </a:minorFont>

</xml_diff>